<commit_message>
Docs: referências bibliográficas vs citações; export DOCX simplificado. Atualiza notebook e Word gerado.
</commit_message>
<xml_diff>
--- a/rene_estevam_deckers_atividade_2.docx
+++ b/rene_estevam_deckers_atividade_2.docx
@@ -5,7 +5,9 @@
     <w:p>
       <w:pPr>
         <w:pStyle w:val="Heading1"/>
-        <w:jc w:val="both"/>
+        <w:spacing w:lineRule="auto" w:line="360" w:after="120"/>
+        <w:ind w:firstLine="0"/>
+        <w:jc w:val="left"/>
       </w:pPr>
       <w:r>
         <w:rPr>
@@ -18,6 +20,7 @@
     <w:p>
       <w:pPr>
         <w:spacing w:lineRule="auto" w:line="360" w:after="120"/>
+        <w:ind w:firstLine="709"/>
         <w:jc w:val="both"/>
       </w:pPr>
       <w:r>
@@ -39,6 +42,7 @@
     <w:p>
       <w:pPr>
         <w:spacing w:lineRule="auto" w:line="360" w:after="120"/>
+        <w:ind w:firstLine="709"/>
         <w:jc w:val="both"/>
       </w:pPr>
       <w:r>
@@ -60,6 +64,7 @@
     <w:p>
       <w:pPr>
         <w:spacing w:lineRule="auto" w:line="360" w:after="120"/>
+        <w:ind w:firstLine="709"/>
         <w:jc w:val="both"/>
       </w:pPr>
       <w:r>
@@ -81,6 +86,7 @@
     <w:p>
       <w:pPr>
         <w:spacing w:lineRule="auto" w:line="360" w:after="120"/>
+        <w:ind w:firstLine="709"/>
         <w:jc w:val="both"/>
       </w:pPr>
       <w:r>
@@ -102,6 +108,7 @@
     <w:p>
       <w:pPr>
         <w:spacing w:lineRule="auto" w:line="360" w:after="120"/>
+        <w:ind w:firstLine="709"/>
         <w:jc w:val="both"/>
       </w:pPr>
       <w:r>
@@ -123,6 +130,7 @@
     <w:p>
       <w:pPr>
         <w:spacing w:lineRule="auto" w:line="360" w:after="120"/>
+        <w:ind w:firstLine="709"/>
         <w:jc w:val="both"/>
       </w:pPr>
       <w:r>
@@ -144,6 +152,7 @@
     <w:p>
       <w:pPr>
         <w:spacing w:lineRule="auto" w:line="360" w:after="120"/>
+        <w:ind w:firstLine="709"/>
         <w:jc w:val="both"/>
       </w:pPr>
       <w:r>
@@ -165,7 +174,9 @@
     <w:p>
       <w:pPr>
         <w:pStyle w:val="Heading2"/>
-        <w:jc w:val="both"/>
+        <w:spacing w:lineRule="auto" w:line="360" w:after="120"/>
+        <w:ind w:firstLine="0"/>
+        <w:jc w:val="left"/>
       </w:pPr>
       <w:r>
         <w:rPr>
@@ -178,6 +189,7 @@
     <w:p>
       <w:pPr>
         <w:spacing w:lineRule="auto" w:line="360" w:after="120"/>
+        <w:ind w:firstLine="709"/>
         <w:jc w:val="both"/>
       </w:pPr>
       <w:r>
@@ -204,8 +216,8 @@
       </w:r>
       <w:r>
         <w:rPr>
-          <w:rFonts w:ascii="Times New Roman" w:hAnsi="Times New Roman" w:eastAsia="Times New Roman" w:cs="Times New Roman"/>
-          <w:sz w:val="24"/>
+          <w:rFonts w:ascii="Courier New" w:hAnsi="Courier New"/>
+          <w:sz w:val="22"/>
         </w:rPr>
         <w:t>base_rene_estevam_deckers.csv</w:t>
       </w:r>
@@ -220,6 +232,7 @@
     <w:p>
       <w:pPr>
         <w:spacing w:lineRule="auto" w:line="360" w:after="120"/>
+        <w:ind w:firstLine="709"/>
         <w:jc w:val="both"/>
       </w:pPr>
       <w:r>
@@ -233,6 +246,7 @@
     <w:p>
       <w:pPr>
         <w:spacing w:lineRule="auto" w:line="360" w:after="120"/>
+        <w:ind w:firstLine="709"/>
         <w:jc w:val="both"/>
       </w:pPr>
       <w:r>
@@ -274,8 +288,8 @@
       </w:r>
       <w:r>
         <w:rPr>
-          <w:rFonts w:ascii="Times New Roman" w:hAnsi="Times New Roman" w:eastAsia="Times New Roman" w:cs="Times New Roman"/>
-          <w:sz w:val="24"/>
+          <w:rFonts w:ascii="Courier New" w:hAnsi="Courier New"/>
+          <w:sz w:val="22"/>
         </w:rPr>
         <w:t>valor_total_num</w:t>
       </w:r>
@@ -288,8 +302,8 @@
       </w:r>
       <w:r>
         <w:rPr>
-          <w:rFonts w:ascii="Times New Roman" w:hAnsi="Times New Roman" w:eastAsia="Times New Roman" w:cs="Times New Roman"/>
-          <w:sz w:val="24"/>
+          <w:rFonts w:ascii="Courier New" w:hAnsi="Courier New"/>
+          <w:sz w:val="22"/>
         </w:rPr>
         <w:t>dicionario_rene_estevam_deckers.xlsx</w:t>
       </w:r>
@@ -304,6 +318,7 @@
     <w:p>
       <w:pPr>
         <w:spacing w:lineRule="auto" w:line="360" w:after="120"/>
+        <w:ind w:firstLine="709"/>
         <w:jc w:val="both"/>
       </w:pPr>
       <w:r>
@@ -315,8 +330,8 @@
       </w:r>
       <w:r>
         <w:rPr>
-          <w:rFonts w:ascii="Times New Roman" w:hAnsi="Times New Roman" w:eastAsia="Times New Roman" w:cs="Times New Roman"/>
-          <w:sz w:val="24"/>
+          <w:rFonts w:ascii="Courier New" w:hAnsi="Courier New"/>
+          <w:sz w:val="22"/>
         </w:rPr>
         <w:t>X</w:t>
       </w:r>
@@ -376,7 +391,9 @@
     <w:p>
       <w:pPr>
         <w:pStyle w:val="Heading2"/>
-        <w:jc w:val="both"/>
+        <w:spacing w:lineRule="auto" w:line="360" w:after="120"/>
+        <w:ind w:firstLine="0"/>
+        <w:jc w:val="left"/>
       </w:pPr>
       <w:r>
         <w:rPr>
@@ -389,6 +406,7 @@
     <w:p>
       <w:pPr>
         <w:spacing w:lineRule="auto" w:line="360" w:after="120"/>
+        <w:ind w:firstLine="709"/>
         <w:jc w:val="both"/>
       </w:pPr>
       <w:r>
@@ -402,7 +420,9 @@
     <w:p>
       <w:pPr>
         <w:pStyle w:val="Heading3"/>
-        <w:jc w:val="both"/>
+        <w:spacing w:lineRule="auto" w:line="360" w:after="120"/>
+        <w:ind w:firstLine="0"/>
+        <w:jc w:val="left"/>
       </w:pPr>
       <w:r>
         <w:rPr>
@@ -415,6 +435,7 @@
     <w:p>
       <w:pPr>
         <w:spacing w:lineRule="auto" w:line="360" w:after="120"/>
+        <w:ind w:firstLine="709"/>
         <w:jc w:val="both"/>
       </w:pPr>
       <w:r>
@@ -458,6 +479,7 @@
     <w:p>
       <w:pPr>
         <w:spacing w:lineRule="auto" w:line="360" w:after="120"/>
+        <w:ind w:firstLine="709"/>
         <w:jc w:val="both"/>
       </w:pPr>
       <w:r>
@@ -546,6 +568,7 @@
     <w:p>
       <w:pPr>
         <w:spacing w:lineRule="auto" w:line="360" w:after="120"/>
+        <w:ind w:firstLine="709"/>
         <w:jc w:val="both"/>
       </w:pPr>
       <w:r>
@@ -604,7 +627,9 @@
     <w:p>
       <w:pPr>
         <w:pStyle w:val="Heading3"/>
-        <w:jc w:val="both"/>
+        <w:spacing w:lineRule="auto" w:line="360" w:after="120"/>
+        <w:ind w:firstLine="0"/>
+        <w:jc w:val="left"/>
       </w:pPr>
       <w:r>
         <w:rPr>
@@ -617,6 +642,7 @@
     <w:p>
       <w:pPr>
         <w:spacing w:lineRule="auto" w:line="360" w:after="120"/>
+        <w:ind w:firstLine="709"/>
         <w:jc w:val="both"/>
       </w:pPr>
       <w:r>
@@ -643,8 +669,8 @@
       </w:r>
       <w:r>
         <w:rPr>
-          <w:rFonts w:ascii="Times New Roman" w:hAnsi="Times New Roman" w:eastAsia="Times New Roman" w:cs="Times New Roman"/>
-          <w:sz w:val="24"/>
+          <w:rFonts w:ascii="Courier New" w:hAnsi="Courier New"/>
+          <w:sz w:val="22"/>
         </w:rPr>
         <w:t>test_size=0.2</w:t>
       </w:r>
@@ -674,6 +700,7 @@
     <w:p>
       <w:pPr>
         <w:spacing w:lineRule="auto" w:line="360" w:after="120"/>
+        <w:ind w:firstLine="709"/>
         <w:jc w:val="both"/>
       </w:pPr>
       <w:r>
@@ -700,8 +727,8 @@
       </w:r>
       <w:r>
         <w:rPr>
-          <w:rFonts w:ascii="Times New Roman" w:hAnsi="Times New Roman" w:eastAsia="Times New Roman" w:cs="Times New Roman"/>
-          <w:sz w:val="24"/>
+          <w:rFonts w:ascii="Courier New" w:hAnsi="Courier New"/>
+          <w:sz w:val="22"/>
         </w:rPr>
         <w:t>pd.qcut</w:t>
       </w:r>
@@ -714,8 +741,8 @@
       </w:r>
       <w:r>
         <w:rPr>
-          <w:rFonts w:ascii="Times New Roman" w:hAnsi="Times New Roman" w:eastAsia="Times New Roman" w:cs="Times New Roman"/>
-          <w:sz w:val="24"/>
+          <w:rFonts w:ascii="Courier New" w:hAnsi="Courier New"/>
+          <w:sz w:val="22"/>
         </w:rPr>
         <w:t>duplicates="drop"</w:t>
       </w:r>
@@ -728,8 +755,8 @@
       </w:r>
       <w:r>
         <w:rPr>
-          <w:rFonts w:ascii="Times New Roman" w:hAnsi="Times New Roman" w:eastAsia="Times New Roman" w:cs="Times New Roman"/>
-          <w:sz w:val="24"/>
+          <w:rFonts w:ascii="Courier New" w:hAnsi="Courier New"/>
+          <w:sz w:val="22"/>
         </w:rPr>
         <w:t>stratify</w:t>
       </w:r>
@@ -742,8 +769,8 @@
       </w:r>
       <w:r>
         <w:rPr>
-          <w:rFonts w:ascii="Times New Roman" w:hAnsi="Times New Roman" w:eastAsia="Times New Roman" w:cs="Times New Roman"/>
-          <w:sz w:val="24"/>
+          <w:rFonts w:ascii="Courier New" w:hAnsi="Courier New"/>
+          <w:sz w:val="22"/>
         </w:rPr>
         <w:t>train_test_split</w:t>
       </w:r>
@@ -758,6 +785,7 @@
     <w:p>
       <w:pPr>
         <w:spacing w:lineRule="auto" w:line="360" w:after="120"/>
+        <w:ind w:firstLine="709"/>
         <w:jc w:val="both"/>
       </w:pPr>
       <w:r>
@@ -784,8 +812,8 @@
       </w:r>
       <w:r>
         <w:rPr>
-          <w:rFonts w:ascii="Times New Roman" w:hAnsi="Times New Roman" w:eastAsia="Times New Roman" w:cs="Times New Roman"/>
-          <w:sz w:val="24"/>
+          <w:rFonts w:ascii="Courier New" w:hAnsi="Courier New"/>
+          <w:sz w:val="22"/>
         </w:rPr>
         <w:t>fit</w:t>
       </w:r>
@@ -813,8 +841,8 @@
       </w:r>
       <w:r>
         <w:rPr>
-          <w:rFonts w:ascii="Times New Roman" w:hAnsi="Times New Roman" w:eastAsia="Times New Roman" w:cs="Times New Roman"/>
-          <w:sz w:val="24"/>
+          <w:rFonts w:ascii="Courier New" w:hAnsi="Courier New"/>
+          <w:sz w:val="22"/>
         </w:rPr>
         <w:t>valor_total_num</w:t>
       </w:r>
@@ -827,8 +855,8 @@
       </w:r>
       <w:r>
         <w:rPr>
-          <w:rFonts w:ascii="Times New Roman" w:hAnsi="Times New Roman" w:eastAsia="Times New Roman" w:cs="Times New Roman"/>
-          <w:sz w:val="24"/>
+          <w:rFonts w:ascii="Courier New" w:hAnsi="Courier New"/>
+          <w:sz w:val="22"/>
         </w:rPr>
         <w:t>X</w:t>
       </w:r>
@@ -873,7 +901,9 @@
     <w:p>
       <w:pPr>
         <w:pStyle w:val="Heading3"/>
-        <w:jc w:val="both"/>
+        <w:spacing w:lineRule="auto" w:line="360" w:after="120"/>
+        <w:ind w:firstLine="0"/>
+        <w:jc w:val="left"/>
       </w:pPr>
       <w:r>
         <w:rPr>
@@ -886,6 +916,7 @@
     <w:p>
       <w:pPr>
         <w:spacing w:lineRule="auto" w:line="360" w:after="120"/>
+        <w:ind w:firstLine="709"/>
         <w:jc w:val="both"/>
       </w:pPr>
       <w:r>
@@ -912,8 +943,8 @@
       </w:r>
       <w:r>
         <w:rPr>
-          <w:rFonts w:ascii="Times New Roman" w:hAnsi="Times New Roman" w:eastAsia="Times New Roman" w:cs="Times New Roman"/>
-          <w:sz w:val="24"/>
+          <w:rFonts w:ascii="Courier New" w:hAnsi="Courier New"/>
+          <w:sz w:val="22"/>
         </w:rPr>
         <w:t>ColumnTransformer</w:t>
       </w:r>
@@ -941,8 +972,8 @@
       </w:r>
       <w:r>
         <w:rPr>
-          <w:rFonts w:ascii="Times New Roman" w:hAnsi="Times New Roman" w:eastAsia="Times New Roman" w:cs="Times New Roman"/>
-          <w:sz w:val="24"/>
+          <w:rFonts w:ascii="Courier New" w:hAnsi="Courier New"/>
+          <w:sz w:val="22"/>
         </w:rPr>
         <w:t>transform</w:t>
       </w:r>
@@ -957,6 +988,7 @@
     <w:p>
       <w:pPr>
         <w:spacing w:lineRule="auto" w:line="360" w:after="120"/>
+        <w:ind w:firstLine="709"/>
         <w:jc w:val="both"/>
       </w:pPr>
       <w:r>
@@ -983,8 +1015,8 @@
       </w:r>
       <w:r>
         <w:rPr>
-          <w:rFonts w:ascii="Times New Roman" w:hAnsi="Times New Roman" w:eastAsia="Times New Roman" w:cs="Times New Roman"/>
-          <w:sz w:val="24"/>
+          <w:rFonts w:ascii="Courier New" w:hAnsi="Courier New"/>
+          <w:sz w:val="22"/>
         </w:rPr>
         <w:t>ColumnTransformer</w:t>
       </w:r>
@@ -999,6 +1031,7 @@
     <w:p>
       <w:pPr>
         <w:spacing w:lineRule="auto" w:line="360" w:after="120"/>
+        <w:ind w:firstLine="709"/>
         <w:jc w:val="both"/>
       </w:pPr>
       <w:r>
@@ -1065,6 +1098,7 @@
     <w:p>
       <w:pPr>
         <w:spacing w:lineRule="auto" w:line="360" w:after="120"/>
+        <w:ind w:firstLine="709"/>
         <w:jc w:val="both"/>
       </w:pPr>
       <w:r>
@@ -1076,8 +1110,8 @@
       </w:r>
       <w:r>
         <w:rPr>
-          <w:rFonts w:ascii="Times New Roman" w:hAnsi="Times New Roman" w:eastAsia="Times New Roman" w:cs="Times New Roman"/>
-          <w:sz w:val="24"/>
+          <w:rFonts w:ascii="Courier New" w:hAnsi="Courier New"/>
+          <w:sz w:val="22"/>
         </w:rPr>
         <w:t>SimpleImputer</w:t>
       </w:r>
@@ -1120,8 +1154,8 @@
       </w:r>
       <w:r>
         <w:rPr>
-          <w:rFonts w:ascii="Times New Roman" w:hAnsi="Times New Roman" w:eastAsia="Times New Roman" w:cs="Times New Roman"/>
-          <w:sz w:val="24"/>
+          <w:rFonts w:ascii="Courier New" w:hAnsi="Courier New"/>
+          <w:sz w:val="22"/>
         </w:rPr>
         <w:t>OneHotEncoder</w:t>
       </w:r>
@@ -1149,8 +1183,8 @@
       </w:r>
       <w:r>
         <w:rPr>
-          <w:rFonts w:ascii="Times New Roman" w:hAnsi="Times New Roman" w:eastAsia="Times New Roman" w:cs="Times New Roman"/>
-          <w:sz w:val="24"/>
+          <w:rFonts w:ascii="Courier New" w:hAnsi="Courier New"/>
+          <w:sz w:val="22"/>
         </w:rPr>
         <w:t>handle_unknown='ignore'</w:t>
       </w:r>
@@ -1195,6 +1229,7 @@
     <w:p>
       <w:pPr>
         <w:spacing w:lineRule="auto" w:line="360" w:after="120"/>
+        <w:ind w:firstLine="709"/>
         <w:jc w:val="both"/>
       </w:pPr>
       <w:r>
@@ -1244,8 +1279,8 @@
       </w:r>
       <w:r>
         <w:rPr>
-          <w:rFonts w:ascii="Times New Roman" w:hAnsi="Times New Roman" w:eastAsia="Times New Roman" w:cs="Times New Roman"/>
-          <w:sz w:val="24"/>
+          <w:rFonts w:ascii="Courier New" w:hAnsi="Courier New"/>
+          <w:sz w:val="22"/>
         </w:rPr>
         <w:t>.toarray()</w:t>
       </w:r>
@@ -1288,8 +1323,8 @@
       </w:r>
       <w:r>
         <w:rPr>
-          <w:rFonts w:ascii="Times New Roman" w:hAnsi="Times New Roman" w:eastAsia="Times New Roman" w:cs="Times New Roman"/>
-          <w:sz w:val="24"/>
+          <w:rFonts w:ascii="Courier New" w:hAnsi="Courier New"/>
+          <w:sz w:val="22"/>
         </w:rPr>
         <w:t>AMOSTRA_CV</w:t>
       </w:r>
@@ -1302,8 +1337,8 @@
       </w:r>
       <w:r>
         <w:rPr>
-          <w:rFonts w:ascii="Times New Roman" w:hAnsi="Times New Roman" w:eastAsia="Times New Roman" w:cs="Times New Roman"/>
-          <w:sz w:val="24"/>
+          <w:rFonts w:ascii="Courier New" w:hAnsi="Courier New"/>
+          <w:sz w:val="22"/>
         </w:rPr>
         <w:t>AMOSTRA_RF</w:t>
       </w:r>
@@ -1318,7 +1353,9 @@
     <w:p>
       <w:pPr>
         <w:pStyle w:val="Heading3"/>
-        <w:jc w:val="both"/>
+        <w:spacing w:lineRule="auto" w:line="360" w:after="120"/>
+        <w:ind w:firstLine="0"/>
+        <w:jc w:val="left"/>
       </w:pPr>
       <w:r>
         <w:rPr>
@@ -1331,6 +1368,7 @@
     <w:p>
       <w:pPr>
         <w:spacing w:lineRule="auto" w:line="360" w:after="120"/>
+        <w:ind w:firstLine="709"/>
         <w:jc w:val="both"/>
       </w:pPr>
       <w:r>
@@ -1357,8 +1395,8 @@
       </w:r>
       <w:r>
         <w:rPr>
-          <w:rFonts w:ascii="Times New Roman" w:hAnsi="Times New Roman" w:eastAsia="Times New Roman" w:cs="Times New Roman"/>
-          <w:sz w:val="24"/>
+          <w:rFonts w:ascii="Courier New" w:hAnsi="Courier New"/>
+          <w:sz w:val="22"/>
         </w:rPr>
         <w:t>clone(preprocessor)</w:t>
       </w:r>
@@ -1373,6 +1411,7 @@
     <w:p>
       <w:pPr>
         <w:spacing w:lineRule="auto" w:line="360" w:after="120"/>
+        <w:ind w:firstLine="709"/>
         <w:jc w:val="both"/>
       </w:pPr>
       <w:r>
@@ -1454,6 +1493,7 @@
     <w:p>
       <w:pPr>
         <w:spacing w:lineRule="auto" w:line="360" w:after="120"/>
+        <w:ind w:firstLine="709"/>
         <w:jc w:val="both"/>
       </w:pPr>
       <w:r>
@@ -1542,7 +1582,9 @@
     <w:p>
       <w:pPr>
         <w:pStyle w:val="Heading3"/>
-        <w:jc w:val="both"/>
+        <w:spacing w:lineRule="auto" w:line="360" w:after="120"/>
+        <w:ind w:firstLine="0"/>
+        <w:jc w:val="left"/>
       </w:pPr>
       <w:r>
         <w:rPr>
@@ -1555,6 +1597,7 @@
     <w:p>
       <w:pPr>
         <w:spacing w:lineRule="auto" w:line="360" w:after="120"/>
+        <w:ind w:firstLine="709"/>
         <w:jc w:val="both"/>
       </w:pPr>
       <w:r>
@@ -1613,7 +1656,9 @@
     <w:p>
       <w:pPr>
         <w:pStyle w:val="Heading3"/>
-        <w:jc w:val="both"/>
+        <w:spacing w:lineRule="auto" w:line="360" w:after="120"/>
+        <w:ind w:firstLine="0"/>
+        <w:jc w:val="left"/>
       </w:pPr>
       <w:r>
         <w:rPr>
@@ -1626,6 +1671,7 @@
     <w:p>
       <w:pPr>
         <w:spacing w:lineRule="auto" w:line="360" w:after="120"/>
+        <w:ind w:firstLine="709"/>
         <w:jc w:val="both"/>
       </w:pPr>
       <w:r>
@@ -1667,8 +1713,8 @@
       </w:r>
       <w:r>
         <w:rPr>
-          <w:rFonts w:ascii="Times New Roman" w:hAnsi="Times New Roman" w:eastAsia="Times New Roman" w:cs="Times New Roman"/>
-          <w:sz w:val="24"/>
+          <w:rFonts w:ascii="Courier New" w:hAnsi="Courier New"/>
+          <w:sz w:val="22"/>
         </w:rPr>
         <w:t>AMOSTRA_SEARCH</w:t>
       </w:r>
@@ -1681,8 +1727,8 @@
       </w:r>
       <w:r>
         <w:rPr>
-          <w:rFonts w:ascii="Times New Roman" w:hAnsi="Times New Roman" w:eastAsia="Times New Roman" w:cs="Times New Roman"/>
-          <w:sz w:val="24"/>
+          <w:rFonts w:ascii="Courier New" w:hAnsi="Courier New"/>
+          <w:sz w:val="22"/>
         </w:rPr>
         <w:t>cv=3</w:t>
       </w:r>
@@ -1695,8 +1741,8 @@
       </w:r>
       <w:r>
         <w:rPr>
-          <w:rFonts w:ascii="Times New Roman" w:hAnsi="Times New Roman" w:eastAsia="Times New Roman" w:cs="Times New Roman"/>
-          <w:sz w:val="24"/>
+          <w:rFonts w:ascii="Courier New" w:hAnsi="Courier New"/>
+          <w:sz w:val="22"/>
         </w:rPr>
         <w:t>scoring='neg_mean_squared_error'</w:t>
       </w:r>
@@ -1726,6 +1772,7 @@
     <w:p>
       <w:pPr>
         <w:spacing w:lineRule="auto" w:line="360" w:after="120"/>
+        <w:ind w:firstLine="709"/>
         <w:jc w:val="both"/>
       </w:pPr>
       <w:r>
@@ -1842,8 +1889,8 @@
       </w:r>
       <w:r>
         <w:rPr>
-          <w:rFonts w:ascii="Times New Roman" w:hAnsi="Times New Roman" w:eastAsia="Times New Roman" w:cs="Times New Roman"/>
-          <w:sz w:val="24"/>
+          <w:rFonts w:ascii="Courier New" w:hAnsi="Courier New"/>
+          <w:sz w:val="22"/>
         </w:rPr>
         <w:t>alpha</w:t>
       </w:r>
@@ -1888,7 +1935,9 @@
     <w:p>
       <w:pPr>
         <w:pStyle w:val="Heading3"/>
-        <w:jc w:val="both"/>
+        <w:spacing w:lineRule="auto" w:line="360" w:after="120"/>
+        <w:ind w:firstLine="0"/>
+        <w:jc w:val="left"/>
       </w:pPr>
       <w:r>
         <w:rPr>
@@ -1901,6 +1950,7 @@
     <w:p>
       <w:pPr>
         <w:spacing w:lineRule="auto" w:line="360" w:after="120"/>
+        <w:ind w:firstLine="709"/>
         <w:jc w:val="both"/>
       </w:pPr>
       <w:r>
@@ -1974,7 +2024,9 @@
     <w:p>
       <w:pPr>
         <w:pStyle w:val="Heading2"/>
-        <w:jc w:val="both"/>
+        <w:spacing w:lineRule="auto" w:line="360" w:after="120"/>
+        <w:ind w:firstLine="0"/>
+        <w:jc w:val="left"/>
       </w:pPr>
       <w:r>
         <w:rPr>
@@ -1987,7 +2039,9 @@
     <w:p>
       <w:pPr>
         <w:pStyle w:val="Heading3"/>
-        <w:jc w:val="both"/>
+        <w:spacing w:lineRule="auto" w:line="360" w:after="120"/>
+        <w:ind w:firstLine="0"/>
+        <w:jc w:val="left"/>
       </w:pPr>
       <w:r>
         <w:rPr>
@@ -2000,6 +2054,7 @@
     <w:p>
       <w:pPr>
         <w:spacing w:lineRule="auto" w:line="360" w:after="120"/>
+        <w:ind w:firstLine="709"/>
         <w:jc w:val="both"/>
       </w:pPr>
       <w:r>
@@ -2088,7 +2143,9 @@
     <w:p>
       <w:pPr>
         <w:pStyle w:val="Heading3"/>
-        <w:jc w:val="both"/>
+        <w:spacing w:lineRule="auto" w:line="360" w:after="120"/>
+        <w:ind w:firstLine="0"/>
+        <w:jc w:val="left"/>
       </w:pPr>
       <w:r>
         <w:rPr>
@@ -2101,6 +2158,7 @@
     <w:p>
       <w:pPr>
         <w:spacing w:lineRule="auto" w:line="360" w:after="120"/>
+        <w:ind w:firstLine="709"/>
         <w:jc w:val="both"/>
       </w:pPr>
       <w:r>
@@ -2159,6 +2217,7 @@
     <w:p>
       <w:pPr>
         <w:spacing w:lineRule="auto" w:line="360" w:after="120"/>
+        <w:ind w:firstLine="709"/>
         <w:jc w:val="both"/>
       </w:pPr>
       <w:r>
@@ -2172,6 +2231,7 @@
     <w:p>
       <w:pPr>
         <w:spacing w:lineRule="auto" w:line="360" w:after="120"/>
+        <w:ind w:firstLine="709"/>
         <w:jc w:val="both"/>
       </w:pPr>
       <w:r>
@@ -2204,19 +2264,20 @@
         <w:tblLook w:firstColumn="1" w:firstRow="1" w:lastColumn="0" w:lastRow="0" w:noHBand="0" w:noVBand="1" w:val="04A0"/>
       </w:tblPr>
       <w:tblGrid>
-        <w:gridCol w:w="2160"/>
-        <w:gridCol w:w="2160"/>
-        <w:gridCol w:w="2160"/>
-        <w:gridCol w:w="2160"/>
+        <w:gridCol w:w="2351"/>
+        <w:gridCol w:w="2351"/>
+        <w:gridCol w:w="2351"/>
+        <w:gridCol w:w="2351"/>
       </w:tblGrid>
       <w:tr>
         <w:tc>
           <w:tcPr>
-            <w:tcW w:type="dxa" w:w="2160"/>
+            <w:tcW w:type="dxa" w:w="2351"/>
           </w:tcPr>
           <w:p>
             <w:pPr>
               <w:spacing w:lineRule="auto" w:line="360" w:after="120"/>
+              <w:ind w:firstLine="0"/>
               <w:jc w:val="both"/>
             </w:pPr>
             <w:r>
@@ -2230,11 +2291,12 @@
         </w:tc>
         <w:tc>
           <w:tcPr>
-            <w:tcW w:type="dxa" w:w="2160"/>
+            <w:tcW w:type="dxa" w:w="2351"/>
           </w:tcPr>
           <w:p>
             <w:pPr>
               <w:spacing w:lineRule="auto" w:line="360" w:after="120"/>
+              <w:ind w:firstLine="0"/>
               <w:jc w:val="both"/>
             </w:pPr>
             <w:r>
@@ -2248,11 +2310,12 @@
         </w:tc>
         <w:tc>
           <w:tcPr>
-            <w:tcW w:type="dxa" w:w="2160"/>
+            <w:tcW w:type="dxa" w:w="2351"/>
           </w:tcPr>
           <w:p>
             <w:pPr>
               <w:spacing w:lineRule="auto" w:line="360" w:after="120"/>
+              <w:ind w:firstLine="0"/>
               <w:jc w:val="both"/>
             </w:pPr>
             <w:r>
@@ -2266,11 +2329,12 @@
         </w:tc>
         <w:tc>
           <w:tcPr>
-            <w:tcW w:type="dxa" w:w="2160"/>
+            <w:tcW w:type="dxa" w:w="2351"/>
           </w:tcPr>
           <w:p>
             <w:pPr>
               <w:spacing w:lineRule="auto" w:line="360" w:after="120"/>
+              <w:ind w:firstLine="0"/>
               <w:jc w:val="both"/>
             </w:pPr>
             <w:r>
@@ -2286,11 +2350,12 @@
       <w:tr>
         <w:tc>
           <w:tcPr>
-            <w:tcW w:type="dxa" w:w="2160"/>
+            <w:tcW w:type="dxa" w:w="2351"/>
           </w:tcPr>
           <w:p>
             <w:pPr>
               <w:spacing w:lineRule="auto" w:line="360" w:after="120"/>
+              <w:ind w:firstLine="0"/>
               <w:jc w:val="both"/>
             </w:pPr>
             <w:r>
@@ -2304,11 +2369,12 @@
         </w:tc>
         <w:tc>
           <w:tcPr>
-            <w:tcW w:type="dxa" w:w="2160"/>
+            <w:tcW w:type="dxa" w:w="2351"/>
           </w:tcPr>
           <w:p>
             <w:pPr>
               <w:spacing w:lineRule="auto" w:line="360" w:after="120"/>
+              <w:ind w:firstLine="0"/>
               <w:jc w:val="both"/>
             </w:pPr>
             <w:r>
@@ -2322,11 +2388,12 @@
         </w:tc>
         <w:tc>
           <w:tcPr>
-            <w:tcW w:type="dxa" w:w="2160"/>
+            <w:tcW w:type="dxa" w:w="2351"/>
           </w:tcPr>
           <w:p>
             <w:pPr>
               <w:spacing w:lineRule="auto" w:line="360" w:after="120"/>
+              <w:ind w:firstLine="0"/>
               <w:jc w:val="both"/>
             </w:pPr>
             <w:r>
@@ -2340,11 +2407,12 @@
         </w:tc>
         <w:tc>
           <w:tcPr>
-            <w:tcW w:type="dxa" w:w="2160"/>
+            <w:tcW w:type="dxa" w:w="2351"/>
           </w:tcPr>
           <w:p>
             <w:pPr>
               <w:spacing w:lineRule="auto" w:line="360" w:after="120"/>
+              <w:ind w:firstLine="0"/>
               <w:jc w:val="both"/>
             </w:pPr>
             <w:r>
@@ -2360,11 +2428,12 @@
       <w:tr>
         <w:tc>
           <w:tcPr>
-            <w:tcW w:type="dxa" w:w="2160"/>
+            <w:tcW w:type="dxa" w:w="2351"/>
           </w:tcPr>
           <w:p>
             <w:pPr>
               <w:spacing w:lineRule="auto" w:line="360" w:after="120"/>
+              <w:ind w:firstLine="0"/>
               <w:jc w:val="both"/>
             </w:pPr>
             <w:r>
@@ -2378,11 +2447,12 @@
         </w:tc>
         <w:tc>
           <w:tcPr>
-            <w:tcW w:type="dxa" w:w="2160"/>
+            <w:tcW w:type="dxa" w:w="2351"/>
           </w:tcPr>
           <w:p>
             <w:pPr>
               <w:spacing w:lineRule="auto" w:line="360" w:after="120"/>
+              <w:ind w:firstLine="0"/>
               <w:jc w:val="both"/>
             </w:pPr>
             <w:r>
@@ -2396,11 +2466,12 @@
         </w:tc>
         <w:tc>
           <w:tcPr>
-            <w:tcW w:type="dxa" w:w="2160"/>
+            <w:tcW w:type="dxa" w:w="2351"/>
           </w:tcPr>
           <w:p>
             <w:pPr>
               <w:spacing w:lineRule="auto" w:line="360" w:after="120"/>
+              <w:ind w:firstLine="0"/>
               <w:jc w:val="both"/>
             </w:pPr>
             <w:r>
@@ -2414,11 +2485,12 @@
         </w:tc>
         <w:tc>
           <w:tcPr>
-            <w:tcW w:type="dxa" w:w="2160"/>
+            <w:tcW w:type="dxa" w:w="2351"/>
           </w:tcPr>
           <w:p>
             <w:pPr>
               <w:spacing w:lineRule="auto" w:line="360" w:after="120"/>
+              <w:ind w:firstLine="0"/>
               <w:jc w:val="both"/>
             </w:pPr>
             <w:r>
@@ -2434,11 +2506,12 @@
       <w:tr>
         <w:tc>
           <w:tcPr>
-            <w:tcW w:type="dxa" w:w="2160"/>
+            <w:tcW w:type="dxa" w:w="2351"/>
           </w:tcPr>
           <w:p>
             <w:pPr>
               <w:spacing w:lineRule="auto" w:line="360" w:after="120"/>
+              <w:ind w:firstLine="0"/>
               <w:jc w:val="both"/>
             </w:pPr>
             <w:r>
@@ -2452,11 +2525,12 @@
         </w:tc>
         <w:tc>
           <w:tcPr>
-            <w:tcW w:type="dxa" w:w="2160"/>
+            <w:tcW w:type="dxa" w:w="2351"/>
           </w:tcPr>
           <w:p>
             <w:pPr>
               <w:spacing w:lineRule="auto" w:line="360" w:after="120"/>
+              <w:ind w:firstLine="0"/>
               <w:jc w:val="both"/>
             </w:pPr>
             <w:r>
@@ -2470,11 +2544,12 @@
         </w:tc>
         <w:tc>
           <w:tcPr>
-            <w:tcW w:type="dxa" w:w="2160"/>
+            <w:tcW w:type="dxa" w:w="2351"/>
           </w:tcPr>
           <w:p>
             <w:pPr>
               <w:spacing w:lineRule="auto" w:line="360" w:after="120"/>
+              <w:ind w:firstLine="0"/>
               <w:jc w:val="both"/>
             </w:pPr>
             <w:r>
@@ -2488,11 +2563,12 @@
         </w:tc>
         <w:tc>
           <w:tcPr>
-            <w:tcW w:type="dxa" w:w="2160"/>
+            <w:tcW w:type="dxa" w:w="2351"/>
           </w:tcPr>
           <w:p>
             <w:pPr>
               <w:spacing w:lineRule="auto" w:line="360" w:after="120"/>
+              <w:ind w:firstLine="0"/>
               <w:jc w:val="both"/>
             </w:pPr>
             <w:r>
@@ -2510,6 +2586,7 @@
     <w:p>
       <w:pPr>
         <w:spacing w:lineRule="auto" w:line="360" w:after="120"/>
+        <w:ind w:firstLine="709"/>
         <w:jc w:val="both"/>
       </w:pPr>
       <w:r>
@@ -2538,6 +2615,7 @@
     <w:p>
       <w:pPr>
         <w:spacing w:lineRule="auto" w:line="360" w:after="120"/>
+        <w:ind w:firstLine="709"/>
         <w:jc w:val="both"/>
       </w:pPr>
       <w:r>
@@ -2641,6 +2719,7 @@
     <w:p>
       <w:pPr>
         <w:spacing w:after="120"/>
+        <w:ind w:firstLine="0"/>
         <w:jc w:val="center"/>
       </w:pPr>
       <w:r>
@@ -2681,7 +2760,8 @@
     <w:p>
       <w:pPr>
         <w:spacing w:lineRule="auto" w:line="360" w:after="120"/>
-        <w:jc w:val="both"/>
+        <w:ind w:firstLine="0"/>
+        <w:jc w:val="center"/>
       </w:pPr>
       <w:r>
         <w:rPr>
@@ -2695,6 +2775,7 @@
     <w:p>
       <w:pPr>
         <w:spacing w:lineRule="auto" w:line="360" w:after="120"/>
+        <w:ind w:firstLine="709"/>
         <w:jc w:val="both"/>
       </w:pPr>
       <w:r>
@@ -2783,6 +2864,7 @@
     <w:p>
       <w:pPr>
         <w:spacing w:after="120"/>
+        <w:ind w:firstLine="0"/>
         <w:jc w:val="center"/>
       </w:pPr>
       <w:r>
@@ -2823,7 +2905,8 @@
     <w:p>
       <w:pPr>
         <w:spacing w:lineRule="auto" w:line="360" w:after="120"/>
-        <w:jc w:val="both"/>
+        <w:ind w:firstLine="0"/>
+        <w:jc w:val="center"/>
       </w:pPr>
       <w:r>
         <w:rPr>
@@ -2837,7 +2920,9 @@
     <w:p>
       <w:pPr>
         <w:pStyle w:val="Heading3"/>
-        <w:jc w:val="both"/>
+        <w:spacing w:lineRule="auto" w:line="360" w:after="120"/>
+        <w:ind w:firstLine="0"/>
+        <w:jc w:val="left"/>
       </w:pPr>
       <w:r>
         <w:rPr>
@@ -2850,6 +2935,7 @@
     <w:p>
       <w:pPr>
         <w:spacing w:lineRule="auto" w:line="360" w:after="120"/>
+        <w:ind w:firstLine="709"/>
         <w:jc w:val="both"/>
       </w:pPr>
       <w:r>
@@ -2953,6 +3039,7 @@
     <w:p>
       <w:pPr>
         <w:spacing w:lineRule="auto" w:line="360" w:after="120"/>
+        <w:ind w:firstLine="709"/>
         <w:jc w:val="both"/>
       </w:pPr>
       <w:r>
@@ -2996,7 +3083,9 @@
     <w:p>
       <w:pPr>
         <w:pStyle w:val="Heading3"/>
-        <w:jc w:val="both"/>
+        <w:spacing w:lineRule="auto" w:line="360" w:after="120"/>
+        <w:ind w:firstLine="0"/>
+        <w:jc w:val="left"/>
       </w:pPr>
       <w:r>
         <w:rPr>
@@ -3009,6 +3098,7 @@
     <w:p>
       <w:pPr>
         <w:spacing w:lineRule="auto" w:line="360" w:after="120"/>
+        <w:ind w:firstLine="709"/>
         <w:jc w:val="both"/>
       </w:pPr>
       <w:r>
@@ -3157,7 +3247,9 @@
     <w:p>
       <w:pPr>
         <w:pStyle w:val="Heading2"/>
-        <w:jc w:val="both"/>
+        <w:spacing w:lineRule="auto" w:line="360" w:after="120"/>
+        <w:ind w:firstLine="0"/>
+        <w:jc w:val="left"/>
       </w:pPr>
       <w:r>
         <w:rPr>
@@ -3170,6 +3262,7 @@
     <w:p>
       <w:pPr>
         <w:spacing w:lineRule="auto" w:line="360" w:after="120"/>
+        <w:ind w:firstLine="709"/>
         <w:jc w:val="both"/>
       </w:pPr>
       <w:r>
@@ -3258,6 +3351,7 @@
     <w:p>
       <w:pPr>
         <w:spacing w:lineRule="auto" w:line="360" w:after="120"/>
+        <w:ind w:firstLine="709"/>
         <w:jc w:val="both"/>
       </w:pPr>
       <w:r>
@@ -3361,6 +3455,7 @@
     <w:p>
       <w:pPr>
         <w:spacing w:lineRule="auto" w:line="360" w:after="120"/>
+        <w:ind w:firstLine="709"/>
         <w:jc w:val="both"/>
       </w:pPr>
       <w:r>
@@ -3372,8 +3467,8 @@
       </w:r>
       <w:r>
         <w:rPr>
-          <w:rFonts w:ascii="Times New Roman" w:hAnsi="Times New Roman" w:eastAsia="Times New Roman" w:cs="Times New Roman"/>
-          <w:sz w:val="24"/>
+          <w:rFonts w:ascii="Courier New" w:hAnsi="Courier New"/>
+          <w:sz w:val="22"/>
         </w:rPr>
         <w:t>log1p</w:t>
       </w:r>
@@ -3478,7 +3573,9 @@
     <w:p>
       <w:pPr>
         <w:pStyle w:val="Heading2"/>
-        <w:jc w:val="both"/>
+        <w:spacing w:lineRule="auto" w:line="360" w:after="120"/>
+        <w:ind w:firstLine="0"/>
+        <w:jc w:val="left"/>
       </w:pPr>
       <w:r>
         <w:rPr>
@@ -3491,6 +3588,7 @@
     <w:p>
       <w:pPr>
         <w:spacing w:lineRule="auto" w:line="360" w:after="120"/>
+        <w:ind w:left="709" w:hanging="709"/>
         <w:jc w:val="both"/>
       </w:pPr>
       <w:r>
@@ -3519,6 +3617,7 @@
     <w:p>
       <w:pPr>
         <w:spacing w:lineRule="auto" w:line="360" w:after="120"/>
+        <w:ind w:left="709" w:hanging="709"/>
         <w:jc w:val="both"/>
       </w:pPr>
       <w:r>
@@ -3547,6 +3646,7 @@
     <w:p>
       <w:pPr>
         <w:spacing w:lineRule="auto" w:line="360" w:after="120"/>
+        <w:ind w:left="709" w:hanging="709"/>
         <w:jc w:val="both"/>
       </w:pPr>
       <w:r>
@@ -3575,6 +3675,7 @@
     <w:p>
       <w:pPr>
         <w:spacing w:lineRule="auto" w:line="360" w:after="120"/>
+        <w:ind w:left="709" w:hanging="709"/>
         <w:jc w:val="both"/>
       </w:pPr>
       <w:r>
@@ -3603,6 +3704,7 @@
     <w:p>
       <w:pPr>
         <w:spacing w:lineRule="auto" w:line="360" w:after="120"/>
+        <w:ind w:left="709" w:hanging="709"/>
         <w:jc w:val="both"/>
       </w:pPr>
       <w:r>
@@ -3631,6 +3733,7 @@
     <w:p>
       <w:pPr>
         <w:spacing w:lineRule="auto" w:line="360" w:after="120"/>
+        <w:ind w:left="709" w:hanging="709"/>
         <w:jc w:val="both"/>
       </w:pPr>
       <w:r>
@@ -3659,6 +3762,7 @@
     <w:p>
       <w:pPr>
         <w:spacing w:lineRule="auto" w:line="360" w:after="120"/>
+        <w:ind w:left="709" w:hanging="709"/>
         <w:jc w:val="both"/>
       </w:pPr>
       <w:r>
@@ -3686,7 +3790,7 @@
     </w:p>
     <w:sectPr>
       <w:pgSz w:w="12240" w:h="15840"/>
-      <w:pgMar w:top="1440" w:right="1800" w:bottom="1440" w:left="1800" w:header="720" w:footer="720" w:gutter="0"/>
+      <w:pgMar w:top="1134" w:right="1134" w:bottom="1134" w:left="1701" w:header="720" w:footer="720" w:gutter="0"/>
       <w:cols w:space="720"/>
       <w:docGrid w:linePitch="360"/>
     </w:sectPr>

</xml_diff>

<commit_message>
fix(export): parser Markdown inline (*itálico*, **negrito**, `código`) no DOCX
</commit_message>
<xml_diff>
--- a/rene_estevam_deckers_atividade_2.docx
+++ b/rene_estevam_deckers_atividade_2.docx
@@ -27,6 +27,7 @@
         <w:rPr>
           <w:rFonts w:ascii="Times New Roman" w:hAnsi="Times New Roman" w:eastAsia="Times New Roman" w:cs="Times New Roman"/>
           <w:b/>
+          <w:i w:val="0"/>
           <w:sz w:val="24"/>
         </w:rPr>
         <w:t>Disciplina:</w:t>
@@ -34,6 +35,8 @@
       <w:r>
         <w:rPr>
           <w:rFonts w:ascii="Times New Roman" w:hAnsi="Times New Roman" w:eastAsia="Times New Roman" w:cs="Times New Roman"/>
+          <w:b w:val="0"/>
+          <w:i w:val="0"/>
           <w:sz w:val="24"/>
         </w:rPr>
         <w:t xml:space="preserve"> Introdução ao Machine Learning</w:t>
@@ -49,6 +52,7 @@
         <w:rPr>
           <w:rFonts w:ascii="Times New Roman" w:hAnsi="Times New Roman" w:eastAsia="Times New Roman" w:cs="Times New Roman"/>
           <w:b/>
+          <w:i w:val="0"/>
           <w:sz w:val="24"/>
         </w:rPr>
         <w:t>Curso:</w:t>
@@ -56,6 +60,8 @@
       <w:r>
         <w:rPr>
           <w:rFonts w:ascii="Times New Roman" w:hAnsi="Times New Roman" w:eastAsia="Times New Roman" w:cs="Times New Roman"/>
+          <w:b w:val="0"/>
+          <w:i w:val="0"/>
           <w:sz w:val="24"/>
         </w:rPr>
         <w:t xml:space="preserve"> Mestrado em Administração Pública</w:t>
@@ -71,6 +77,7 @@
         <w:rPr>
           <w:rFonts w:ascii="Times New Roman" w:hAnsi="Times New Roman" w:eastAsia="Times New Roman" w:cs="Times New Roman"/>
           <w:b/>
+          <w:i w:val="0"/>
           <w:sz w:val="24"/>
         </w:rPr>
         <w:t>Área de concentração:</w:t>
@@ -78,6 +85,8 @@
       <w:r>
         <w:rPr>
           <w:rFonts w:ascii="Times New Roman" w:hAnsi="Times New Roman" w:eastAsia="Times New Roman" w:cs="Times New Roman"/>
+          <w:b w:val="0"/>
+          <w:i w:val="0"/>
           <w:sz w:val="24"/>
         </w:rPr>
         <w:t xml:space="preserve"> Ciência de Dados e Inteligência Artificial</w:t>
@@ -93,6 +102,7 @@
         <w:rPr>
           <w:rFonts w:ascii="Times New Roman" w:hAnsi="Times New Roman" w:eastAsia="Times New Roman" w:cs="Times New Roman"/>
           <w:b/>
+          <w:i w:val="0"/>
           <w:sz w:val="24"/>
         </w:rPr>
         <w:t>Docente responsável:</w:t>
@@ -100,6 +110,8 @@
       <w:r>
         <w:rPr>
           <w:rFonts w:ascii="Times New Roman" w:hAnsi="Times New Roman" w:eastAsia="Times New Roman" w:cs="Times New Roman"/>
+          <w:b w:val="0"/>
+          <w:i w:val="0"/>
           <w:sz w:val="24"/>
         </w:rPr>
         <w:t xml:space="preserve"> Roberta Moreira Wichmann</w:t>
@@ -115,6 +127,7 @@
         <w:rPr>
           <w:rFonts w:ascii="Times New Roman" w:hAnsi="Times New Roman" w:eastAsia="Times New Roman" w:cs="Times New Roman"/>
           <w:b/>
+          <w:i w:val="0"/>
           <w:sz w:val="24"/>
         </w:rPr>
         <w:t>Ano e bimestre de referência:</w:t>
@@ -122,6 +135,8 @@
       <w:r>
         <w:rPr>
           <w:rFonts w:ascii="Times New Roman" w:hAnsi="Times New Roman" w:eastAsia="Times New Roman" w:cs="Times New Roman"/>
+          <w:b w:val="0"/>
+          <w:i w:val="0"/>
           <w:sz w:val="24"/>
         </w:rPr>
         <w:t xml:space="preserve"> 2026/1</w:t>
@@ -137,6 +152,7 @@
         <w:rPr>
           <w:rFonts w:ascii="Times New Roman" w:hAnsi="Times New Roman" w:eastAsia="Times New Roman" w:cs="Times New Roman"/>
           <w:b/>
+          <w:i w:val="0"/>
           <w:sz w:val="24"/>
         </w:rPr>
         <w:t>Título do projeto:</w:t>
@@ -144,6 +160,8 @@
       <w:r>
         <w:rPr>
           <w:rFonts w:ascii="Times New Roman" w:hAnsi="Times New Roman" w:eastAsia="Times New Roman" w:cs="Times New Roman"/>
+          <w:b w:val="0"/>
+          <w:i w:val="0"/>
           <w:sz w:val="24"/>
         </w:rPr>
         <w:t xml:space="preserve"> Previsão de despesas em diárias e passagens com dados do SCDP</w:t>
@@ -159,6 +177,7 @@
         <w:rPr>
           <w:rFonts w:ascii="Times New Roman" w:hAnsi="Times New Roman" w:eastAsia="Times New Roman" w:cs="Times New Roman"/>
           <w:b/>
+          <w:i w:val="0"/>
           <w:sz w:val="24"/>
         </w:rPr>
         <w:t>Autores:</w:t>
@@ -166,6 +185,8 @@
       <w:r>
         <w:rPr>
           <w:rFonts w:ascii="Times New Roman" w:hAnsi="Times New Roman" w:eastAsia="Times New Roman" w:cs="Times New Roman"/>
+          <w:b w:val="0"/>
+          <w:i w:val="0"/>
           <w:sz w:val="24"/>
         </w:rPr>
         <w:t xml:space="preserve"> Renê Estevam; Rodrigo Costa; Liandro Silva</w:t>
@@ -195,14 +216,35 @@
       <w:r>
         <w:rPr>
           <w:rFonts w:ascii="Times New Roman" w:hAnsi="Times New Roman" w:eastAsia="Times New Roman" w:cs="Times New Roman"/>
-          <w:sz w:val="24"/>
-        </w:rPr>
-        <w:t xml:space="preserve">A modelagem está descrita no notebook *rene_estevam_deckers_atividade_2.ipynb*; este ficheiro é o relatório em texto. Os dados são do conjunto </w:t>
+          <w:b w:val="0"/>
+          <w:i w:val="0"/>
+          <w:sz w:val="24"/>
+        </w:rPr>
+        <w:t xml:space="preserve">A modelagem está descrita no notebook </w:t>
+      </w:r>
+      <w:r>
+        <w:rPr>
+          <w:rFonts w:ascii="Times New Roman" w:hAnsi="Times New Roman" w:eastAsia="Times New Roman" w:cs="Times New Roman"/>
+          <w:b w:val="0"/>
+          <w:i/>
+          <w:sz w:val="24"/>
+        </w:rPr>
+        <w:t>rene_estevam_deckers_atividade_2.ipynb</w:t>
+      </w:r>
+      <w:r>
+        <w:rPr>
+          <w:rFonts w:ascii="Times New Roman" w:hAnsi="Times New Roman" w:eastAsia="Times New Roman" w:cs="Times New Roman"/>
+          <w:b w:val="0"/>
+          <w:i w:val="0"/>
+          <w:sz w:val="24"/>
+        </w:rPr>
+        <w:t xml:space="preserve">; este ficheiro é o relatório em texto. Os dados são do conjunto </w:t>
       </w:r>
       <w:r>
         <w:rPr>
           <w:rFonts w:ascii="Times New Roman" w:hAnsi="Times New Roman" w:eastAsia="Times New Roman" w:cs="Times New Roman"/>
           <w:b/>
+          <w:i w:val="0"/>
           <w:sz w:val="24"/>
         </w:rPr>
         <w:t>Viagens a Serviço do Governo Federal (SCDP)</w:t>
@@ -210,13 +252,35 @@
       <w:r>
         <w:rPr>
           <w:rFonts w:ascii="Times New Roman" w:hAnsi="Times New Roman" w:eastAsia="Times New Roman" w:cs="Times New Roman"/>
-          <w:sz w:val="24"/>
-        </w:rPr>
-        <w:t xml:space="preserve"> (dados.gov.br (https://dados.gov.br/dados/conjuntos-dados/viagens-a-servico-do-governo-federal-scdp)), no mesmo tipo de CSV já trabalhado na Atividade 1 (*rene_estevam_deckers.ipynb*), por exemplo </w:t>
+          <w:b w:val="0"/>
+          <w:i w:val="0"/>
+          <w:sz w:val="24"/>
+        </w:rPr>
+        <w:t xml:space="preserve"> (dados.gov.br (https://dados.gov.br/dados/conjuntos-dados/viagens-a-servico-do-governo-federal-scdp)), no mesmo tipo de CSV já trabalhado na Atividade 1 (</w:t>
+      </w:r>
+      <w:r>
+        <w:rPr>
+          <w:rFonts w:ascii="Times New Roman" w:hAnsi="Times New Roman" w:eastAsia="Times New Roman" w:cs="Times New Roman"/>
+          <w:b w:val="0"/>
+          <w:i/>
+          <w:sz w:val="24"/>
+        </w:rPr>
+        <w:t>rene_estevam_deckers.ipynb</w:t>
+      </w:r>
+      <w:r>
+        <w:rPr>
+          <w:rFonts w:ascii="Times New Roman" w:hAnsi="Times New Roman" w:eastAsia="Times New Roman" w:cs="Times New Roman"/>
+          <w:b w:val="0"/>
+          <w:i w:val="0"/>
+          <w:sz w:val="24"/>
+        </w:rPr>
+        <w:t xml:space="preserve">), por exemplo </w:t>
       </w:r>
       <w:r>
         <w:rPr>
           <w:rFonts w:ascii="Courier New" w:hAnsi="Courier New"/>
+          <w:b w:val="0"/>
+          <w:i w:val="0"/>
           <w:sz w:val="22"/>
         </w:rPr>
         <w:t>base_rene_estevam_deckers.csv</w:t>
@@ -224,6 +288,8 @@
       <w:r>
         <w:rPr>
           <w:rFonts w:ascii="Times New Roman" w:hAnsi="Times New Roman" w:eastAsia="Times New Roman" w:cs="Times New Roman"/>
+          <w:b w:val="0"/>
+          <w:i w:val="0"/>
           <w:sz w:val="24"/>
         </w:rPr>
         <w:t>.</w:t>
@@ -238,6 +304,8 @@
       <w:r>
         <w:rPr>
           <w:rFonts w:ascii="Times New Roman" w:hAnsi="Times New Roman" w:eastAsia="Times New Roman" w:cs="Times New Roman"/>
+          <w:b w:val="0"/>
+          <w:i w:val="0"/>
           <w:sz w:val="24"/>
         </w:rPr>
         <w:t>Cada linha corresponde a um trecho de viagem ou a um lançamento (órgão, unidade gestora, datas, motivo, valores de diárias e de passagem, meio de transporte, origem e destino, entre outros campos). Uma viagem pode aparecer em mais do que uma linha. O foco é explorar padrões de gasto e apoiar a leitura dos custos, sem pretender substituir normas orçamentárias nem decisões administrativas.</w:t>
@@ -252,6 +320,8 @@
       <w:r>
         <w:rPr>
           <w:rFonts w:ascii="Times New Roman" w:hAnsi="Times New Roman" w:eastAsia="Times New Roman" w:cs="Times New Roman"/>
+          <w:b w:val="0"/>
+          <w:i w:val="0"/>
           <w:sz w:val="24"/>
         </w:rPr>
         <w:t xml:space="preserve">O problema abordado é de </w:t>
@@ -260,6 +330,7 @@
         <w:rPr>
           <w:rFonts w:ascii="Times New Roman" w:hAnsi="Times New Roman" w:eastAsia="Times New Roman" w:cs="Times New Roman"/>
           <w:b/>
+          <w:i w:val="0"/>
           <w:sz w:val="24"/>
         </w:rPr>
         <w:t>regressão</w:t>
@@ -267,6 +338,8 @@
       <w:r>
         <w:rPr>
           <w:rFonts w:ascii="Times New Roman" w:hAnsi="Times New Roman" w:eastAsia="Times New Roman" w:cs="Times New Roman"/>
+          <w:b w:val="0"/>
+          <w:i w:val="0"/>
           <w:sz w:val="24"/>
         </w:rPr>
         <w:t xml:space="preserve">: estimar o </w:t>
@@ -275,6 +348,7 @@
         <w:rPr>
           <w:rFonts w:ascii="Times New Roman" w:hAnsi="Times New Roman" w:eastAsia="Times New Roman" w:cs="Times New Roman"/>
           <w:b/>
+          <w:i w:val="0"/>
           <w:sz w:val="24"/>
         </w:rPr>
         <w:t>valor total da despesa</w:t>
@@ -282,6 +356,8 @@
       <w:r>
         <w:rPr>
           <w:rFonts w:ascii="Times New Roman" w:hAnsi="Times New Roman" w:eastAsia="Times New Roman" w:cs="Times New Roman"/>
+          <w:b w:val="0"/>
+          <w:i w:val="0"/>
           <w:sz w:val="24"/>
         </w:rPr>
         <w:t xml:space="preserve"> em R$ com base nas outras variáveis do registo. No código, o alvo está em </w:t>
@@ -289,6 +365,8 @@
       <w:r>
         <w:rPr>
           <w:rFonts w:ascii="Courier New" w:hAnsi="Courier New"/>
+          <w:b w:val="0"/>
+          <w:i w:val="0"/>
           <w:sz w:val="22"/>
         </w:rPr>
         <w:t>valor_total_num</w:t>
@@ -296,6 +374,8 @@
       <w:r>
         <w:rPr>
           <w:rFonts w:ascii="Times New Roman" w:hAnsi="Times New Roman" w:eastAsia="Times New Roman" w:cs="Times New Roman"/>
+          <w:b w:val="0"/>
+          <w:i w:val="0"/>
           <w:sz w:val="24"/>
         </w:rPr>
         <w:t xml:space="preserve">. A descrição das 23 variáveis mantém-se no </w:t>
@@ -303,6 +383,8 @@
       <w:r>
         <w:rPr>
           <w:rFonts w:ascii="Courier New" w:hAnsi="Courier New"/>
+          <w:b w:val="0"/>
+          <w:i w:val="0"/>
           <w:sz w:val="22"/>
         </w:rPr>
         <w:t>dicionario_rene_estevam_deckers.xlsx</w:t>
@@ -310,6 +392,8 @@
       <w:r>
         <w:rPr>
           <w:rFonts w:ascii="Times New Roman" w:hAnsi="Times New Roman" w:eastAsia="Times New Roman" w:cs="Times New Roman"/>
+          <w:b w:val="0"/>
+          <w:i w:val="0"/>
           <w:sz w:val="24"/>
         </w:rPr>
         <w:t xml:space="preserve"> da primeira entrega.</w:t>
@@ -324,6 +408,8 @@
       <w:r>
         <w:rPr>
           <w:rFonts w:ascii="Times New Roman" w:hAnsi="Times New Roman" w:eastAsia="Times New Roman" w:cs="Times New Roman"/>
+          <w:b w:val="0"/>
+          <w:i w:val="0"/>
           <w:sz w:val="24"/>
         </w:rPr>
         <w:t>Na construção das preditoras (</w:t>
@@ -331,6 +417,8 @@
       <w:r>
         <w:rPr>
           <w:rFonts w:ascii="Courier New" w:hAnsi="Courier New"/>
+          <w:b w:val="0"/>
+          <w:i w:val="0"/>
           <w:sz w:val="22"/>
         </w:rPr>
         <w:t>X</w:t>
@@ -338,6 +426,8 @@
       <w:r>
         <w:rPr>
           <w:rFonts w:ascii="Times New Roman" w:hAnsi="Times New Roman" w:eastAsia="Times New Roman" w:cs="Times New Roman"/>
+          <w:b w:val="0"/>
+          <w:i w:val="0"/>
           <w:sz w:val="24"/>
         </w:rPr>
         <w:t xml:space="preserve">), retirámos parcelas monetárias que, na mesma linha, entram no </w:t>
@@ -346,6 +436,7 @@
         <w:rPr>
           <w:rFonts w:ascii="Times New Roman" w:hAnsi="Times New Roman" w:eastAsia="Times New Roman" w:cs="Times New Roman"/>
           <w:b/>
+          <w:i w:val="0"/>
           <w:sz w:val="24"/>
         </w:rPr>
         <w:t>Valor total</w:t>
@@ -353,6 +444,8 @@
       <w:r>
         <w:rPr>
           <w:rFonts w:ascii="Times New Roman" w:hAnsi="Times New Roman" w:eastAsia="Times New Roman" w:cs="Times New Roman"/>
+          <w:b w:val="0"/>
+          <w:i w:val="0"/>
           <w:sz w:val="24"/>
         </w:rPr>
         <w:t xml:space="preserve"> (</w:t>
@@ -361,6 +454,7 @@
         <w:rPr>
           <w:rFonts w:ascii="Times New Roman" w:hAnsi="Times New Roman" w:eastAsia="Times New Roman" w:cs="Times New Roman"/>
           <w:b/>
+          <w:i w:val="0"/>
           <w:sz w:val="24"/>
         </w:rPr>
         <w:t>Valor diárias</w:t>
@@ -368,6 +462,8 @@
       <w:r>
         <w:rPr>
           <w:rFonts w:ascii="Times New Roman" w:hAnsi="Times New Roman" w:eastAsia="Times New Roman" w:cs="Times New Roman"/>
+          <w:b w:val="0"/>
+          <w:i w:val="0"/>
           <w:sz w:val="24"/>
         </w:rPr>
         <w:t xml:space="preserve">, </w:t>
@@ -376,6 +472,7 @@
         <w:rPr>
           <w:rFonts w:ascii="Times New Roman" w:hAnsi="Times New Roman" w:eastAsia="Times New Roman" w:cs="Times New Roman"/>
           <w:b/>
+          <w:i w:val="0"/>
           <w:sz w:val="24"/>
         </w:rPr>
         <w:t>Valor passagem</w:t>
@@ -383,9 +480,47 @@
       <w:r>
         <w:rPr>
           <w:rFonts w:ascii="Times New Roman" w:hAnsi="Times New Roman" w:eastAsia="Times New Roman" w:cs="Times New Roman"/>
-          <w:sz w:val="24"/>
-        </w:rPr>
-        <w:t>) e evitámos repetir o alvo na forma textual do total, para reduzir *data leakage*. Se essas parcelas entrassem como *features*, o modelo aproximava-se de reconstruir o próprio total em vez de aprender a relação com as características da viagem.</w:t>
+          <w:b w:val="0"/>
+          <w:i w:val="0"/>
+          <w:sz w:val="24"/>
+        </w:rPr>
+        <w:t xml:space="preserve">) e evitámos repetir o alvo na forma textual do total, para reduzir </w:t>
+      </w:r>
+      <w:r>
+        <w:rPr>
+          <w:rFonts w:ascii="Times New Roman" w:hAnsi="Times New Roman" w:eastAsia="Times New Roman" w:cs="Times New Roman"/>
+          <w:b w:val="0"/>
+          <w:i/>
+          <w:sz w:val="24"/>
+        </w:rPr>
+        <w:t>data leakage</w:t>
+      </w:r>
+      <w:r>
+        <w:rPr>
+          <w:rFonts w:ascii="Times New Roman" w:hAnsi="Times New Roman" w:eastAsia="Times New Roman" w:cs="Times New Roman"/>
+          <w:b w:val="0"/>
+          <w:i w:val="0"/>
+          <w:sz w:val="24"/>
+        </w:rPr>
+        <w:t xml:space="preserve">. Se essas parcelas entrassem como </w:t>
+      </w:r>
+      <w:r>
+        <w:rPr>
+          <w:rFonts w:ascii="Times New Roman" w:hAnsi="Times New Roman" w:eastAsia="Times New Roman" w:cs="Times New Roman"/>
+          <w:b w:val="0"/>
+          <w:i/>
+          <w:sz w:val="24"/>
+        </w:rPr>
+        <w:t>features</w:t>
+      </w:r>
+      <w:r>
+        <w:rPr>
+          <w:rFonts w:ascii="Times New Roman" w:hAnsi="Times New Roman" w:eastAsia="Times New Roman" w:cs="Times New Roman"/>
+          <w:b w:val="0"/>
+          <w:i w:val="0"/>
+          <w:sz w:val="24"/>
+        </w:rPr>
+        <w:t>, o modelo aproximava-se de reconstruir o próprio total em vez de aprender a relação com as características da viagem.</w:t>
       </w:r>
     </w:p>
     <w:p>
@@ -412,9 +547,29 @@
       <w:r>
         <w:rPr>
           <w:rFonts w:ascii="Times New Roman" w:hAnsi="Times New Roman" w:eastAsia="Times New Roman" w:cs="Times New Roman"/>
-          <w:sz w:val="24"/>
-        </w:rPr>
-        <w:t>No *rene_estevam_deckers_atividade_2.ipynb* percorremos, passo a passo, análise descritiva inicial, divisão treino/teste, pré-processamento, escolha e comparação de modelos, métricas, ajuste de hiperparâmetros e avaliação final no conjunto de teste. O que segue resume as decisões principais; o código e as figuras completas ficam no notebook.</w:t>
+          <w:b w:val="0"/>
+          <w:i w:val="0"/>
+          <w:sz w:val="24"/>
+        </w:rPr>
+        <w:t xml:space="preserve">No </w:t>
+      </w:r>
+      <w:r>
+        <w:rPr>
+          <w:rFonts w:ascii="Times New Roman" w:hAnsi="Times New Roman" w:eastAsia="Times New Roman" w:cs="Times New Roman"/>
+          <w:b w:val="0"/>
+          <w:i/>
+          <w:sz w:val="24"/>
+        </w:rPr>
+        <w:t>rene_estevam_deckers_atividade_2.ipynb</w:t>
+      </w:r>
+      <w:r>
+        <w:rPr>
+          <w:rFonts w:ascii="Times New Roman" w:hAnsi="Times New Roman" w:eastAsia="Times New Roman" w:cs="Times New Roman"/>
+          <w:b w:val="0"/>
+          <w:i w:val="0"/>
+          <w:sz w:val="24"/>
+        </w:rPr>
+        <w:t xml:space="preserve"> percorremos, passo a passo, análise descritiva inicial, divisão treino/teste, pré-processamento, escolha e comparação de modelos, métricas, ajuste de hiperparâmetros e avaliação final no conjunto de teste. O que segue resume as decisões principais; o código e as figuras completas ficam no notebook.</w:t>
       </w:r>
     </w:p>
     <w:p>
@@ -441,6 +596,8 @@
       <w:r>
         <w:rPr>
           <w:rFonts w:ascii="Times New Roman" w:hAnsi="Times New Roman" w:eastAsia="Times New Roman" w:cs="Times New Roman"/>
+          <w:b w:val="0"/>
+          <w:i w:val="0"/>
           <w:sz w:val="24"/>
         </w:rPr>
         <w:t xml:space="preserve">Reutilizámos a preparação da </w:t>
@@ -449,6 +606,7 @@
         <w:rPr>
           <w:rFonts w:ascii="Times New Roman" w:hAnsi="Times New Roman" w:eastAsia="Times New Roman" w:cs="Times New Roman"/>
           <w:b/>
+          <w:i w:val="0"/>
           <w:sz w:val="24"/>
         </w:rPr>
         <w:t>Atividade 1</w:t>
@@ -456,14 +614,53 @@
       <w:r>
         <w:rPr>
           <w:rFonts w:ascii="Times New Roman" w:hAnsi="Times New Roman" w:eastAsia="Times New Roman" w:cs="Times New Roman"/>
-          <w:sz w:val="24"/>
-        </w:rPr>
-        <w:t xml:space="preserve"> (*rene_estevam_deckers.ipynb*): importação do CSV, remoção de duplicatas e conversão para número dos campos de valores e de *Número diárias*, para permitir estatísticas e gráficos coerentes. O conjunto final tem </w:t>
+          <w:b w:val="0"/>
+          <w:i w:val="0"/>
+          <w:sz w:val="24"/>
+        </w:rPr>
+        <w:t xml:space="preserve"> (</w:t>
+      </w:r>
+      <w:r>
+        <w:rPr>
+          <w:rFonts w:ascii="Times New Roman" w:hAnsi="Times New Roman" w:eastAsia="Times New Roman" w:cs="Times New Roman"/>
+          <w:b w:val="0"/>
+          <w:i/>
+          <w:sz w:val="24"/>
+        </w:rPr>
+        <w:t>rene_estevam_deckers.ipynb</w:t>
+      </w:r>
+      <w:r>
+        <w:rPr>
+          <w:rFonts w:ascii="Times New Roman" w:hAnsi="Times New Roman" w:eastAsia="Times New Roman" w:cs="Times New Roman"/>
+          <w:b w:val="0"/>
+          <w:i w:val="0"/>
+          <w:sz w:val="24"/>
+        </w:rPr>
+        <w:t xml:space="preserve">): importação do CSV, remoção de duplicatas e conversão para número dos campos de valores e de </w:t>
+      </w:r>
+      <w:r>
+        <w:rPr>
+          <w:rFonts w:ascii="Times New Roman" w:hAnsi="Times New Roman" w:eastAsia="Times New Roman" w:cs="Times New Roman"/>
+          <w:b w:val="0"/>
+          <w:i/>
+          <w:sz w:val="24"/>
+        </w:rPr>
+        <w:t>Número diárias</w:t>
+      </w:r>
+      <w:r>
+        <w:rPr>
+          <w:rFonts w:ascii="Times New Roman" w:hAnsi="Times New Roman" w:eastAsia="Times New Roman" w:cs="Times New Roman"/>
+          <w:b w:val="0"/>
+          <w:i w:val="0"/>
+          <w:sz w:val="24"/>
+        </w:rPr>
+        <w:t xml:space="preserve">, para permitir estatísticas e gráficos coerentes. O conjunto final tem </w:t>
       </w:r>
       <w:r>
         <w:rPr>
           <w:rFonts w:ascii="Times New Roman" w:hAnsi="Times New Roman" w:eastAsia="Times New Roman" w:cs="Times New Roman"/>
           <w:b/>
+          <w:i w:val="0"/>
           <w:sz w:val="24"/>
         </w:rPr>
         <w:t>cerca de 2,2 milhões</w:t>
@@ -471,6 +668,8 @@
       <w:r>
         <w:rPr>
           <w:rFonts w:ascii="Times New Roman" w:hAnsi="Times New Roman" w:eastAsia="Times New Roman" w:cs="Times New Roman"/>
+          <w:b w:val="0"/>
+          <w:i w:val="0"/>
           <w:sz w:val="24"/>
         </w:rPr>
         <w:t xml:space="preserve"> de registos.</w:t>
@@ -485,6 +684,8 @@
       <w:r>
         <w:rPr>
           <w:rFonts w:ascii="Times New Roman" w:hAnsi="Times New Roman" w:eastAsia="Times New Roman" w:cs="Times New Roman"/>
+          <w:b w:val="0"/>
+          <w:i w:val="0"/>
           <w:sz w:val="24"/>
         </w:rPr>
         <w:t xml:space="preserve">O </w:t>
@@ -493,6 +694,7 @@
         <w:rPr>
           <w:rFonts w:ascii="Times New Roman" w:hAnsi="Times New Roman" w:eastAsia="Times New Roman" w:cs="Times New Roman"/>
           <w:b/>
+          <w:i w:val="0"/>
           <w:sz w:val="24"/>
         </w:rPr>
         <w:t>Valor total</w:t>
@@ -500,6 +702,8 @@
       <w:r>
         <w:rPr>
           <w:rFonts w:ascii="Times New Roman" w:hAnsi="Times New Roman" w:eastAsia="Times New Roman" w:cs="Times New Roman"/>
+          <w:b w:val="0"/>
+          <w:i w:val="0"/>
           <w:sz w:val="24"/>
         </w:rPr>
         <w:t xml:space="preserve"> (alvo) é assimétrico à direita (média acima da mediana, cauda longa), o que faz com que erros grandes pesem mais em métricas quadráticas. O </w:t>
@@ -508,6 +712,7 @@
         <w:rPr>
           <w:rFonts w:ascii="Times New Roman" w:hAnsi="Times New Roman" w:eastAsia="Times New Roman" w:cs="Times New Roman"/>
           <w:b/>
+          <w:i w:val="0"/>
           <w:sz w:val="24"/>
         </w:rPr>
         <w:t>Valor passagem</w:t>
@@ -515,6 +720,8 @@
       <w:r>
         <w:rPr>
           <w:rFonts w:ascii="Times New Roman" w:hAnsi="Times New Roman" w:eastAsia="Times New Roman" w:cs="Times New Roman"/>
+          <w:b w:val="0"/>
+          <w:i w:val="0"/>
           <w:sz w:val="24"/>
         </w:rPr>
         <w:t xml:space="preserve"> mistura muitos zeros, valores positivos e, por vezes, valores negativos ligados a ajustes. Em </w:t>
@@ -523,6 +730,7 @@
         <w:rPr>
           <w:rFonts w:ascii="Times New Roman" w:hAnsi="Times New Roman" w:eastAsia="Times New Roman" w:cs="Times New Roman"/>
           <w:b/>
+          <w:i w:val="0"/>
           <w:sz w:val="24"/>
         </w:rPr>
         <w:t>Município</w:t>
@@ -530,6 +738,8 @@
       <w:r>
         <w:rPr>
           <w:rFonts w:ascii="Times New Roman" w:hAnsi="Times New Roman" w:eastAsia="Times New Roman" w:cs="Times New Roman"/>
+          <w:b w:val="0"/>
+          <w:i w:val="0"/>
           <w:sz w:val="24"/>
         </w:rPr>
         <w:t xml:space="preserve">, </w:t>
@@ -538,6 +748,7 @@
         <w:rPr>
           <w:rFonts w:ascii="Times New Roman" w:hAnsi="Times New Roman" w:eastAsia="Times New Roman" w:cs="Times New Roman"/>
           <w:b/>
+          <w:i w:val="0"/>
           <w:sz w:val="24"/>
         </w:rPr>
         <w:t>UF</w:t>
@@ -545,6 +756,8 @@
       <w:r>
         <w:rPr>
           <w:rFonts w:ascii="Times New Roman" w:hAnsi="Times New Roman" w:eastAsia="Times New Roman" w:cs="Times New Roman"/>
+          <w:b w:val="0"/>
+          <w:i w:val="0"/>
           <w:sz w:val="24"/>
         </w:rPr>
         <w:t xml:space="preserve"> e </w:t>
@@ -553,6 +766,7 @@
         <w:rPr>
           <w:rFonts w:ascii="Times New Roman" w:hAnsi="Times New Roman" w:eastAsia="Times New Roman" w:cs="Times New Roman"/>
           <w:b/>
+          <w:i w:val="0"/>
           <w:sz w:val="24"/>
         </w:rPr>
         <w:t>categoria de passagem</w:t>
@@ -560,9 +774,65 @@
       <w:r>
         <w:rPr>
           <w:rFonts w:ascii="Times New Roman" w:hAnsi="Times New Roman" w:eastAsia="Times New Roman" w:cs="Times New Roman"/>
-          <w:sz w:val="24"/>
-        </w:rPr>
-        <w:t xml:space="preserve"> há muitos valores em falta; nos textos (*Cargo*, *Motivo*, *Meio de transporte*) foi preciso combinar imputação com codificação que não explodisse a dimensão.</w:t>
+          <w:b w:val="0"/>
+          <w:i w:val="0"/>
+          <w:sz w:val="24"/>
+        </w:rPr>
+        <w:t xml:space="preserve"> há muitos valores em falta; nos textos (</w:t>
+      </w:r>
+      <w:r>
+        <w:rPr>
+          <w:rFonts w:ascii="Times New Roman" w:hAnsi="Times New Roman" w:eastAsia="Times New Roman" w:cs="Times New Roman"/>
+          <w:b w:val="0"/>
+          <w:i/>
+          <w:sz w:val="24"/>
+        </w:rPr>
+        <w:t>Cargo</w:t>
+      </w:r>
+      <w:r>
+        <w:rPr>
+          <w:rFonts w:ascii="Times New Roman" w:hAnsi="Times New Roman" w:eastAsia="Times New Roman" w:cs="Times New Roman"/>
+          <w:b w:val="0"/>
+          <w:i w:val="0"/>
+          <w:sz w:val="24"/>
+        </w:rPr>
+        <w:t xml:space="preserve">, </w:t>
+      </w:r>
+      <w:r>
+        <w:rPr>
+          <w:rFonts w:ascii="Times New Roman" w:hAnsi="Times New Roman" w:eastAsia="Times New Roman" w:cs="Times New Roman"/>
+          <w:b w:val="0"/>
+          <w:i/>
+          <w:sz w:val="24"/>
+        </w:rPr>
+        <w:t>Motivo</w:t>
+      </w:r>
+      <w:r>
+        <w:rPr>
+          <w:rFonts w:ascii="Times New Roman" w:hAnsi="Times New Roman" w:eastAsia="Times New Roman" w:cs="Times New Roman"/>
+          <w:b w:val="0"/>
+          <w:i w:val="0"/>
+          <w:sz w:val="24"/>
+        </w:rPr>
+        <w:t xml:space="preserve">, </w:t>
+      </w:r>
+      <w:r>
+        <w:rPr>
+          <w:rFonts w:ascii="Times New Roman" w:hAnsi="Times New Roman" w:eastAsia="Times New Roman" w:cs="Times New Roman"/>
+          <w:b w:val="0"/>
+          <w:i/>
+          <w:sz w:val="24"/>
+        </w:rPr>
+        <w:t>Meio de transporte</w:t>
+      </w:r>
+      <w:r>
+        <w:rPr>
+          <w:rFonts w:ascii="Times New Roman" w:hAnsi="Times New Roman" w:eastAsia="Times New Roman" w:cs="Times New Roman"/>
+          <w:b w:val="0"/>
+          <w:i w:val="0"/>
+          <w:sz w:val="24"/>
+        </w:rPr>
+        <w:t>) foi preciso combinar imputação com codificação que não explodisse a dimensão.</w:t>
       </w:r>
     </w:p>
     <w:p>
@@ -574,6 +844,8 @@
       <w:r>
         <w:rPr>
           <w:rFonts w:ascii="Times New Roman" w:hAnsi="Times New Roman" w:eastAsia="Times New Roman" w:cs="Times New Roman"/>
+          <w:b w:val="0"/>
+          <w:i w:val="0"/>
           <w:sz w:val="24"/>
         </w:rPr>
         <w:t xml:space="preserve">Na correlação linear com o alvo, sobressaem a </w:t>
@@ -582,6 +854,7 @@
         <w:rPr>
           <w:rFonts w:ascii="Times New Roman" w:hAnsi="Times New Roman" w:eastAsia="Times New Roman" w:cs="Times New Roman"/>
           <w:b/>
+          <w:i w:val="0"/>
           <w:sz w:val="24"/>
         </w:rPr>
         <w:t>duração em dias</w:t>
@@ -589,6 +862,8 @@
       <w:r>
         <w:rPr>
           <w:rFonts w:ascii="Times New Roman" w:hAnsi="Times New Roman" w:eastAsia="Times New Roman" w:cs="Times New Roman"/>
+          <w:b w:val="0"/>
+          <w:i w:val="0"/>
           <w:sz w:val="24"/>
         </w:rPr>
         <w:t xml:space="preserve"> (intervalo entre datas de fim e de início), o </w:t>
@@ -597,6 +872,7 @@
         <w:rPr>
           <w:rFonts w:ascii="Times New Roman" w:hAnsi="Times New Roman" w:eastAsia="Times New Roman" w:cs="Times New Roman"/>
           <w:b/>
+          <w:i w:val="0"/>
           <w:sz w:val="24"/>
         </w:rPr>
         <w:t>número de diárias</w:t>
@@ -604,6 +880,8 @@
       <w:r>
         <w:rPr>
           <w:rFonts w:ascii="Times New Roman" w:hAnsi="Times New Roman" w:eastAsia="Times New Roman" w:cs="Times New Roman"/>
+          <w:b w:val="0"/>
+          <w:i w:val="0"/>
           <w:sz w:val="24"/>
         </w:rPr>
         <w:t xml:space="preserve"> e o </w:t>
@@ -612,6 +890,7 @@
         <w:rPr>
           <w:rFonts w:ascii="Times New Roman" w:hAnsi="Times New Roman" w:eastAsia="Times New Roman" w:cs="Times New Roman"/>
           <w:b/>
+          <w:i w:val="0"/>
           <w:sz w:val="24"/>
         </w:rPr>
         <w:t>valor monetário das diárias</w:t>
@@ -619,6 +898,8 @@
       <w:r>
         <w:rPr>
           <w:rFonts w:ascii="Times New Roman" w:hAnsi="Times New Roman" w:eastAsia="Times New Roman" w:cs="Times New Roman"/>
+          <w:b w:val="0"/>
+          <w:i w:val="0"/>
           <w:sz w:val="24"/>
         </w:rPr>
         <w:t>; estes dois últimos correlacionam bastante entre si, o que aperta modelos lineares simples sem regularização ou sem cuidado na escolha de variáveis. Os gráficos completos da descritiva estão na Atividade 1; aqui só retemos o que guiou a modelagem.</w:t>
@@ -648,6 +929,8 @@
       <w:r>
         <w:rPr>
           <w:rFonts w:ascii="Times New Roman" w:hAnsi="Times New Roman" w:eastAsia="Times New Roman" w:cs="Times New Roman"/>
+          <w:b w:val="0"/>
+          <w:i w:val="0"/>
           <w:sz w:val="24"/>
         </w:rPr>
         <w:t xml:space="preserve">Definimos </w:t>
@@ -656,6 +939,7 @@
         <w:rPr>
           <w:rFonts w:ascii="Times New Roman" w:hAnsi="Times New Roman" w:eastAsia="Times New Roman" w:cs="Times New Roman"/>
           <w:b/>
+          <w:i w:val="0"/>
           <w:sz w:val="24"/>
         </w:rPr>
         <w:t>80% treino / 20% teste</w:t>
@@ -663,6 +947,8 @@
       <w:r>
         <w:rPr>
           <w:rFonts w:ascii="Times New Roman" w:hAnsi="Times New Roman" w:eastAsia="Times New Roman" w:cs="Times New Roman"/>
+          <w:b w:val="0"/>
+          <w:i w:val="0"/>
           <w:sz w:val="24"/>
         </w:rPr>
         <w:t xml:space="preserve"> (</w:t>
@@ -670,6 +956,8 @@
       <w:r>
         <w:rPr>
           <w:rFonts w:ascii="Courier New" w:hAnsi="Courier New"/>
+          <w:b w:val="0"/>
+          <w:i w:val="0"/>
           <w:sz w:val="22"/>
         </w:rPr>
         <w:t>test_size=0.2</w:t>
@@ -677,21 +965,26 @@
       <w:r>
         <w:rPr>
           <w:rFonts w:ascii="Times New Roman" w:hAnsi="Times New Roman" w:eastAsia="Times New Roman" w:cs="Times New Roman"/>
+          <w:b w:val="0"/>
+          <w:i w:val="0"/>
           <w:sz w:val="24"/>
         </w:rPr>
         <w:t xml:space="preserve">) e fixámos </w:t>
       </w:r>
       <w:r>
         <w:rPr>
-          <w:rFonts w:ascii="Times New Roman" w:hAnsi="Times New Roman" w:eastAsia="Times New Roman" w:cs="Times New Roman"/>
+          <w:rFonts w:ascii="Courier New" w:hAnsi="Courier New"/>
           <w:b/>
-          <w:sz w:val="24"/>
-        </w:rPr>
-        <w:t>`random_state=42`</w:t>
-      </w:r>
-      <w:r>
-        <w:rPr>
-          <w:rFonts w:ascii="Times New Roman" w:hAnsi="Times New Roman" w:eastAsia="Times New Roman" w:cs="Times New Roman"/>
+          <w:i w:val="0"/>
+          <w:sz w:val="22"/>
+        </w:rPr>
+        <w:t>random_state=42</w:t>
+      </w:r>
+      <w:r>
+        <w:rPr>
+          <w:rFonts w:ascii="Times New Roman" w:hAnsi="Times New Roman" w:eastAsia="Times New Roman" w:cs="Times New Roman"/>
+          <w:b w:val="0"/>
+          <w:i w:val="0"/>
           <w:sz w:val="24"/>
         </w:rPr>
         <w:t xml:space="preserve"> para o resultado poder ser repetido ao correr o mesmo código.</w:t>
@@ -706,14 +999,35 @@
       <w:r>
         <w:rPr>
           <w:rFonts w:ascii="Times New Roman" w:hAnsi="Times New Roman" w:eastAsia="Times New Roman" w:cs="Times New Roman"/>
-          <w:sz w:val="24"/>
-        </w:rPr>
-        <w:t xml:space="preserve">Como o alvo é contínuo e muito assimétrico, um *split* puramente aleatório pode desequilibrar, por acaso, a mistura de valores baixos, médios e altos entre treino e teste. Por isso usámos </w:t>
+          <w:b w:val="0"/>
+          <w:i w:val="0"/>
+          <w:sz w:val="24"/>
+        </w:rPr>
+        <w:t xml:space="preserve">Como o alvo é contínuo e muito assimétrico, um </w:t>
+      </w:r>
+      <w:r>
+        <w:rPr>
+          <w:rFonts w:ascii="Times New Roman" w:hAnsi="Times New Roman" w:eastAsia="Times New Roman" w:cs="Times New Roman"/>
+          <w:b w:val="0"/>
+          <w:i/>
+          <w:sz w:val="24"/>
+        </w:rPr>
+        <w:t>split</w:t>
+      </w:r>
+      <w:r>
+        <w:rPr>
+          <w:rFonts w:ascii="Times New Roman" w:hAnsi="Times New Roman" w:eastAsia="Times New Roman" w:cs="Times New Roman"/>
+          <w:b w:val="0"/>
+          <w:i w:val="0"/>
+          <w:sz w:val="24"/>
+        </w:rPr>
+        <w:t xml:space="preserve"> puramente aleatório pode desequilibrar, por acaso, a mistura de valores baixos, médios e altos entre treino e teste. Por isso usámos </w:t>
       </w:r>
       <w:r>
         <w:rPr>
           <w:rFonts w:ascii="Times New Roman" w:hAnsi="Times New Roman" w:eastAsia="Times New Roman" w:cs="Times New Roman"/>
           <w:b/>
+          <w:i w:val="0"/>
           <w:sz w:val="24"/>
         </w:rPr>
         <w:t>estratificação por decis</w:t>
@@ -721,6 +1035,8 @@
       <w:r>
         <w:rPr>
           <w:rFonts w:ascii="Times New Roman" w:hAnsi="Times New Roman" w:eastAsia="Times New Roman" w:cs="Times New Roman"/>
+          <w:b w:val="0"/>
+          <w:i w:val="0"/>
           <w:sz w:val="24"/>
         </w:rPr>
         <w:t xml:space="preserve"> do alvo (</w:t>
@@ -728,6 +1044,8 @@
       <w:r>
         <w:rPr>
           <w:rFonts w:ascii="Courier New" w:hAnsi="Courier New"/>
+          <w:b w:val="0"/>
+          <w:i w:val="0"/>
           <w:sz w:val="22"/>
         </w:rPr>
         <w:t>pd.qcut</w:t>
@@ -735,6 +1053,8 @@
       <w:r>
         <w:rPr>
           <w:rFonts w:ascii="Times New Roman" w:hAnsi="Times New Roman" w:eastAsia="Times New Roman" w:cs="Times New Roman"/>
+          <w:b w:val="0"/>
+          <w:i w:val="0"/>
           <w:sz w:val="24"/>
         </w:rPr>
         <w:t xml:space="preserve">, com </w:t>
@@ -742,6 +1062,8 @@
       <w:r>
         <w:rPr>
           <w:rFonts w:ascii="Courier New" w:hAnsi="Courier New"/>
+          <w:b w:val="0"/>
+          <w:i w:val="0"/>
           <w:sz w:val="22"/>
         </w:rPr>
         <w:t>duplicates="drop"</w:t>
@@ -749,6 +1071,8 @@
       <w:r>
         <w:rPr>
           <w:rFonts w:ascii="Times New Roman" w:hAnsi="Times New Roman" w:eastAsia="Times New Roman" w:cs="Times New Roman"/>
+          <w:b w:val="0"/>
+          <w:i w:val="0"/>
           <w:sz w:val="24"/>
         </w:rPr>
         <w:t xml:space="preserve"> quando há empates nos quantis) e passámos essa etiqueta ao </w:t>
@@ -756,6 +1080,8 @@
       <w:r>
         <w:rPr>
           <w:rFonts w:ascii="Courier New" w:hAnsi="Courier New"/>
+          <w:b w:val="0"/>
+          <w:i w:val="0"/>
           <w:sz w:val="22"/>
         </w:rPr>
         <w:t>stratify</w:t>
@@ -763,6 +1089,8 @@
       <w:r>
         <w:rPr>
           <w:rFonts w:ascii="Times New Roman" w:hAnsi="Times New Roman" w:eastAsia="Times New Roman" w:cs="Times New Roman"/>
+          <w:b w:val="0"/>
+          <w:i w:val="0"/>
           <w:sz w:val="24"/>
         </w:rPr>
         <w:t xml:space="preserve"> de </w:t>
@@ -770,6 +1098,8 @@
       <w:r>
         <w:rPr>
           <w:rFonts w:ascii="Courier New" w:hAnsi="Courier New"/>
+          <w:b w:val="0"/>
+          <w:i w:val="0"/>
           <w:sz w:val="22"/>
         </w:rPr>
         <w:t>train_test_split</w:t>
@@ -777,6 +1107,8 @@
       <w:r>
         <w:rPr>
           <w:rFonts w:ascii="Times New Roman" w:hAnsi="Times New Roman" w:eastAsia="Times New Roman" w:cs="Times New Roman"/>
+          <w:b w:val="0"/>
+          <w:i w:val="0"/>
           <w:sz w:val="24"/>
         </w:rPr>
         <w:t>, para aproximar a distribuição do custo nos dois lados.</w:t>
@@ -791,6 +1123,8 @@
       <w:r>
         <w:rPr>
           <w:rFonts w:ascii="Times New Roman" w:hAnsi="Times New Roman" w:eastAsia="Times New Roman" w:cs="Times New Roman"/>
+          <w:b w:val="0"/>
+          <w:i w:val="0"/>
           <w:sz w:val="24"/>
         </w:rPr>
         <w:t xml:space="preserve">O conjunto de </w:t>
@@ -799,6 +1133,7 @@
         <w:rPr>
           <w:rFonts w:ascii="Times New Roman" w:hAnsi="Times New Roman" w:eastAsia="Times New Roman" w:cs="Times New Roman"/>
           <w:b/>
+          <w:i w:val="0"/>
           <w:sz w:val="24"/>
         </w:rPr>
         <w:t>teste</w:t>
@@ -806,6 +1141,8 @@
       <w:r>
         <w:rPr>
           <w:rFonts w:ascii="Times New Roman" w:hAnsi="Times New Roman" w:eastAsia="Times New Roman" w:cs="Times New Roman"/>
+          <w:b w:val="0"/>
+          <w:i w:val="0"/>
           <w:sz w:val="24"/>
         </w:rPr>
         <w:t xml:space="preserve"> não entra no </w:t>
@@ -813,6 +1150,8 @@
       <w:r>
         <w:rPr>
           <w:rFonts w:ascii="Courier New" w:hAnsi="Courier New"/>
+          <w:b w:val="0"/>
+          <w:i w:val="0"/>
           <w:sz w:val="22"/>
         </w:rPr>
         <w:t>fit</w:t>
@@ -820,6 +1159,8 @@
       <w:r>
         <w:rPr>
           <w:rFonts w:ascii="Times New Roman" w:hAnsi="Times New Roman" w:eastAsia="Times New Roman" w:cs="Times New Roman"/>
+          <w:b w:val="0"/>
+          <w:i w:val="0"/>
           <w:sz w:val="24"/>
         </w:rPr>
         <w:t xml:space="preserve"> do pré-processamento nem no treino dos modelos; serve só para a </w:t>
@@ -828,6 +1169,7 @@
         <w:rPr>
           <w:rFonts w:ascii="Times New Roman" w:hAnsi="Times New Roman" w:eastAsia="Times New Roman" w:cs="Times New Roman"/>
           <w:b/>
+          <w:i w:val="0"/>
           <w:sz w:val="24"/>
         </w:rPr>
         <w:t>avaliação final</w:t>
@@ -835,6 +1177,8 @@
       <w:r>
         <w:rPr>
           <w:rFonts w:ascii="Times New Roman" w:hAnsi="Times New Roman" w:eastAsia="Times New Roman" w:cs="Times New Roman"/>
+          <w:b w:val="0"/>
+          <w:i w:val="0"/>
           <w:sz w:val="24"/>
         </w:rPr>
         <w:t xml:space="preserve">. Linhas sem </w:t>
@@ -842,6 +1186,8 @@
       <w:r>
         <w:rPr>
           <w:rFonts w:ascii="Courier New" w:hAnsi="Courier New"/>
+          <w:b w:val="0"/>
+          <w:i w:val="0"/>
           <w:sz w:val="22"/>
         </w:rPr>
         <w:t>valor_total_num</w:t>
@@ -849,6 +1195,8 @@
       <w:r>
         <w:rPr>
           <w:rFonts w:ascii="Times New Roman" w:hAnsi="Times New Roman" w:eastAsia="Times New Roman" w:cs="Times New Roman"/>
+          <w:b w:val="0"/>
+          <w:i w:val="0"/>
           <w:sz w:val="24"/>
         </w:rPr>
         <w:t xml:space="preserve"> saem antes da divisão. Em </w:t>
@@ -856,6 +1204,8 @@
       <w:r>
         <w:rPr>
           <w:rFonts w:ascii="Courier New" w:hAnsi="Courier New"/>
+          <w:b w:val="0"/>
+          <w:i w:val="0"/>
           <w:sz w:val="22"/>
         </w:rPr>
         <w:t>X</w:t>
@@ -863,6 +1213,8 @@
       <w:r>
         <w:rPr>
           <w:rFonts w:ascii="Times New Roman" w:hAnsi="Times New Roman" w:eastAsia="Times New Roman" w:cs="Times New Roman"/>
+          <w:b w:val="0"/>
+          <w:i w:val="0"/>
           <w:sz w:val="24"/>
         </w:rPr>
         <w:t xml:space="preserve"> ficam as colunas úteis </w:t>
@@ -871,6 +1223,7 @@
         <w:rPr>
           <w:rFonts w:ascii="Times New Roman" w:hAnsi="Times New Roman" w:eastAsia="Times New Roman" w:cs="Times New Roman"/>
           <w:b/>
+          <w:i w:val="0"/>
           <w:sz w:val="24"/>
         </w:rPr>
         <w:t>exceto</w:t>
@@ -878,6 +1231,8 @@
       <w:r>
         <w:rPr>
           <w:rFonts w:ascii="Times New Roman" w:hAnsi="Times New Roman" w:eastAsia="Times New Roman" w:cs="Times New Roman"/>
+          <w:b w:val="0"/>
+          <w:i w:val="0"/>
           <w:sz w:val="24"/>
         </w:rPr>
         <w:t xml:space="preserve"> o alvo numérico e a coluna textual </w:t>
@@ -886,6 +1241,7 @@
         <w:rPr>
           <w:rFonts w:ascii="Times New Roman" w:hAnsi="Times New Roman" w:eastAsia="Times New Roman" w:cs="Times New Roman"/>
           <w:b/>
+          <w:i w:val="0"/>
           <w:sz w:val="24"/>
         </w:rPr>
         <w:t>Valor total</w:t>
@@ -893,6 +1249,8 @@
       <w:r>
         <w:rPr>
           <w:rFonts w:ascii="Times New Roman" w:hAnsi="Times New Roman" w:eastAsia="Times New Roman" w:cs="Times New Roman"/>
+          <w:b w:val="0"/>
+          <w:i w:val="0"/>
           <w:sz w:val="24"/>
         </w:rPr>
         <w:t>, quando existe.</w:t>
@@ -922,21 +1280,26 @@
       <w:r>
         <w:rPr>
           <w:rFonts w:ascii="Times New Roman" w:hAnsi="Times New Roman" w:eastAsia="Times New Roman" w:cs="Times New Roman"/>
+          <w:b w:val="0"/>
+          <w:i w:val="0"/>
           <w:sz w:val="24"/>
         </w:rPr>
         <w:t xml:space="preserve">Encaixámos pré-processamento e regressor num </w:t>
       </w:r>
       <w:r>
         <w:rPr>
-          <w:rFonts w:ascii="Times New Roman" w:hAnsi="Times New Roman" w:eastAsia="Times New Roman" w:cs="Times New Roman"/>
+          <w:rFonts w:ascii="Courier New" w:hAnsi="Courier New"/>
           <w:b/>
-          <w:sz w:val="24"/>
-        </w:rPr>
-        <w:t>`Pipeline`</w:t>
-      </w:r>
-      <w:r>
-        <w:rPr>
-          <w:rFonts w:ascii="Times New Roman" w:hAnsi="Times New Roman" w:eastAsia="Times New Roman" w:cs="Times New Roman"/>
+          <w:i w:val="0"/>
+          <w:sz w:val="22"/>
+        </w:rPr>
+        <w:t>Pipeline</w:t>
+      </w:r>
+      <w:r>
+        <w:rPr>
+          <w:rFonts w:ascii="Times New Roman" w:hAnsi="Times New Roman" w:eastAsia="Times New Roman" w:cs="Times New Roman"/>
+          <w:b w:val="0"/>
+          <w:i w:val="0"/>
           <w:sz w:val="24"/>
         </w:rPr>
         <w:t xml:space="preserve"> (</w:t>
@@ -944,6 +1307,8 @@
       <w:r>
         <w:rPr>
           <w:rFonts w:ascii="Courier New" w:hAnsi="Courier New"/>
+          <w:b w:val="0"/>
+          <w:i w:val="0"/>
           <w:sz w:val="22"/>
         </w:rPr>
         <w:t>ColumnTransformer</w:t>
@@ -951,14 +1316,35 @@
       <w:r>
         <w:rPr>
           <w:rFonts w:ascii="Times New Roman" w:hAnsi="Times New Roman" w:eastAsia="Times New Roman" w:cs="Times New Roman"/>
-          <w:sz w:val="24"/>
-        </w:rPr>
-        <w:t xml:space="preserve"> + modelo): medianas, modas, escalas e *one-hot* aprendem-se </w:t>
+          <w:b w:val="0"/>
+          <w:i w:val="0"/>
+          <w:sz w:val="24"/>
+        </w:rPr>
+        <w:t xml:space="preserve"> + modelo): medianas, modas, escalas e </w:t>
+      </w:r>
+      <w:r>
+        <w:rPr>
+          <w:rFonts w:ascii="Times New Roman" w:hAnsi="Times New Roman" w:eastAsia="Times New Roman" w:cs="Times New Roman"/>
+          <w:b w:val="0"/>
+          <w:i/>
+          <w:sz w:val="24"/>
+        </w:rPr>
+        <w:t>one-hot</w:t>
+      </w:r>
+      <w:r>
+        <w:rPr>
+          <w:rFonts w:ascii="Times New Roman" w:hAnsi="Times New Roman" w:eastAsia="Times New Roman" w:cs="Times New Roman"/>
+          <w:b w:val="0"/>
+          <w:i w:val="0"/>
+          <w:sz w:val="24"/>
+        </w:rPr>
+        <w:t xml:space="preserve"> aprendem-se </w:t>
       </w:r>
       <w:r>
         <w:rPr>
           <w:rFonts w:ascii="Times New Roman" w:hAnsi="Times New Roman" w:eastAsia="Times New Roman" w:cs="Times New Roman"/>
           <w:b/>
+          <w:i w:val="0"/>
           <w:sz w:val="24"/>
         </w:rPr>
         <w:t>só no treino</w:t>
@@ -966,6 +1352,8 @@
       <w:r>
         <w:rPr>
           <w:rFonts w:ascii="Times New Roman" w:hAnsi="Times New Roman" w:eastAsia="Times New Roman" w:cs="Times New Roman"/>
+          <w:b w:val="0"/>
+          <w:i w:val="0"/>
           <w:sz w:val="24"/>
         </w:rPr>
         <w:t xml:space="preserve"> e aplicam-se ao teste com </w:t>
@@ -973,6 +1361,8 @@
       <w:r>
         <w:rPr>
           <w:rFonts w:ascii="Courier New" w:hAnsi="Courier New"/>
+          <w:b w:val="0"/>
+          <w:i w:val="0"/>
           <w:sz w:val="22"/>
         </w:rPr>
         <w:t>transform</w:t>
@@ -980,9 +1370,29 @@
       <w:r>
         <w:rPr>
           <w:rFonts w:ascii="Times New Roman" w:hAnsi="Times New Roman" w:eastAsia="Times New Roman" w:cs="Times New Roman"/>
-          <w:sz w:val="24"/>
-        </w:rPr>
-        <w:t>, para não haver *data leakage* por estatísticas calculadas com linhas de avaliação.</w:t>
+          <w:b w:val="0"/>
+          <w:i w:val="0"/>
+          <w:sz w:val="24"/>
+        </w:rPr>
+        <w:t xml:space="preserve">, para não haver </w:t>
+      </w:r>
+      <w:r>
+        <w:rPr>
+          <w:rFonts w:ascii="Times New Roman" w:hAnsi="Times New Roman" w:eastAsia="Times New Roman" w:cs="Times New Roman"/>
+          <w:b w:val="0"/>
+          <w:i/>
+          <w:sz w:val="24"/>
+        </w:rPr>
+        <w:t>data leakage</w:t>
+      </w:r>
+      <w:r>
+        <w:rPr>
+          <w:rFonts w:ascii="Times New Roman" w:hAnsi="Times New Roman" w:eastAsia="Times New Roman" w:cs="Times New Roman"/>
+          <w:b w:val="0"/>
+          <w:i w:val="0"/>
+          <w:sz w:val="24"/>
+        </w:rPr>
+        <w:t xml:space="preserve"> por estatísticas calculadas com linhas de avaliação.</w:t>
       </w:r>
     </w:p>
     <w:p>
@@ -994,21 +1404,26 @@
       <w:r>
         <w:rPr>
           <w:rFonts w:ascii="Times New Roman" w:hAnsi="Times New Roman" w:eastAsia="Times New Roman" w:cs="Times New Roman"/>
+          <w:b w:val="0"/>
+          <w:i w:val="0"/>
           <w:sz w:val="24"/>
         </w:rPr>
         <w:t xml:space="preserve">Criámos </w:t>
       </w:r>
       <w:r>
         <w:rPr>
-          <w:rFonts w:ascii="Times New Roman" w:hAnsi="Times New Roman" w:eastAsia="Times New Roman" w:cs="Times New Roman"/>
+          <w:rFonts w:ascii="Courier New" w:hAnsi="Courier New"/>
           <w:b/>
-          <w:sz w:val="24"/>
-        </w:rPr>
-        <w:t>`duracao_dias`</w:t>
-      </w:r>
-      <w:r>
-        <w:rPr>
-          <w:rFonts w:ascii="Times New Roman" w:hAnsi="Times New Roman" w:eastAsia="Times New Roman" w:cs="Times New Roman"/>
+          <w:i w:val="0"/>
+          <w:sz w:val="22"/>
+        </w:rPr>
+        <w:t>duracao_dias</w:t>
+      </w:r>
+      <w:r>
+        <w:rPr>
+          <w:rFonts w:ascii="Times New Roman" w:hAnsi="Times New Roman" w:eastAsia="Times New Roman" w:cs="Times New Roman"/>
+          <w:b w:val="0"/>
+          <w:i w:val="0"/>
           <w:sz w:val="24"/>
         </w:rPr>
         <w:t xml:space="preserve"> entre a data de fim e a de início (negativos cortados a zero), alinhado ao que na Fase 1 já se observava em relação ao custo. Tirámos também colunas de datas e textos redundantes ou difíceis de tratar no </w:t>
@@ -1016,6 +1431,8 @@
       <w:r>
         <w:rPr>
           <w:rFonts w:ascii="Courier New" w:hAnsi="Courier New"/>
+          <w:b w:val="0"/>
+          <w:i w:val="0"/>
           <w:sz w:val="22"/>
         </w:rPr>
         <w:t>ColumnTransformer</w:t>
@@ -1023,6 +1440,8 @@
       <w:r>
         <w:rPr>
           <w:rFonts w:ascii="Times New Roman" w:hAnsi="Times New Roman" w:eastAsia="Times New Roman" w:cs="Times New Roman"/>
+          <w:b w:val="0"/>
+          <w:i w:val="0"/>
           <w:sz w:val="24"/>
         </w:rPr>
         <w:t>.</w:t>
@@ -1038,6 +1457,7 @@
         <w:rPr>
           <w:rFonts w:ascii="Times New Roman" w:hAnsi="Times New Roman" w:eastAsia="Times New Roman" w:cs="Times New Roman"/>
           <w:b/>
+          <w:i w:val="0"/>
           <w:sz w:val="24"/>
         </w:rPr>
         <w:t>Valor diárias</w:t>
@@ -1045,6 +1465,8 @@
       <w:r>
         <w:rPr>
           <w:rFonts w:ascii="Times New Roman" w:hAnsi="Times New Roman" w:eastAsia="Times New Roman" w:cs="Times New Roman"/>
+          <w:b w:val="0"/>
+          <w:i w:val="0"/>
           <w:sz w:val="24"/>
         </w:rPr>
         <w:t xml:space="preserve"> e </w:t>
@@ -1053,6 +1475,7 @@
         <w:rPr>
           <w:rFonts w:ascii="Times New Roman" w:hAnsi="Times New Roman" w:eastAsia="Times New Roman" w:cs="Times New Roman"/>
           <w:b/>
+          <w:i w:val="0"/>
           <w:sz w:val="24"/>
         </w:rPr>
         <w:t>Valor passagem</w:t>
@@ -1060,14 +1483,35 @@
       <w:r>
         <w:rPr>
           <w:rFonts w:ascii="Times New Roman" w:hAnsi="Times New Roman" w:eastAsia="Times New Roman" w:cs="Times New Roman"/>
-          <w:sz w:val="24"/>
-        </w:rPr>
-        <w:t xml:space="preserve"> ficam de fora das preditoras porque, na mesma linha, entram no total; usá-las como *features* chega perto de “copiar” o alvo. </w:t>
+          <w:b w:val="0"/>
+          <w:i w:val="0"/>
+          <w:sz w:val="24"/>
+        </w:rPr>
+        <w:t xml:space="preserve"> ficam de fora das preditoras porque, na mesma linha, entram no total; usá-las como </w:t>
+      </w:r>
+      <w:r>
+        <w:rPr>
+          <w:rFonts w:ascii="Times New Roman" w:hAnsi="Times New Roman" w:eastAsia="Times New Roman" w:cs="Times New Roman"/>
+          <w:b w:val="0"/>
+          <w:i/>
+          <w:sz w:val="24"/>
+        </w:rPr>
+        <w:t>features</w:t>
+      </w:r>
+      <w:r>
+        <w:rPr>
+          <w:rFonts w:ascii="Times New Roman" w:hAnsi="Times New Roman" w:eastAsia="Times New Roman" w:cs="Times New Roman"/>
+          <w:b w:val="0"/>
+          <w:i w:val="0"/>
+          <w:sz w:val="24"/>
+        </w:rPr>
+        <w:t xml:space="preserve"> chega perto de “copiar” o alvo. </w:t>
       </w:r>
       <w:r>
         <w:rPr>
           <w:rFonts w:ascii="Times New Roman" w:hAnsi="Times New Roman" w:eastAsia="Times New Roman" w:cs="Times New Roman"/>
           <w:b/>
+          <w:i w:val="0"/>
           <w:sz w:val="24"/>
         </w:rPr>
         <w:t>Nome servidor</w:t>
@@ -1075,6 +1519,8 @@
       <w:r>
         <w:rPr>
           <w:rFonts w:ascii="Times New Roman" w:hAnsi="Times New Roman" w:eastAsia="Times New Roman" w:cs="Times New Roman"/>
+          <w:b w:val="0"/>
+          <w:i w:val="0"/>
           <w:sz w:val="24"/>
         </w:rPr>
         <w:t xml:space="preserve"> saiu por ser identificador individual e pouco adequado a um modelo agregado de despesa, além da questão de privacidade. Mantivemos </w:t>
@@ -1083,6 +1529,7 @@
         <w:rPr>
           <w:rFonts w:ascii="Times New Roman" w:hAnsi="Times New Roman" w:eastAsia="Times New Roman" w:cs="Times New Roman"/>
           <w:b/>
+          <w:i w:val="0"/>
           <w:sz w:val="24"/>
         </w:rPr>
         <w:t>Número diárias</w:t>
@@ -1090,6 +1537,8 @@
       <w:r>
         <w:rPr>
           <w:rFonts w:ascii="Times New Roman" w:hAnsi="Times New Roman" w:eastAsia="Times New Roman" w:cs="Times New Roman"/>
+          <w:b w:val="0"/>
+          <w:i w:val="0"/>
           <w:sz w:val="24"/>
         </w:rPr>
         <w:t xml:space="preserve"> como quantidade; tirar o valor monetário das diárias ajuda a não repetir informação entre número e montante.</w:t>
@@ -1104,6 +1553,8 @@
       <w:r>
         <w:rPr>
           <w:rFonts w:ascii="Times New Roman" w:hAnsi="Times New Roman" w:eastAsia="Times New Roman" w:cs="Times New Roman"/>
+          <w:b w:val="0"/>
+          <w:i w:val="0"/>
           <w:sz w:val="24"/>
         </w:rPr>
         <w:t xml:space="preserve">Valores em falta: </w:t>
@@ -1111,6 +1562,8 @@
       <w:r>
         <w:rPr>
           <w:rFonts w:ascii="Courier New" w:hAnsi="Courier New"/>
+          <w:b w:val="0"/>
+          <w:i w:val="0"/>
           <w:sz w:val="22"/>
         </w:rPr>
         <w:t>SimpleImputer</w:t>
@@ -1118,6 +1571,8 @@
       <w:r>
         <w:rPr>
           <w:rFonts w:ascii="Times New Roman" w:hAnsi="Times New Roman" w:eastAsia="Times New Roman" w:cs="Times New Roman"/>
+          <w:b w:val="0"/>
+          <w:i w:val="0"/>
           <w:sz w:val="24"/>
         </w:rPr>
         <w:t xml:space="preserve"> com </w:t>
@@ -1126,6 +1581,7 @@
         <w:rPr>
           <w:rFonts w:ascii="Times New Roman" w:hAnsi="Times New Roman" w:eastAsia="Times New Roman" w:cs="Times New Roman"/>
           <w:b/>
+          <w:i w:val="0"/>
           <w:sz w:val="24"/>
         </w:rPr>
         <w:t>mediana</w:t>
@@ -1133,6 +1589,8 @@
       <w:r>
         <w:rPr>
           <w:rFonts w:ascii="Times New Roman" w:hAnsi="Times New Roman" w:eastAsia="Times New Roman" w:cs="Times New Roman"/>
+          <w:b w:val="0"/>
+          <w:i w:val="0"/>
           <w:sz w:val="24"/>
         </w:rPr>
         <w:t xml:space="preserve"> nos números e </w:t>
@@ -1141,6 +1599,7 @@
         <w:rPr>
           <w:rFonts w:ascii="Times New Roman" w:hAnsi="Times New Roman" w:eastAsia="Times New Roman" w:cs="Times New Roman"/>
           <w:b/>
+          <w:i w:val="0"/>
           <w:sz w:val="24"/>
         </w:rPr>
         <w:t>moda</w:t>
@@ -1148,6 +1607,8 @@
       <w:r>
         <w:rPr>
           <w:rFonts w:ascii="Times New Roman" w:hAnsi="Times New Roman" w:eastAsia="Times New Roman" w:cs="Times New Roman"/>
+          <w:b w:val="0"/>
+          <w:i w:val="0"/>
           <w:sz w:val="24"/>
         </w:rPr>
         <w:t xml:space="preserve"> nas categorias, ajustado no treino. Categorias: </w:t>
@@ -1155,6 +1616,8 @@
       <w:r>
         <w:rPr>
           <w:rFonts w:ascii="Courier New" w:hAnsi="Courier New"/>
+          <w:b w:val="0"/>
+          <w:i w:val="0"/>
           <w:sz w:val="22"/>
         </w:rPr>
         <w:t>OneHotEncoder</w:t>
@@ -1162,6 +1625,8 @@
       <w:r>
         <w:rPr>
           <w:rFonts w:ascii="Times New Roman" w:hAnsi="Times New Roman" w:eastAsia="Times New Roman" w:cs="Times New Roman"/>
+          <w:b w:val="0"/>
+          <w:i w:val="0"/>
           <w:sz w:val="24"/>
         </w:rPr>
         <w:t xml:space="preserve"> (</w:t>
@@ -1170,6 +1635,7 @@
         <w:rPr>
           <w:rFonts w:ascii="Times New Roman" w:hAnsi="Times New Roman" w:eastAsia="Times New Roman" w:cs="Times New Roman"/>
           <w:b/>
+          <w:i w:val="0"/>
           <w:sz w:val="24"/>
         </w:rPr>
         <w:t>até 25 categorias</w:t>
@@ -1177,6 +1643,8 @@
       <w:r>
         <w:rPr>
           <w:rFonts w:ascii="Times New Roman" w:hAnsi="Times New Roman" w:eastAsia="Times New Roman" w:cs="Times New Roman"/>
+          <w:b w:val="0"/>
+          <w:i w:val="0"/>
           <w:sz w:val="24"/>
         </w:rPr>
         <w:t xml:space="preserve"> por variável, </w:t>
@@ -1184,6 +1652,8 @@
       <w:r>
         <w:rPr>
           <w:rFonts w:ascii="Courier New" w:hAnsi="Courier New"/>
+          <w:b w:val="0"/>
+          <w:i w:val="0"/>
           <w:sz w:val="22"/>
         </w:rPr>
         <w:t>handle_unknown='ignore'</w:t>
@@ -1191,6 +1661,8 @@
       <w:r>
         <w:rPr>
           <w:rFonts w:ascii="Times New Roman" w:hAnsi="Times New Roman" w:eastAsia="Times New Roman" w:cs="Times New Roman"/>
+          <w:b w:val="0"/>
+          <w:i w:val="0"/>
           <w:sz w:val="24"/>
         </w:rPr>
         <w:t xml:space="preserve">, saída </w:t>
@@ -1199,6 +1671,7 @@
         <w:rPr>
           <w:rFonts w:ascii="Times New Roman" w:hAnsi="Times New Roman" w:eastAsia="Times New Roman" w:cs="Times New Roman"/>
           <w:b/>
+          <w:i w:val="0"/>
           <w:sz w:val="24"/>
         </w:rPr>
         <w:t>esparsa</w:t>
@@ -1206,21 +1679,26 @@
       <w:r>
         <w:rPr>
           <w:rFonts w:ascii="Times New Roman" w:hAnsi="Times New Roman" w:eastAsia="Times New Roman" w:cs="Times New Roman"/>
+          <w:b w:val="0"/>
+          <w:i w:val="0"/>
           <w:sz w:val="24"/>
         </w:rPr>
         <w:t xml:space="preserve"> quando o pacote permite), por causa do volume de linhas. Depois da imputação, as numéricas passam por </w:t>
       </w:r>
       <w:r>
         <w:rPr>
-          <w:rFonts w:ascii="Times New Roman" w:hAnsi="Times New Roman" w:eastAsia="Times New Roman" w:cs="Times New Roman"/>
+          <w:rFonts w:ascii="Courier New" w:hAnsi="Courier New"/>
           <w:b/>
-          <w:sz w:val="24"/>
-        </w:rPr>
-        <w:t>`StandardScaler`</w:t>
-      </w:r>
-      <w:r>
-        <w:rPr>
-          <w:rFonts w:ascii="Times New Roman" w:hAnsi="Times New Roman" w:eastAsia="Times New Roman" w:cs="Times New Roman"/>
+          <w:i w:val="0"/>
+          <w:sz w:val="22"/>
+        </w:rPr>
+        <w:t>StandardScaler</w:t>
+      </w:r>
+      <w:r>
+        <w:rPr>
+          <w:rFonts w:ascii="Times New Roman" w:hAnsi="Times New Roman" w:eastAsia="Times New Roman" w:cs="Times New Roman"/>
+          <w:b w:val="0"/>
+          <w:i w:val="0"/>
           <w:sz w:val="24"/>
         </w:rPr>
         <w:t>, o que ajuda o Ridge e coloca escalas mais parecidas.</w:t>
@@ -1236,6 +1714,7 @@
         <w:rPr>
           <w:rFonts w:ascii="Times New Roman" w:hAnsi="Times New Roman" w:eastAsia="Times New Roman" w:cs="Times New Roman"/>
           <w:b/>
+          <w:i w:val="0"/>
           <w:sz w:val="24"/>
         </w:rPr>
         <w:t>HistGradientBoostingRegressor</w:t>
@@ -1243,6 +1722,8 @@
       <w:r>
         <w:rPr>
           <w:rFonts w:ascii="Times New Roman" w:hAnsi="Times New Roman" w:eastAsia="Times New Roman" w:cs="Times New Roman"/>
+          <w:b w:val="0"/>
+          <w:i w:val="0"/>
           <w:sz w:val="24"/>
         </w:rPr>
         <w:t xml:space="preserve"> e </w:t>
@@ -1251,6 +1732,7 @@
         <w:rPr>
           <w:rFonts w:ascii="Times New Roman" w:hAnsi="Times New Roman" w:eastAsia="Times New Roman" w:cs="Times New Roman"/>
           <w:b/>
+          <w:i w:val="0"/>
           <w:sz w:val="24"/>
         </w:rPr>
         <w:t>RandomForestRegressor</w:t>
@@ -1258,6 +1740,8 @@
       <w:r>
         <w:rPr>
           <w:rFonts w:ascii="Times New Roman" w:hAnsi="Times New Roman" w:eastAsia="Times New Roman" w:cs="Times New Roman"/>
+          <w:b w:val="0"/>
+          <w:i w:val="0"/>
           <w:sz w:val="24"/>
         </w:rPr>
         <w:t xml:space="preserve"> (nas versões que usámos) pedem </w:t>
@@ -1266,6 +1750,7 @@
         <w:rPr>
           <w:rFonts w:ascii="Times New Roman" w:hAnsi="Times New Roman" w:eastAsia="Times New Roman" w:cs="Times New Roman"/>
           <w:b/>
+          <w:i w:val="0"/>
           <w:sz w:val="24"/>
         </w:rPr>
         <w:t>matriz densa</w:t>
@@ -1273,13 +1758,35 @@
       <w:r>
         <w:rPr>
           <w:rFonts w:ascii="Times New Roman" w:hAnsi="Times New Roman" w:eastAsia="Times New Roman" w:cs="Times New Roman"/>
-          <w:sz w:val="24"/>
-        </w:rPr>
-        <w:t xml:space="preserve"> depois do *one-hot*, com </w:t>
+          <w:b w:val="0"/>
+          <w:i w:val="0"/>
+          <w:sz w:val="24"/>
+        </w:rPr>
+        <w:t xml:space="preserve"> depois do </w:t>
+      </w:r>
+      <w:r>
+        <w:rPr>
+          <w:rFonts w:ascii="Times New Roman" w:hAnsi="Times New Roman" w:eastAsia="Times New Roman" w:cs="Times New Roman"/>
+          <w:b w:val="0"/>
+          <w:i/>
+          <w:sz w:val="24"/>
+        </w:rPr>
+        <w:t>one-hot</w:t>
+      </w:r>
+      <w:r>
+        <w:rPr>
+          <w:rFonts w:ascii="Times New Roman" w:hAnsi="Times New Roman" w:eastAsia="Times New Roman" w:cs="Times New Roman"/>
+          <w:b w:val="0"/>
+          <w:i w:val="0"/>
+          <w:sz w:val="24"/>
+        </w:rPr>
+        <w:t xml:space="preserve">, com </w:t>
       </w:r>
       <w:r>
         <w:rPr>
           <w:rFonts w:ascii="Courier New" w:hAnsi="Courier New"/>
+          <w:b w:val="0"/>
+          <w:i w:val="0"/>
           <w:sz w:val="22"/>
         </w:rPr>
         <w:t>.toarray()</w:t>
@@ -1287,6 +1794,8 @@
       <w:r>
         <w:rPr>
           <w:rFonts w:ascii="Times New Roman" w:hAnsi="Times New Roman" w:eastAsia="Times New Roman" w:cs="Times New Roman"/>
+          <w:b w:val="0"/>
+          <w:i w:val="0"/>
           <w:sz w:val="24"/>
         </w:rPr>
         <w:t xml:space="preserve"> e </w:t>
@@ -1295,6 +1804,7 @@
         <w:rPr>
           <w:rFonts w:ascii="Times New Roman" w:hAnsi="Times New Roman" w:eastAsia="Times New Roman" w:cs="Times New Roman"/>
           <w:b/>
+          <w:i w:val="0"/>
           <w:sz w:val="24"/>
         </w:rPr>
         <w:t>muita RAM</w:t>
@@ -1302,6 +1812,8 @@
       <w:r>
         <w:rPr>
           <w:rFonts w:ascii="Times New Roman" w:hAnsi="Times New Roman" w:eastAsia="Times New Roman" w:cs="Times New Roman"/>
+          <w:b w:val="0"/>
+          <w:i w:val="0"/>
           <w:sz w:val="24"/>
         </w:rPr>
         <w:t xml:space="preserve">. Daí o uso de </w:t>
@@ -1310,6 +1822,7 @@
         <w:rPr>
           <w:rFonts w:ascii="Times New Roman" w:hAnsi="Times New Roman" w:eastAsia="Times New Roman" w:cs="Times New Roman"/>
           <w:b/>
+          <w:i w:val="0"/>
           <w:sz w:val="24"/>
         </w:rPr>
         <w:t>subamostras</w:t>
@@ -1317,6 +1830,8 @@
       <w:r>
         <w:rPr>
           <w:rFonts w:ascii="Times New Roman" w:hAnsi="Times New Roman" w:eastAsia="Times New Roman" w:cs="Times New Roman"/>
+          <w:b w:val="0"/>
+          <w:i w:val="0"/>
           <w:sz w:val="24"/>
         </w:rPr>
         <w:t xml:space="preserve"> (</w:t>
@@ -1324,6 +1839,8 @@
       <w:r>
         <w:rPr>
           <w:rFonts w:ascii="Courier New" w:hAnsi="Courier New"/>
+          <w:b w:val="0"/>
+          <w:i w:val="0"/>
           <w:sz w:val="22"/>
         </w:rPr>
         <w:t>AMOSTRA_CV</w:t>
@@ -1331,6 +1848,8 @@
       <w:r>
         <w:rPr>
           <w:rFonts w:ascii="Times New Roman" w:hAnsi="Times New Roman" w:eastAsia="Times New Roman" w:cs="Times New Roman"/>
+          <w:b w:val="0"/>
+          <w:i w:val="0"/>
           <w:sz w:val="24"/>
         </w:rPr>
         <w:t xml:space="preserve">, </w:t>
@@ -1338,6 +1857,8 @@
       <w:r>
         <w:rPr>
           <w:rFonts w:ascii="Courier New" w:hAnsi="Courier New"/>
+          <w:b w:val="0"/>
+          <w:i w:val="0"/>
           <w:sz w:val="22"/>
         </w:rPr>
         <w:t>AMOSTRA_RF</w:t>
@@ -1345,6 +1866,8 @@
       <w:r>
         <w:rPr>
           <w:rFonts w:ascii="Times New Roman" w:hAnsi="Times New Roman" w:eastAsia="Times New Roman" w:cs="Times New Roman"/>
+          <w:b w:val="0"/>
+          <w:i w:val="0"/>
           <w:sz w:val="24"/>
         </w:rPr>
         <w:t>, etc.) nas partes mais pesadas, como forma de caber na máquina disponível sem desistir do exercício.</w:t>
@@ -1374,6 +1897,8 @@
       <w:r>
         <w:rPr>
           <w:rFonts w:ascii="Times New Roman" w:hAnsi="Times New Roman" w:eastAsia="Times New Roman" w:cs="Times New Roman"/>
+          <w:b w:val="0"/>
+          <w:i w:val="0"/>
           <w:sz w:val="24"/>
         </w:rPr>
         <w:t xml:space="preserve">Testámos três regressores com o </w:t>
@@ -1382,6 +1907,7 @@
         <w:rPr>
           <w:rFonts w:ascii="Times New Roman" w:hAnsi="Times New Roman" w:eastAsia="Times New Roman" w:cs="Times New Roman"/>
           <w:b/>
+          <w:i w:val="0"/>
           <w:sz w:val="24"/>
         </w:rPr>
         <w:t>mesmo</w:t>
@@ -1389,6 +1915,8 @@
       <w:r>
         <w:rPr>
           <w:rFonts w:ascii="Times New Roman" w:hAnsi="Times New Roman" w:eastAsia="Times New Roman" w:cs="Times New Roman"/>
+          <w:b w:val="0"/>
+          <w:i w:val="0"/>
           <w:sz w:val="24"/>
         </w:rPr>
         <w:t xml:space="preserve"> pré-processamento (</w:t>
@@ -1396,6 +1924,8 @@
       <w:r>
         <w:rPr>
           <w:rFonts w:ascii="Courier New" w:hAnsi="Courier New"/>
+          <w:b w:val="0"/>
+          <w:i w:val="0"/>
           <w:sz w:val="22"/>
         </w:rPr>
         <w:t>clone(preprocessor)</w:t>
@@ -1403,6 +1933,8 @@
       <w:r>
         <w:rPr>
           <w:rFonts w:ascii="Times New Roman" w:hAnsi="Times New Roman" w:eastAsia="Times New Roman" w:cs="Times New Roman"/>
+          <w:b w:val="0"/>
+          <w:i w:val="0"/>
           <w:sz w:val="24"/>
         </w:rPr>
         <w:t xml:space="preserve"> + estimador), para que a comparação não misture transformações diferentes.</w:t>
@@ -1418,6 +1950,7 @@
         <w:rPr>
           <w:rFonts w:ascii="Times New Roman" w:hAnsi="Times New Roman" w:eastAsia="Times New Roman" w:cs="Times New Roman"/>
           <w:b/>
+          <w:i w:val="0"/>
           <w:sz w:val="24"/>
         </w:rPr>
         <w:t>Ridge</w:t>
@@ -1425,6 +1958,8 @@
       <w:r>
         <w:rPr>
           <w:rFonts w:ascii="Times New Roman" w:hAnsi="Times New Roman" w:eastAsia="Times New Roman" w:cs="Times New Roman"/>
+          <w:b w:val="0"/>
+          <w:i w:val="0"/>
           <w:sz w:val="24"/>
         </w:rPr>
         <w:t xml:space="preserve"> serve de referência </w:t>
@@ -1433,6 +1968,7 @@
         <w:rPr>
           <w:rFonts w:ascii="Times New Roman" w:hAnsi="Times New Roman" w:eastAsia="Times New Roman" w:cs="Times New Roman"/>
           <w:b/>
+          <w:i w:val="0"/>
           <w:sz w:val="24"/>
         </w:rPr>
         <w:t>linear com regularização</w:t>
@@ -1440,14 +1976,35 @@
       <w:r>
         <w:rPr>
           <w:rFonts w:ascii="Times New Roman" w:hAnsi="Times New Roman" w:eastAsia="Times New Roman" w:cs="Times New Roman"/>
-          <w:sz w:val="24"/>
-        </w:rPr>
-        <w:t xml:space="preserve"> (L2) e ainda lida bem com entrada esparsa do *one-hot*. </w:t>
+          <w:b w:val="0"/>
+          <w:i w:val="0"/>
+          <w:sz w:val="24"/>
+        </w:rPr>
+        <w:t xml:space="preserve"> (L2) e ainda lida bem com entrada esparsa do </w:t>
+      </w:r>
+      <w:r>
+        <w:rPr>
+          <w:rFonts w:ascii="Times New Roman" w:hAnsi="Times New Roman" w:eastAsia="Times New Roman" w:cs="Times New Roman"/>
+          <w:b w:val="0"/>
+          <w:i/>
+          <w:sz w:val="24"/>
+        </w:rPr>
+        <w:t>one-hot</w:t>
+      </w:r>
+      <w:r>
+        <w:rPr>
+          <w:rFonts w:ascii="Times New Roman" w:hAnsi="Times New Roman" w:eastAsia="Times New Roman" w:cs="Times New Roman"/>
+          <w:b w:val="0"/>
+          <w:i w:val="0"/>
+          <w:sz w:val="24"/>
+        </w:rPr>
+        <w:t xml:space="preserve">. </w:t>
       </w:r>
       <w:r>
         <w:rPr>
           <w:rFonts w:ascii="Times New Roman" w:hAnsi="Times New Roman" w:eastAsia="Times New Roman" w:cs="Times New Roman"/>
           <w:b/>
+          <w:i w:val="0"/>
           <w:sz w:val="24"/>
         </w:rPr>
         <w:t>HistGradientBoostingRegressor</w:t>
@@ -1455,6 +2012,8 @@
       <w:r>
         <w:rPr>
           <w:rFonts w:ascii="Times New Roman" w:hAnsi="Times New Roman" w:eastAsia="Times New Roman" w:cs="Times New Roman"/>
+          <w:b w:val="0"/>
+          <w:i w:val="0"/>
           <w:sz w:val="24"/>
         </w:rPr>
         <w:t xml:space="preserve"> e </w:t>
@@ -1463,6 +2022,7 @@
         <w:rPr>
           <w:rFonts w:ascii="Times New Roman" w:hAnsi="Times New Roman" w:eastAsia="Times New Roman" w:cs="Times New Roman"/>
           <w:b/>
+          <w:i w:val="0"/>
           <w:sz w:val="24"/>
         </w:rPr>
         <w:t>RandomForestRegressor</w:t>
@@ -1470,6 +2030,8 @@
       <w:r>
         <w:rPr>
           <w:rFonts w:ascii="Times New Roman" w:hAnsi="Times New Roman" w:eastAsia="Times New Roman" w:cs="Times New Roman"/>
+          <w:b w:val="0"/>
+          <w:i w:val="0"/>
           <w:sz w:val="24"/>
         </w:rPr>
         <w:t xml:space="preserve"> são </w:t>
@@ -1478,6 +2040,7 @@
         <w:rPr>
           <w:rFonts w:ascii="Times New Roman" w:hAnsi="Times New Roman" w:eastAsia="Times New Roman" w:cs="Times New Roman"/>
           <w:b/>
+          <w:i w:val="0"/>
           <w:sz w:val="24"/>
         </w:rPr>
         <w:t>árvores</w:t>
@@ -1485,9 +2048,29 @@
       <w:r>
         <w:rPr>
           <w:rFonts w:ascii="Times New Roman" w:hAnsi="Times New Roman" w:eastAsia="Times New Roman" w:cs="Times New Roman"/>
-          <w:sz w:val="24"/>
-        </w:rPr>
-        <w:t xml:space="preserve"> e *ensembles*, mais flexíveis quando há relações não lineares e cruzamentos entre categorias codificadas e variáveis numéricas.</w:t>
+          <w:b w:val="0"/>
+          <w:i w:val="0"/>
+          <w:sz w:val="24"/>
+        </w:rPr>
+        <w:t xml:space="preserve"> e </w:t>
+      </w:r>
+      <w:r>
+        <w:rPr>
+          <w:rFonts w:ascii="Times New Roman" w:hAnsi="Times New Roman" w:eastAsia="Times New Roman" w:cs="Times New Roman"/>
+          <w:b w:val="0"/>
+          <w:i/>
+          <w:sz w:val="24"/>
+        </w:rPr>
+        <w:t>ensembles</w:t>
+      </w:r>
+      <w:r>
+        <w:rPr>
+          <w:rFonts w:ascii="Times New Roman" w:hAnsi="Times New Roman" w:eastAsia="Times New Roman" w:cs="Times New Roman"/>
+          <w:b w:val="0"/>
+          <w:i w:val="0"/>
+          <w:sz w:val="24"/>
+        </w:rPr>
+        <w:t>, mais flexíveis quando há relações não lineares e cruzamentos entre categorias codificadas e variáveis numéricas.</w:t>
       </w:r>
     </w:p>
     <w:p>
@@ -1499,6 +2082,8 @@
       <w:r>
         <w:rPr>
           <w:rFonts w:ascii="Times New Roman" w:hAnsi="Times New Roman" w:eastAsia="Times New Roman" w:cs="Times New Roman"/>
+          <w:b w:val="0"/>
+          <w:i w:val="0"/>
           <w:sz w:val="24"/>
         </w:rPr>
         <w:t xml:space="preserve">No </w:t>
@@ -1507,6 +2092,7 @@
         <w:rPr>
           <w:rFonts w:ascii="Times New Roman" w:hAnsi="Times New Roman" w:eastAsia="Times New Roman" w:cs="Times New Roman"/>
           <w:b/>
+          <w:i w:val="0"/>
           <w:sz w:val="24"/>
         </w:rPr>
         <w:t>treino</w:t>
@@ -1514,29 +2100,53 @@
       <w:r>
         <w:rPr>
           <w:rFonts w:ascii="Times New Roman" w:hAnsi="Times New Roman" w:eastAsia="Times New Roman" w:cs="Times New Roman"/>
+          <w:b w:val="0"/>
+          <w:i w:val="0"/>
           <w:sz w:val="24"/>
         </w:rPr>
         <w:t xml:space="preserve">, com </w:t>
       </w:r>
       <w:r>
         <w:rPr>
-          <w:rFonts w:ascii="Times New Roman" w:hAnsi="Times New Roman" w:eastAsia="Times New Roman" w:cs="Times New Roman"/>
+          <w:rFonts w:ascii="Courier New" w:hAnsi="Courier New"/>
           <w:b/>
-          <w:sz w:val="24"/>
-        </w:rPr>
-        <w:t>`cross_validate`</w:t>
-      </w:r>
-      <w:r>
-        <w:rPr>
-          <w:rFonts w:ascii="Times New Roman" w:hAnsi="Times New Roman" w:eastAsia="Times New Roman" w:cs="Times New Roman"/>
-          <w:sz w:val="24"/>
-        </w:rPr>
-        <w:t xml:space="preserve"> (MSE negativo, de onde sai o RMSE, mais MAE e R² por *fold*), o teste continuou de fora. Na execução que está no notebook, a </w:t>
+          <w:i w:val="0"/>
+          <w:sz w:val="22"/>
+        </w:rPr>
+        <w:t>cross_validate</w:t>
+      </w:r>
+      <w:r>
+        <w:rPr>
+          <w:rFonts w:ascii="Times New Roman" w:hAnsi="Times New Roman" w:eastAsia="Times New Roman" w:cs="Times New Roman"/>
+          <w:b w:val="0"/>
+          <w:i w:val="0"/>
+          <w:sz w:val="24"/>
+        </w:rPr>
+        <w:t xml:space="preserve"> (MSE negativo, de onde sai o RMSE, mais MAE e R² por </w:t>
+      </w:r>
+      <w:r>
+        <w:rPr>
+          <w:rFonts w:ascii="Times New Roman" w:hAnsi="Times New Roman" w:eastAsia="Times New Roman" w:cs="Times New Roman"/>
+          <w:b w:val="0"/>
+          <w:i/>
+          <w:sz w:val="24"/>
+        </w:rPr>
+        <w:t>fold</w:t>
+      </w:r>
+      <w:r>
+        <w:rPr>
+          <w:rFonts w:ascii="Times New Roman" w:hAnsi="Times New Roman" w:eastAsia="Times New Roman" w:cs="Times New Roman"/>
+          <w:b w:val="0"/>
+          <w:i w:val="0"/>
+          <w:sz w:val="24"/>
+        </w:rPr>
+        <w:t xml:space="preserve">), o teste continuou de fora. Na execução que está no notebook, a </w:t>
       </w:r>
       <w:r>
         <w:rPr>
           <w:rFonts w:ascii="Times New Roman" w:hAnsi="Times New Roman" w:eastAsia="Times New Roman" w:cs="Times New Roman"/>
           <w:b/>
+          <w:i w:val="0"/>
           <w:sz w:val="24"/>
         </w:rPr>
         <w:t>Random Forest</w:t>
@@ -1544,6 +2154,8 @@
       <w:r>
         <w:rPr>
           <w:rFonts w:ascii="Times New Roman" w:hAnsi="Times New Roman" w:eastAsia="Times New Roman" w:cs="Times New Roman"/>
+          <w:b w:val="0"/>
+          <w:i w:val="0"/>
           <w:sz w:val="24"/>
         </w:rPr>
         <w:t xml:space="preserve"> teve o </w:t>
@@ -1552,6 +2164,7 @@
         <w:rPr>
           <w:rFonts w:ascii="Times New Roman" w:hAnsi="Times New Roman" w:eastAsia="Times New Roman" w:cs="Times New Roman"/>
           <w:b/>
+          <w:i w:val="0"/>
           <w:sz w:val="24"/>
         </w:rPr>
         <w:t>menor RMSE médio</w:t>
@@ -1559,6 +2172,8 @@
       <w:r>
         <w:rPr>
           <w:rFonts w:ascii="Times New Roman" w:hAnsi="Times New Roman" w:eastAsia="Times New Roman" w:cs="Times New Roman"/>
+          <w:b w:val="0"/>
+          <w:i w:val="0"/>
           <w:sz w:val="24"/>
         </w:rPr>
         <w:t xml:space="preserve"> na validação cruzada; o </w:t>
@@ -1567,6 +2182,7 @@
         <w:rPr>
           <w:rFonts w:ascii="Times New Roman" w:hAnsi="Times New Roman" w:eastAsia="Times New Roman" w:cs="Times New Roman"/>
           <w:b/>
+          <w:i w:val="0"/>
           <w:sz w:val="24"/>
         </w:rPr>
         <w:t>Ridge</w:t>
@@ -1574,9 +2190,47 @@
       <w:r>
         <w:rPr>
           <w:rFonts w:ascii="Times New Roman" w:hAnsi="Times New Roman" w:eastAsia="Times New Roman" w:cs="Times New Roman"/>
-          <w:sz w:val="24"/>
-        </w:rPr>
-        <w:t xml:space="preserve"> ficou atrás, o que faz sentido com muitas *dummies* após *one-hot* e com o formato do alvo.</w:t>
+          <w:b w:val="0"/>
+          <w:i w:val="0"/>
+          <w:sz w:val="24"/>
+        </w:rPr>
+        <w:t xml:space="preserve"> ficou atrás, o que faz sentido com muitas </w:t>
+      </w:r>
+      <w:r>
+        <w:rPr>
+          <w:rFonts w:ascii="Times New Roman" w:hAnsi="Times New Roman" w:eastAsia="Times New Roman" w:cs="Times New Roman"/>
+          <w:b w:val="0"/>
+          <w:i/>
+          <w:sz w:val="24"/>
+        </w:rPr>
+        <w:t>dummies</w:t>
+      </w:r>
+      <w:r>
+        <w:rPr>
+          <w:rFonts w:ascii="Times New Roman" w:hAnsi="Times New Roman" w:eastAsia="Times New Roman" w:cs="Times New Roman"/>
+          <w:b w:val="0"/>
+          <w:i w:val="0"/>
+          <w:sz w:val="24"/>
+        </w:rPr>
+        <w:t xml:space="preserve"> após </w:t>
+      </w:r>
+      <w:r>
+        <w:rPr>
+          <w:rFonts w:ascii="Times New Roman" w:hAnsi="Times New Roman" w:eastAsia="Times New Roman" w:cs="Times New Roman"/>
+          <w:b w:val="0"/>
+          <w:i/>
+          <w:sz w:val="24"/>
+        </w:rPr>
+        <w:t>one-hot</w:t>
+      </w:r>
+      <w:r>
+        <w:rPr>
+          <w:rFonts w:ascii="Times New Roman" w:hAnsi="Times New Roman" w:eastAsia="Times New Roman" w:cs="Times New Roman"/>
+          <w:b w:val="0"/>
+          <w:i w:val="0"/>
+          <w:sz w:val="24"/>
+        </w:rPr>
+        <w:t xml:space="preserve"> e com o formato do alvo.</w:t>
       </w:r>
     </w:p>
     <w:p>
@@ -1603,6 +2257,8 @@
       <w:r>
         <w:rPr>
           <w:rFonts w:ascii="Times New Roman" w:hAnsi="Times New Roman" w:eastAsia="Times New Roman" w:cs="Times New Roman"/>
+          <w:b w:val="0"/>
+          <w:i w:val="0"/>
           <w:sz w:val="24"/>
         </w:rPr>
         <w:t xml:space="preserve">Usámos </w:t>
@@ -1611,6 +2267,7 @@
         <w:rPr>
           <w:rFonts w:ascii="Times New Roman" w:hAnsi="Times New Roman" w:eastAsia="Times New Roman" w:cs="Times New Roman"/>
           <w:b/>
+          <w:i w:val="0"/>
           <w:sz w:val="24"/>
         </w:rPr>
         <w:t>RMSE</w:t>
@@ -1618,6 +2275,8 @@
       <w:r>
         <w:rPr>
           <w:rFonts w:ascii="Times New Roman" w:hAnsi="Times New Roman" w:eastAsia="Times New Roman" w:cs="Times New Roman"/>
+          <w:b w:val="0"/>
+          <w:i w:val="0"/>
           <w:sz w:val="24"/>
         </w:rPr>
         <w:t xml:space="preserve"> (castiga erros grandes; mesma unidade do alvo), </w:t>
@@ -1626,6 +2285,7 @@
         <w:rPr>
           <w:rFonts w:ascii="Times New Roman" w:hAnsi="Times New Roman" w:eastAsia="Times New Roman" w:cs="Times New Roman"/>
           <w:b/>
+          <w:i w:val="0"/>
           <w:sz w:val="24"/>
         </w:rPr>
         <w:t>MAE</w:t>
@@ -1633,6 +2293,8 @@
       <w:r>
         <w:rPr>
           <w:rFonts w:ascii="Times New Roman" w:hAnsi="Times New Roman" w:eastAsia="Times New Roman" w:cs="Times New Roman"/>
+          <w:b w:val="0"/>
+          <w:i w:val="0"/>
           <w:sz w:val="24"/>
         </w:rPr>
         <w:t xml:space="preserve"> (erro médio em R$, menos sensível a poucos valores muito extremos) e </w:t>
@@ -1641,6 +2303,7 @@
         <w:rPr>
           <w:rFonts w:ascii="Times New Roman" w:hAnsi="Times New Roman" w:eastAsia="Times New Roman" w:cs="Times New Roman"/>
           <w:b/>
+          <w:i w:val="0"/>
           <w:sz w:val="24"/>
         </w:rPr>
         <w:t>R²</w:t>
@@ -1648,9 +2311,29 @@
       <w:r>
         <w:rPr>
           <w:rFonts w:ascii="Times New Roman" w:hAnsi="Times New Roman" w:eastAsia="Times New Roman" w:cs="Times New Roman"/>
-          <w:sz w:val="24"/>
-        </w:rPr>
-        <w:t xml:space="preserve"> (quanto da variância do alvo o modelo explica, no treino/CV ou no teste). As três métricas aparecem na CV e de novo na avaliação final no *hold-out*.</w:t>
+          <w:b w:val="0"/>
+          <w:i w:val="0"/>
+          <w:sz w:val="24"/>
+        </w:rPr>
+        <w:t xml:space="preserve"> (quanto da variância do alvo o modelo explica, no treino/CV ou no teste). As três métricas aparecem na CV e de novo na avaliação final no </w:t>
+      </w:r>
+      <w:r>
+        <w:rPr>
+          <w:rFonts w:ascii="Times New Roman" w:hAnsi="Times New Roman" w:eastAsia="Times New Roman" w:cs="Times New Roman"/>
+          <w:b w:val="0"/>
+          <w:i/>
+          <w:sz w:val="24"/>
+        </w:rPr>
+        <w:t>hold-out</w:t>
+      </w:r>
+      <w:r>
+        <w:rPr>
+          <w:rFonts w:ascii="Times New Roman" w:hAnsi="Times New Roman" w:eastAsia="Times New Roman" w:cs="Times New Roman"/>
+          <w:b w:val="0"/>
+          <w:i w:val="0"/>
+          <w:sz w:val="24"/>
+        </w:rPr>
+        <w:t>.</w:t>
       </w:r>
     </w:p>
     <w:p>
@@ -1677,21 +2360,26 @@
       <w:r>
         <w:rPr>
           <w:rFonts w:ascii="Times New Roman" w:hAnsi="Times New Roman" w:eastAsia="Times New Roman" w:cs="Times New Roman"/>
+          <w:b w:val="0"/>
+          <w:i w:val="0"/>
           <w:sz w:val="24"/>
         </w:rPr>
         <w:t xml:space="preserve">Corremos </w:t>
       </w:r>
       <w:r>
         <w:rPr>
-          <w:rFonts w:ascii="Times New Roman" w:hAnsi="Times New Roman" w:eastAsia="Times New Roman" w:cs="Times New Roman"/>
+          <w:rFonts w:ascii="Courier New" w:hAnsi="Courier New"/>
           <w:b/>
-          <w:sz w:val="24"/>
-        </w:rPr>
-        <w:t>`RandomizedSearchCV`</w:t>
-      </w:r>
-      <w:r>
-        <w:rPr>
-          <w:rFonts w:ascii="Times New Roman" w:hAnsi="Times New Roman" w:eastAsia="Times New Roman" w:cs="Times New Roman"/>
+          <w:i w:val="0"/>
+          <w:sz w:val="22"/>
+        </w:rPr>
+        <w:t>RandomizedSearchCV</w:t>
+      </w:r>
+      <w:r>
+        <w:rPr>
+          <w:rFonts w:ascii="Times New Roman" w:hAnsi="Times New Roman" w:eastAsia="Times New Roman" w:cs="Times New Roman"/>
+          <w:b w:val="0"/>
+          <w:i w:val="0"/>
           <w:sz w:val="24"/>
         </w:rPr>
         <w:t xml:space="preserve"> numa </w:t>
@@ -1700,6 +2388,7 @@
         <w:rPr>
           <w:rFonts w:ascii="Times New Roman" w:hAnsi="Times New Roman" w:eastAsia="Times New Roman" w:cs="Times New Roman"/>
           <w:b/>
+          <w:i w:val="0"/>
           <w:sz w:val="24"/>
         </w:rPr>
         <w:t>subamostra do treino</w:t>
@@ -1707,6 +2396,8 @@
       <w:r>
         <w:rPr>
           <w:rFonts w:ascii="Times New Roman" w:hAnsi="Times New Roman" w:eastAsia="Times New Roman" w:cs="Times New Roman"/>
+          <w:b w:val="0"/>
+          <w:i w:val="0"/>
           <w:sz w:val="24"/>
         </w:rPr>
         <w:t xml:space="preserve"> (</w:t>
@@ -1714,6 +2405,8 @@
       <w:r>
         <w:rPr>
           <w:rFonts w:ascii="Courier New" w:hAnsi="Courier New"/>
+          <w:b w:val="0"/>
+          <w:i w:val="0"/>
           <w:sz w:val="22"/>
         </w:rPr>
         <w:t>AMOSTRA_SEARCH</w:t>
@@ -1721,6 +2414,8 @@
       <w:r>
         <w:rPr>
           <w:rFonts w:ascii="Times New Roman" w:hAnsi="Times New Roman" w:eastAsia="Times New Roman" w:cs="Times New Roman"/>
+          <w:b w:val="0"/>
+          <w:i w:val="0"/>
           <w:sz w:val="24"/>
         </w:rPr>
         <w:t xml:space="preserve">), com </w:t>
@@ -1728,6 +2423,8 @@
       <w:r>
         <w:rPr>
           <w:rFonts w:ascii="Courier New" w:hAnsi="Courier New"/>
+          <w:b w:val="0"/>
+          <w:i w:val="0"/>
           <w:sz w:val="22"/>
         </w:rPr>
         <w:t>cv=3</w:t>
@@ -1735,6 +2432,8 @@
       <w:r>
         <w:rPr>
           <w:rFonts w:ascii="Times New Roman" w:hAnsi="Times New Roman" w:eastAsia="Times New Roman" w:cs="Times New Roman"/>
+          <w:b w:val="0"/>
+          <w:i w:val="0"/>
           <w:sz w:val="24"/>
         </w:rPr>
         <w:t xml:space="preserve"> e </w:t>
@@ -1742,6 +2441,8 @@
       <w:r>
         <w:rPr>
           <w:rFonts w:ascii="Courier New" w:hAnsi="Courier New"/>
+          <w:b w:val="0"/>
+          <w:i w:val="0"/>
           <w:sz w:val="22"/>
         </w:rPr>
         <w:t>scoring='neg_mean_squared_error'</w:t>
@@ -1749,6 +2450,8 @@
       <w:r>
         <w:rPr>
           <w:rFonts w:ascii="Times New Roman" w:hAnsi="Times New Roman" w:eastAsia="Times New Roman" w:cs="Times New Roman"/>
+          <w:b w:val="0"/>
+          <w:i w:val="0"/>
           <w:sz w:val="24"/>
         </w:rPr>
         <w:t xml:space="preserve"> (o RMSE mostrado é a raiz, para ficar em R$). Preferimos </w:t>
@@ -1757,6 +2460,7 @@
         <w:rPr>
           <w:rFonts w:ascii="Times New Roman" w:hAnsi="Times New Roman" w:eastAsia="Times New Roman" w:cs="Times New Roman"/>
           <w:b/>
+          <w:i w:val="0"/>
           <w:sz w:val="24"/>
         </w:rPr>
         <w:t>busca aleatória</w:t>
@@ -1764,9 +2468,29 @@
       <w:r>
         <w:rPr>
           <w:rFonts w:ascii="Times New Roman" w:hAnsi="Times New Roman" w:eastAsia="Times New Roman" w:cs="Times New Roman"/>
-          <w:sz w:val="24"/>
-        </w:rPr>
-        <w:t xml:space="preserve"> a um *grid* completo, pelo tamanho do espaço de hiperparâmetros e pelo tempo de execução.</w:t>
+          <w:b w:val="0"/>
+          <w:i w:val="0"/>
+          <w:sz w:val="24"/>
+        </w:rPr>
+        <w:t xml:space="preserve"> a um </w:t>
+      </w:r>
+      <w:r>
+        <w:rPr>
+          <w:rFonts w:ascii="Times New Roman" w:hAnsi="Times New Roman" w:eastAsia="Times New Roman" w:cs="Times New Roman"/>
+          <w:b w:val="0"/>
+          <w:i/>
+          <w:sz w:val="24"/>
+        </w:rPr>
+        <w:t>grid</w:t>
+      </w:r>
+      <w:r>
+        <w:rPr>
+          <w:rFonts w:ascii="Times New Roman" w:hAnsi="Times New Roman" w:eastAsia="Times New Roman" w:cs="Times New Roman"/>
+          <w:b w:val="0"/>
+          <w:i w:val="0"/>
+          <w:sz w:val="24"/>
+        </w:rPr>
+        <w:t xml:space="preserve"> completo, pelo tamanho do espaço de hiperparâmetros e pelo tempo de execução.</w:t>
       </w:r>
     </w:p>
     <w:p>
@@ -1778,6 +2502,8 @@
       <w:r>
         <w:rPr>
           <w:rFonts w:ascii="Times New Roman" w:hAnsi="Times New Roman" w:eastAsia="Times New Roman" w:cs="Times New Roman"/>
+          <w:b w:val="0"/>
+          <w:i w:val="0"/>
           <w:sz w:val="24"/>
         </w:rPr>
         <w:t xml:space="preserve">Afinámos em paralelo </w:t>
@@ -1786,6 +2512,7 @@
         <w:rPr>
           <w:rFonts w:ascii="Times New Roman" w:hAnsi="Times New Roman" w:eastAsia="Times New Roman" w:cs="Times New Roman"/>
           <w:b/>
+          <w:i w:val="0"/>
           <w:sz w:val="24"/>
         </w:rPr>
         <w:t>Random Forest</w:t>
@@ -1793,6 +2520,8 @@
       <w:r>
         <w:rPr>
           <w:rFonts w:ascii="Times New Roman" w:hAnsi="Times New Roman" w:eastAsia="Times New Roman" w:cs="Times New Roman"/>
+          <w:b w:val="0"/>
+          <w:i w:val="0"/>
           <w:sz w:val="24"/>
         </w:rPr>
         <w:t xml:space="preserve">, </w:t>
@@ -1801,6 +2530,7 @@
         <w:rPr>
           <w:rFonts w:ascii="Times New Roman" w:hAnsi="Times New Roman" w:eastAsia="Times New Roman" w:cs="Times New Roman"/>
           <w:b/>
+          <w:i w:val="0"/>
           <w:sz w:val="24"/>
         </w:rPr>
         <w:t>HistGradientBoosting</w:t>
@@ -1808,6 +2538,8 @@
       <w:r>
         <w:rPr>
           <w:rFonts w:ascii="Times New Roman" w:hAnsi="Times New Roman" w:eastAsia="Times New Roman" w:cs="Times New Roman"/>
+          <w:b w:val="0"/>
+          <w:i w:val="0"/>
           <w:sz w:val="24"/>
         </w:rPr>
         <w:t xml:space="preserve"> e </w:t>
@@ -1816,6 +2548,7 @@
         <w:rPr>
           <w:rFonts w:ascii="Times New Roman" w:hAnsi="Times New Roman" w:eastAsia="Times New Roman" w:cs="Times New Roman"/>
           <w:b/>
+          <w:i w:val="0"/>
           <w:sz w:val="24"/>
         </w:rPr>
         <w:t>Ridge</w:t>
@@ -1823,6 +2556,8 @@
       <w:r>
         <w:rPr>
           <w:rFonts w:ascii="Times New Roman" w:hAnsi="Times New Roman" w:eastAsia="Times New Roman" w:cs="Times New Roman"/>
+          <w:b w:val="0"/>
+          <w:i w:val="0"/>
           <w:sz w:val="24"/>
         </w:rPr>
         <w:t xml:space="preserve">, </w:t>
@@ -1831,6 +2566,7 @@
         <w:rPr>
           <w:rFonts w:ascii="Times New Roman" w:hAnsi="Times New Roman" w:eastAsia="Times New Roman" w:cs="Times New Roman"/>
           <w:b/>
+          <w:i w:val="0"/>
           <w:sz w:val="24"/>
         </w:rPr>
         <w:t>sem olhar para o teste</w:t>
@@ -1838,6 +2574,8 @@
       <w:r>
         <w:rPr>
           <w:rFonts w:ascii="Times New Roman" w:hAnsi="Times New Roman" w:eastAsia="Times New Roman" w:cs="Times New Roman"/>
+          <w:b w:val="0"/>
+          <w:i w:val="0"/>
           <w:sz w:val="24"/>
         </w:rPr>
         <w:t xml:space="preserve">. Na execução de referência, os melhores RMSE na CV após a busca ficaram por volta de </w:t>
@@ -1846,6 +2584,7 @@
         <w:rPr>
           <w:rFonts w:ascii="Times New Roman" w:hAnsi="Times New Roman" w:eastAsia="Times New Roman" w:cs="Times New Roman"/>
           <w:b/>
+          <w:i w:val="0"/>
           <w:sz w:val="24"/>
         </w:rPr>
         <w:t>1022,5</w:t>
@@ -1853,6 +2592,8 @@
       <w:r>
         <w:rPr>
           <w:rFonts w:ascii="Times New Roman" w:hAnsi="Times New Roman" w:eastAsia="Times New Roman" w:cs="Times New Roman"/>
+          <w:b w:val="0"/>
+          <w:i w:val="0"/>
           <w:sz w:val="24"/>
         </w:rPr>
         <w:t xml:space="preserve"> (RF), </w:t>
@@ -1861,6 +2602,7 @@
         <w:rPr>
           <w:rFonts w:ascii="Times New Roman" w:hAnsi="Times New Roman" w:eastAsia="Times New Roman" w:cs="Times New Roman"/>
           <w:b/>
+          <w:i w:val="0"/>
           <w:sz w:val="24"/>
         </w:rPr>
         <w:t>1030,6</w:t>
@@ -1868,6 +2610,8 @@
       <w:r>
         <w:rPr>
           <w:rFonts w:ascii="Times New Roman" w:hAnsi="Times New Roman" w:eastAsia="Times New Roman" w:cs="Times New Roman"/>
+          <w:b w:val="0"/>
+          <w:i w:val="0"/>
           <w:sz w:val="24"/>
         </w:rPr>
         <w:t xml:space="preserve"> (HGB) e </w:t>
@@ -1876,6 +2620,7 @@
         <w:rPr>
           <w:rFonts w:ascii="Times New Roman" w:hAnsi="Times New Roman" w:eastAsia="Times New Roman" w:cs="Times New Roman"/>
           <w:b/>
+          <w:i w:val="0"/>
           <w:sz w:val="24"/>
         </w:rPr>
         <w:t>1256,6</w:t>
@@ -1883,6 +2628,8 @@
       <w:r>
         <w:rPr>
           <w:rFonts w:ascii="Times New Roman" w:hAnsi="Times New Roman" w:eastAsia="Times New Roman" w:cs="Times New Roman"/>
+          <w:b w:val="0"/>
+          <w:i w:val="0"/>
           <w:sz w:val="24"/>
         </w:rPr>
         <w:t xml:space="preserve"> (Ridge, com </w:t>
@@ -1890,6 +2637,8 @@
       <w:r>
         <w:rPr>
           <w:rFonts w:ascii="Courier New" w:hAnsi="Courier New"/>
+          <w:b w:val="0"/>
+          <w:i w:val="0"/>
           <w:sz w:val="22"/>
         </w:rPr>
         <w:t>alpha</w:t>
@@ -1897,6 +2646,8 @@
       <w:r>
         <w:rPr>
           <w:rFonts w:ascii="Times New Roman" w:hAnsi="Times New Roman" w:eastAsia="Times New Roman" w:cs="Times New Roman"/>
+          <w:b w:val="0"/>
+          <w:i w:val="0"/>
           <w:sz w:val="24"/>
         </w:rPr>
         <w:t xml:space="preserve"> perto de </w:t>
@@ -1905,6 +2656,7 @@
         <w:rPr>
           <w:rFonts w:ascii="Times New Roman" w:hAnsi="Times New Roman" w:eastAsia="Times New Roman" w:cs="Times New Roman"/>
           <w:b/>
+          <w:i w:val="0"/>
           <w:sz w:val="24"/>
         </w:rPr>
         <w:t>3</w:t>
@@ -1912,14 +2664,35 @@
       <w:r>
         <w:rPr>
           <w:rFonts w:ascii="Times New Roman" w:hAnsi="Times New Roman" w:eastAsia="Times New Roman" w:cs="Times New Roman"/>
-          <w:sz w:val="24"/>
-        </w:rPr>
-        <w:t xml:space="preserve">). Como RF e HGB ficaram próximos na CV, e só há três *folds*, tratámos o </w:t>
+          <w:b w:val="0"/>
+          <w:i w:val="0"/>
+          <w:sz w:val="24"/>
+        </w:rPr>
+        <w:t xml:space="preserve">). Como RF e HGB ficaram próximos na CV, e só há três </w:t>
+      </w:r>
+      <w:r>
+        <w:rPr>
+          <w:rFonts w:ascii="Times New Roman" w:hAnsi="Times New Roman" w:eastAsia="Times New Roman" w:cs="Times New Roman"/>
+          <w:b w:val="0"/>
+          <w:i/>
+          <w:sz w:val="24"/>
+        </w:rPr>
+        <w:t>folds</w:t>
+      </w:r>
+      <w:r>
+        <w:rPr>
+          <w:rFonts w:ascii="Times New Roman" w:hAnsi="Times New Roman" w:eastAsia="Times New Roman" w:cs="Times New Roman"/>
+          <w:b w:val="0"/>
+          <w:i w:val="0"/>
+          <w:sz w:val="24"/>
+        </w:rPr>
+        <w:t xml:space="preserve">, tratámos o </w:t>
       </w:r>
       <w:r>
         <w:rPr>
           <w:rFonts w:ascii="Times New Roman" w:hAnsi="Times New Roman" w:eastAsia="Times New Roman" w:cs="Times New Roman"/>
           <w:b/>
+          <w:i w:val="0"/>
           <w:sz w:val="24"/>
         </w:rPr>
         <w:t>teste</w:t>
@@ -1927,6 +2700,8 @@
       <w:r>
         <w:rPr>
           <w:rFonts w:ascii="Times New Roman" w:hAnsi="Times New Roman" w:eastAsia="Times New Roman" w:cs="Times New Roman"/>
+          <w:b w:val="0"/>
+          <w:i w:val="0"/>
           <w:sz w:val="24"/>
         </w:rPr>
         <w:t xml:space="preserve"> como passo decisivo para escolher o modelo final.</w:t>
@@ -1956,14 +2731,35 @@
       <w:r>
         <w:rPr>
           <w:rFonts w:ascii="Times New Roman" w:hAnsi="Times New Roman" w:eastAsia="Times New Roman" w:cs="Times New Roman"/>
-          <w:sz w:val="24"/>
-        </w:rPr>
-        <w:t xml:space="preserve">Com os *pipelines* que a busca escolheu, fizemos </w:t>
+          <w:b w:val="0"/>
+          <w:i w:val="0"/>
+          <w:sz w:val="24"/>
+        </w:rPr>
+        <w:t xml:space="preserve">Com os </w:t>
+      </w:r>
+      <w:r>
+        <w:rPr>
+          <w:rFonts w:ascii="Times New Roman" w:hAnsi="Times New Roman" w:eastAsia="Times New Roman" w:cs="Times New Roman"/>
+          <w:b w:val="0"/>
+          <w:i/>
+          <w:sz w:val="24"/>
+        </w:rPr>
+        <w:t>pipelines</w:t>
+      </w:r>
+      <w:r>
+        <w:rPr>
+          <w:rFonts w:ascii="Times New Roman" w:hAnsi="Times New Roman" w:eastAsia="Times New Roman" w:cs="Times New Roman"/>
+          <w:b w:val="0"/>
+          <w:i w:val="0"/>
+          <w:sz w:val="24"/>
+        </w:rPr>
+        <w:t xml:space="preserve"> que a busca escolheu, fizemos </w:t>
       </w:r>
       <w:r>
         <w:rPr>
           <w:rFonts w:ascii="Times New Roman" w:hAnsi="Times New Roman" w:eastAsia="Times New Roman" w:cs="Times New Roman"/>
           <w:b/>
+          <w:i w:val="0"/>
           <w:sz w:val="24"/>
         </w:rPr>
         <w:t>uma única</w:t>
@@ -1971,6 +2767,8 @@
       <w:r>
         <w:rPr>
           <w:rFonts w:ascii="Times New Roman" w:hAnsi="Times New Roman" w:eastAsia="Times New Roman" w:cs="Times New Roman"/>
+          <w:b w:val="0"/>
+          <w:i w:val="0"/>
           <w:sz w:val="24"/>
         </w:rPr>
         <w:t xml:space="preserve"> avaliação no </w:t>
@@ -1979,6 +2777,7 @@
         <w:rPr>
           <w:rFonts w:ascii="Times New Roman" w:hAnsi="Times New Roman" w:eastAsia="Times New Roman" w:cs="Times New Roman"/>
           <w:b/>
+          <w:i w:val="0"/>
           <w:sz w:val="24"/>
         </w:rPr>
         <w:t>conjunto de teste</w:t>
@@ -1986,14 +2785,44 @@
       <w:r>
         <w:rPr>
           <w:rFonts w:ascii="Times New Roman" w:hAnsi="Times New Roman" w:eastAsia="Times New Roman" w:cs="Times New Roman"/>
-          <w:sz w:val="24"/>
-        </w:rPr>
-        <w:t xml:space="preserve"> da secção 2.2: voltámos a calcular RMSE, MAE e R² e gerámos gráficos de **resíduos *vs* predito</w:t>
+          <w:b w:val="0"/>
+          <w:i w:val="0"/>
+          <w:sz w:val="24"/>
+        </w:rPr>
+        <w:t xml:space="preserve"> da secção 2.2: voltámos a calcular RMSE, MAE e R² e gerámos gráficos de </w:t>
       </w:r>
       <w:r>
         <w:rPr>
           <w:rFonts w:ascii="Times New Roman" w:hAnsi="Times New Roman" w:eastAsia="Times New Roman" w:cs="Times New Roman"/>
           <w:b/>
+          <w:i w:val="0"/>
+          <w:sz w:val="24"/>
+        </w:rPr>
+        <w:t xml:space="preserve">resíduos </w:t>
+      </w:r>
+      <w:r>
+        <w:rPr>
+          <w:rFonts w:ascii="Times New Roman" w:hAnsi="Times New Roman" w:eastAsia="Times New Roman" w:cs="Times New Roman"/>
+          <w:b/>
+          <w:i/>
+          <w:sz w:val="24"/>
+        </w:rPr>
+        <w:t>vs</w:t>
+      </w:r>
+      <w:r>
+        <w:rPr>
+          <w:rFonts w:ascii="Times New Roman" w:hAnsi="Times New Roman" w:eastAsia="Times New Roman" w:cs="Times New Roman"/>
+          <w:b/>
+          <w:i w:val="0"/>
+          <w:sz w:val="24"/>
+        </w:rPr>
+        <w:t xml:space="preserve"> predito</w:t>
+      </w:r>
+      <w:r>
+        <w:rPr>
+          <w:rFonts w:ascii="Times New Roman" w:hAnsi="Times New Roman" w:eastAsia="Times New Roman" w:cs="Times New Roman"/>
+          <w:b w:val="0"/>
+          <w:i w:val="0"/>
           <w:sz w:val="24"/>
         </w:rPr>
         <w:t xml:space="preserve"> e de </w:t>
@@ -2001,14 +2830,35 @@
       <w:r>
         <w:rPr>
           <w:rFonts w:ascii="Times New Roman" w:hAnsi="Times New Roman" w:eastAsia="Times New Roman" w:cs="Times New Roman"/>
-          <w:sz w:val="24"/>
-        </w:rPr>
-        <w:t>predito *vs* real</w:t>
-      </w:r>
-      <w:r>
-        <w:rPr>
-          <w:rFonts w:ascii="Times New Roman" w:hAnsi="Times New Roman" w:eastAsia="Times New Roman" w:cs="Times New Roman"/>
           <w:b/>
+          <w:i w:val="0"/>
+          <w:sz w:val="24"/>
+        </w:rPr>
+        <w:t xml:space="preserve">predito </w:t>
+      </w:r>
+      <w:r>
+        <w:rPr>
+          <w:rFonts w:ascii="Times New Roman" w:hAnsi="Times New Roman" w:eastAsia="Times New Roman" w:cs="Times New Roman"/>
+          <w:b/>
+          <w:i/>
+          <w:sz w:val="24"/>
+        </w:rPr>
+        <w:t>vs</w:t>
+      </w:r>
+      <w:r>
+        <w:rPr>
+          <w:rFonts w:ascii="Times New Roman" w:hAnsi="Times New Roman" w:eastAsia="Times New Roman" w:cs="Times New Roman"/>
+          <w:b/>
+          <w:i w:val="0"/>
+          <w:sz w:val="24"/>
+        </w:rPr>
+        <w:t xml:space="preserve"> real</w:t>
+      </w:r>
+      <w:r>
+        <w:rPr>
+          <w:rFonts w:ascii="Times New Roman" w:hAnsi="Times New Roman" w:eastAsia="Times New Roman" w:cs="Times New Roman"/>
+          <w:b w:val="0"/>
+          <w:i w:val="0"/>
           <w:sz w:val="24"/>
         </w:rPr>
         <w:t xml:space="preserve"> (com amostragem quando o número de pontos atrapalha o gráfico). Não faz sentido voltar a mexer nos hiperparâmetros à luz do teste — isso deixaria de ser uma leitura imparcial da generalização —, por isso o teste foi usado </w:t>
@@ -2016,9 +2866,20 @@
       <w:r>
         <w:rPr>
           <w:rFonts w:ascii="Times New Roman" w:hAnsi="Times New Roman" w:eastAsia="Times New Roman" w:cs="Times New Roman"/>
-          <w:sz w:val="24"/>
-        </w:rPr>
-        <w:t>uma vez**, como se costuma recomendar neste tipo de trabalho.</w:t>
+          <w:b/>
+          <w:i w:val="0"/>
+          <w:sz w:val="24"/>
+        </w:rPr>
+        <w:t>uma vez</w:t>
+      </w:r>
+      <w:r>
+        <w:rPr>
+          <w:rFonts w:ascii="Times New Roman" w:hAnsi="Times New Roman" w:eastAsia="Times New Roman" w:cs="Times New Roman"/>
+          <w:b w:val="0"/>
+          <w:i w:val="0"/>
+          <w:sz w:val="24"/>
+        </w:rPr>
+        <w:t>, como se costuma recomendar neste tipo de trabalho.</w:t>
       </w:r>
     </w:p>
     <w:p>
@@ -2060,6 +2921,8 @@
       <w:r>
         <w:rPr>
           <w:rFonts w:ascii="Times New Roman" w:hAnsi="Times New Roman" w:eastAsia="Times New Roman" w:cs="Times New Roman"/>
+          <w:b w:val="0"/>
+          <w:i w:val="0"/>
           <w:sz w:val="24"/>
         </w:rPr>
         <w:t xml:space="preserve">Os pontos descritivos que mais influenciaram a modelagem já estão resumidos em 2.1 (forma do </w:t>
@@ -2068,6 +2931,7 @@
         <w:rPr>
           <w:rFonts w:ascii="Times New Roman" w:hAnsi="Times New Roman" w:eastAsia="Times New Roman" w:cs="Times New Roman"/>
           <w:b/>
+          <w:i w:val="0"/>
           <w:sz w:val="24"/>
         </w:rPr>
         <w:t>Valor total</w:t>
@@ -2075,6 +2939,8 @@
       <w:r>
         <w:rPr>
           <w:rFonts w:ascii="Times New Roman" w:hAnsi="Times New Roman" w:eastAsia="Times New Roman" w:cs="Times New Roman"/>
+          <w:b w:val="0"/>
+          <w:i w:val="0"/>
           <w:sz w:val="24"/>
         </w:rPr>
         <w:t xml:space="preserve">, zeros e ajustes no </w:t>
@@ -2083,6 +2949,7 @@
         <w:rPr>
           <w:rFonts w:ascii="Times New Roman" w:hAnsi="Times New Roman" w:eastAsia="Times New Roman" w:cs="Times New Roman"/>
           <w:b/>
+          <w:i w:val="0"/>
           <w:sz w:val="24"/>
         </w:rPr>
         <w:t>Valor passagem</w:t>
@@ -2090,6 +2957,8 @@
       <w:r>
         <w:rPr>
           <w:rFonts w:ascii="Times New Roman" w:hAnsi="Times New Roman" w:eastAsia="Times New Roman" w:cs="Times New Roman"/>
+          <w:b w:val="0"/>
+          <w:i w:val="0"/>
           <w:sz w:val="24"/>
         </w:rPr>
         <w:t xml:space="preserve">, falhas em campos geográficos, ligação do custo à </w:t>
@@ -2098,6 +2967,7 @@
         <w:rPr>
           <w:rFonts w:ascii="Times New Roman" w:hAnsi="Times New Roman" w:eastAsia="Times New Roman" w:cs="Times New Roman"/>
           <w:b/>
+          <w:i w:val="0"/>
           <w:sz w:val="24"/>
         </w:rPr>
         <w:t>duração</w:t>
@@ -2105,6 +2975,8 @@
       <w:r>
         <w:rPr>
           <w:rFonts w:ascii="Times New Roman" w:hAnsi="Times New Roman" w:eastAsia="Times New Roman" w:cs="Times New Roman"/>
+          <w:b w:val="0"/>
+          <w:i w:val="0"/>
           <w:sz w:val="24"/>
         </w:rPr>
         <w:t xml:space="preserve"> e às </w:t>
@@ -2113,6 +2985,7 @@
         <w:rPr>
           <w:rFonts w:ascii="Times New Roman" w:hAnsi="Times New Roman" w:eastAsia="Times New Roman" w:cs="Times New Roman"/>
           <w:b/>
+          <w:i w:val="0"/>
           <w:sz w:val="24"/>
         </w:rPr>
         <w:t>diárias</w:t>
@@ -2120,6 +2993,8 @@
       <w:r>
         <w:rPr>
           <w:rFonts w:ascii="Times New Roman" w:hAnsi="Times New Roman" w:eastAsia="Times New Roman" w:cs="Times New Roman"/>
+          <w:b w:val="0"/>
+          <w:i w:val="0"/>
           <w:sz w:val="24"/>
         </w:rPr>
         <w:t xml:space="preserve">, e decisão de não usar o </w:t>
@@ -2128,6 +3003,7 @@
         <w:rPr>
           <w:rFonts w:ascii="Times New Roman" w:hAnsi="Times New Roman" w:eastAsia="Times New Roman" w:cs="Times New Roman"/>
           <w:b/>
+          <w:i w:val="0"/>
           <w:sz w:val="24"/>
         </w:rPr>
         <w:t>valor monetário das diárias</w:t>
@@ -2135,6 +3011,8 @@
       <w:r>
         <w:rPr>
           <w:rFonts w:ascii="Times New Roman" w:hAnsi="Times New Roman" w:eastAsia="Times New Roman" w:cs="Times New Roman"/>
+          <w:b w:val="0"/>
+          <w:i w:val="0"/>
           <w:sz w:val="24"/>
         </w:rPr>
         <w:t xml:space="preserve"> como preditora). Não repetimos aqui os gráficos; eles continuam no notebook da Atividade 1.</w:t>
@@ -2164,6 +3042,8 @@
       <w:r>
         <w:rPr>
           <w:rFonts w:ascii="Times New Roman" w:hAnsi="Times New Roman" w:eastAsia="Times New Roman" w:cs="Times New Roman"/>
+          <w:b w:val="0"/>
+          <w:i w:val="0"/>
           <w:sz w:val="24"/>
         </w:rPr>
         <w:t xml:space="preserve">Na validação cruzada do treino, a </w:t>
@@ -2172,6 +3052,7 @@
         <w:rPr>
           <w:rFonts w:ascii="Times New Roman" w:hAnsi="Times New Roman" w:eastAsia="Times New Roman" w:cs="Times New Roman"/>
           <w:b/>
+          <w:i w:val="0"/>
           <w:sz w:val="24"/>
         </w:rPr>
         <w:t>Random Forest</w:t>
@@ -2179,14 +3060,35 @@
       <w:r>
         <w:rPr>
           <w:rFonts w:ascii="Times New Roman" w:hAnsi="Times New Roman" w:eastAsia="Times New Roman" w:cs="Times New Roman"/>
-          <w:sz w:val="24"/>
-        </w:rPr>
-        <w:t xml:space="preserve"> teve o menor RMSE médio em relação ao HistGradientBoosting e ao Ridge; o Ridge ficou claramente atrás. Em todos os modelos, o RMSE médio por *fold* foi maior que o MAE, o que indica </w:t>
+          <w:b w:val="0"/>
+          <w:i w:val="0"/>
+          <w:sz w:val="24"/>
+        </w:rPr>
+        <w:t xml:space="preserve"> teve o menor RMSE médio em relação ao HistGradientBoosting e ao Ridge; o Ridge ficou claramente atrás. Em todos os modelos, o RMSE médio por </w:t>
+      </w:r>
+      <w:r>
+        <w:rPr>
+          <w:rFonts w:ascii="Times New Roman" w:hAnsi="Times New Roman" w:eastAsia="Times New Roman" w:cs="Times New Roman"/>
+          <w:b w:val="0"/>
+          <w:i/>
+          <w:sz w:val="24"/>
+        </w:rPr>
+        <w:t>fold</w:t>
+      </w:r>
+      <w:r>
+        <w:rPr>
+          <w:rFonts w:ascii="Times New Roman" w:hAnsi="Times New Roman" w:eastAsia="Times New Roman" w:cs="Times New Roman"/>
+          <w:b w:val="0"/>
+          <w:i w:val="0"/>
+          <w:sz w:val="24"/>
+        </w:rPr>
+        <w:t xml:space="preserve"> foi maior que o MAE, o que indica </w:t>
       </w:r>
       <w:r>
         <w:rPr>
           <w:rFonts w:ascii="Times New Roman" w:hAnsi="Times New Roman" w:eastAsia="Times New Roman" w:cs="Times New Roman"/>
           <w:b/>
+          <w:i w:val="0"/>
           <w:sz w:val="24"/>
         </w:rPr>
         <w:t>alguns erros bem grandes</w:t>
@@ -2194,6 +3096,8 @@
       <w:r>
         <w:rPr>
           <w:rFonts w:ascii="Times New Roman" w:hAnsi="Times New Roman" w:eastAsia="Times New Roman" w:cs="Times New Roman"/>
+          <w:b w:val="0"/>
+          <w:i w:val="0"/>
           <w:sz w:val="24"/>
         </w:rPr>
         <w:t xml:space="preserve">, coerente com a </w:t>
@@ -2202,6 +3106,7 @@
         <w:rPr>
           <w:rFonts w:ascii="Times New Roman" w:hAnsi="Times New Roman" w:eastAsia="Times New Roman" w:cs="Times New Roman"/>
           <w:b/>
+          <w:i w:val="0"/>
           <w:sz w:val="24"/>
         </w:rPr>
         <w:t>cauda longa</w:t>
@@ -2209,6 +3114,8 @@
       <w:r>
         <w:rPr>
           <w:rFonts w:ascii="Times New Roman" w:hAnsi="Times New Roman" w:eastAsia="Times New Roman" w:cs="Times New Roman"/>
+          <w:b w:val="0"/>
+          <w:i w:val="0"/>
           <w:sz w:val="24"/>
         </w:rPr>
         <w:t xml:space="preserve"> do alvo.</w:t>
@@ -2223,6 +3130,8 @@
       <w:r>
         <w:rPr>
           <w:rFonts w:ascii="Times New Roman" w:hAnsi="Times New Roman" w:eastAsia="Times New Roman" w:cs="Times New Roman"/>
+          <w:b w:val="0"/>
+          <w:i w:val="0"/>
           <w:sz w:val="24"/>
         </w:rPr>
         <w:t>Depois da busca de hiperparâmetros, a RF continuou na frente na CV; o Ridge não recuperou.</w:t>
@@ -2237,6 +3146,8 @@
       <w:r>
         <w:rPr>
           <w:rFonts w:ascii="Times New Roman" w:hAnsi="Times New Roman" w:eastAsia="Times New Roman" w:cs="Times New Roman"/>
+          <w:b w:val="0"/>
+          <w:i w:val="0"/>
           <w:sz w:val="24"/>
         </w:rPr>
         <w:t xml:space="preserve">No </w:t>
@@ -2245,6 +3156,7 @@
         <w:rPr>
           <w:rFonts w:ascii="Times New Roman" w:hAnsi="Times New Roman" w:eastAsia="Times New Roman" w:cs="Times New Roman"/>
           <w:b/>
+          <w:i w:val="0"/>
           <w:sz w:val="24"/>
         </w:rPr>
         <w:t>teste</w:t>
@@ -2252,6 +3164,8 @@
       <w:r>
         <w:rPr>
           <w:rFonts w:ascii="Times New Roman" w:hAnsi="Times New Roman" w:eastAsia="Times New Roman" w:cs="Times New Roman"/>
+          <w:b w:val="0"/>
+          <w:i w:val="0"/>
           <w:sz w:val="24"/>
         </w:rPr>
         <w:t xml:space="preserve"> (números da execução registada no notebook):</w:t>
@@ -2592,6 +3506,8 @@
       <w:r>
         <w:rPr>
           <w:rFonts w:ascii="Times New Roman" w:hAnsi="Times New Roman" w:eastAsia="Times New Roman" w:cs="Times New Roman"/>
+          <w:b w:val="0"/>
+          <w:i w:val="0"/>
           <w:sz w:val="24"/>
         </w:rPr>
         <w:t xml:space="preserve">O MAE da RF no teste ficou na ordem dos </w:t>
@@ -2600,6 +3516,7 @@
         <w:rPr>
           <w:rFonts w:ascii="Times New Roman" w:hAnsi="Times New Roman" w:eastAsia="Times New Roman" w:cs="Times New Roman"/>
           <w:b/>
+          <w:i w:val="0"/>
           <w:sz w:val="24"/>
         </w:rPr>
         <w:t>R$ 303</w:t>
@@ -2607,6 +3524,8 @@
       <w:r>
         <w:rPr>
           <w:rFonts w:ascii="Times New Roman" w:hAnsi="Times New Roman" w:eastAsia="Times New Roman" w:cs="Times New Roman"/>
+          <w:b w:val="0"/>
+          <w:i w:val="0"/>
           <w:sz w:val="24"/>
         </w:rPr>
         <w:t xml:space="preserve"> por linha em média; o RMSE maior diz que ainda há registos em que o erro dispara.</w:t>
@@ -2621,6 +3540,8 @@
       <w:r>
         <w:rPr>
           <w:rFonts w:ascii="Times New Roman" w:hAnsi="Times New Roman" w:eastAsia="Times New Roman" w:cs="Times New Roman"/>
+          <w:b w:val="0"/>
+          <w:i w:val="0"/>
           <w:sz w:val="24"/>
         </w:rPr>
         <w:t xml:space="preserve">A </w:t>
@@ -2629,6 +3550,7 @@
         <w:rPr>
           <w:rFonts w:ascii="Times New Roman" w:hAnsi="Times New Roman" w:eastAsia="Times New Roman" w:cs="Times New Roman"/>
           <w:b/>
+          <w:i w:val="0"/>
           <w:sz w:val="24"/>
         </w:rPr>
         <w:t>Figura 1</w:t>
@@ -2636,6 +3558,8 @@
       <w:r>
         <w:rPr>
           <w:rFonts w:ascii="Times New Roman" w:hAnsi="Times New Roman" w:eastAsia="Times New Roman" w:cs="Times New Roman"/>
+          <w:b w:val="0"/>
+          <w:i w:val="0"/>
           <w:sz w:val="24"/>
         </w:rPr>
         <w:t xml:space="preserve"> ajuda a ver o erro </w:t>
@@ -2644,6 +3568,7 @@
         <w:rPr>
           <w:rFonts w:ascii="Times New Roman" w:hAnsi="Times New Roman" w:eastAsia="Times New Roman" w:cs="Times New Roman"/>
           <w:b/>
+          <w:i w:val="0"/>
           <w:sz w:val="24"/>
         </w:rPr>
         <w:t>linha a linha</w:t>
@@ -2651,6 +3576,8 @@
       <w:r>
         <w:rPr>
           <w:rFonts w:ascii="Times New Roman" w:hAnsi="Times New Roman" w:eastAsia="Times New Roman" w:cs="Times New Roman"/>
+          <w:b w:val="0"/>
+          <w:i w:val="0"/>
           <w:sz w:val="24"/>
         </w:rPr>
         <w:t xml:space="preserve"> no teste: em cada ponto, o eixo vertical é o </w:t>
@@ -2659,6 +3586,7 @@
         <w:rPr>
           <w:rFonts w:ascii="Times New Roman" w:hAnsi="Times New Roman" w:eastAsia="Times New Roman" w:cs="Times New Roman"/>
           <w:b/>
+          <w:i w:val="0"/>
           <w:sz w:val="24"/>
         </w:rPr>
         <w:t>resíduo</w:t>
@@ -2666,6 +3594,8 @@
       <w:r>
         <w:rPr>
           <w:rFonts w:ascii="Times New Roman" w:hAnsi="Times New Roman" w:eastAsia="Times New Roman" w:cs="Times New Roman"/>
+          <w:b w:val="0"/>
+          <w:i w:val="0"/>
           <w:sz w:val="24"/>
         </w:rPr>
         <w:t xml:space="preserve"> (valor observado menos valor predito pela Random Forest) e o horizontal é o </w:t>
@@ -2674,6 +3604,7 @@
         <w:rPr>
           <w:rFonts w:ascii="Times New Roman" w:hAnsi="Times New Roman" w:eastAsia="Times New Roman" w:cs="Times New Roman"/>
           <w:b/>
+          <w:i w:val="0"/>
           <w:sz w:val="24"/>
         </w:rPr>
         <w:t>próprio valor predito</w:t>
@@ -2681,6 +3612,8 @@
       <w:r>
         <w:rPr>
           <w:rFonts w:ascii="Times New Roman" w:hAnsi="Times New Roman" w:eastAsia="Times New Roman" w:cs="Times New Roman"/>
+          <w:b w:val="0"/>
+          <w:i w:val="0"/>
           <w:sz w:val="24"/>
         </w:rPr>
         <w:t xml:space="preserve">. Espera-se uma nuvem em torno de </w:t>
@@ -2689,6 +3622,7 @@
         <w:rPr>
           <w:rFonts w:ascii="Times New Roman" w:hAnsi="Times New Roman" w:eastAsia="Times New Roman" w:cs="Times New Roman"/>
           <w:b/>
+          <w:i w:val="0"/>
           <w:sz w:val="24"/>
         </w:rPr>
         <w:t>zero</w:t>
@@ -2696,6 +3630,8 @@
       <w:r>
         <w:rPr>
           <w:rFonts w:ascii="Times New Roman" w:hAnsi="Times New Roman" w:eastAsia="Times New Roman" w:cs="Times New Roman"/>
+          <w:b w:val="0"/>
+          <w:i w:val="0"/>
           <w:sz w:val="24"/>
         </w:rPr>
         <w:t xml:space="preserve">; se o espalhamento </w:t>
@@ -2704,6 +3640,7 @@
         <w:rPr>
           <w:rFonts w:ascii="Times New Roman" w:hAnsi="Times New Roman" w:eastAsia="Times New Roman" w:cs="Times New Roman"/>
           <w:b/>
+          <w:i w:val="0"/>
           <w:sz w:val="24"/>
         </w:rPr>
         <w:t>crescer</w:t>
@@ -2711,6 +3648,8 @@
       <w:r>
         <w:rPr>
           <w:rFonts w:ascii="Times New Roman" w:hAnsi="Times New Roman" w:eastAsia="Times New Roman" w:cs="Times New Roman"/>
+          <w:b w:val="0"/>
+          <w:i w:val="0"/>
           <w:sz w:val="24"/>
         </w:rPr>
         <w:t xml:space="preserve"> quando o predito aumenta, isso indica que o modelo erra mais nos totais mais altos (ideia retomada na secção 3.3).</w:t>
@@ -2781,6 +3720,8 @@
       <w:r>
         <w:rPr>
           <w:rFonts w:ascii="Times New Roman" w:hAnsi="Times New Roman" w:eastAsia="Times New Roman" w:cs="Times New Roman"/>
+          <w:b w:val="0"/>
+          <w:i w:val="0"/>
           <w:sz w:val="24"/>
         </w:rPr>
         <w:t xml:space="preserve">A </w:t>
@@ -2789,6 +3730,7 @@
         <w:rPr>
           <w:rFonts w:ascii="Times New Roman" w:hAnsi="Times New Roman" w:eastAsia="Times New Roman" w:cs="Times New Roman"/>
           <w:b/>
+          <w:i w:val="0"/>
           <w:sz w:val="24"/>
         </w:rPr>
         <w:t>Figura 2</w:t>
@@ -2796,6 +3738,8 @@
       <w:r>
         <w:rPr>
           <w:rFonts w:ascii="Times New Roman" w:hAnsi="Times New Roman" w:eastAsia="Times New Roman" w:cs="Times New Roman"/>
+          <w:b w:val="0"/>
+          <w:i w:val="0"/>
           <w:sz w:val="24"/>
         </w:rPr>
         <w:t xml:space="preserve"> compara </w:t>
@@ -2804,6 +3748,7 @@
         <w:rPr>
           <w:rFonts w:ascii="Times New Roman" w:hAnsi="Times New Roman" w:eastAsia="Times New Roman" w:cs="Times New Roman"/>
           <w:b/>
+          <w:i w:val="0"/>
           <w:sz w:val="24"/>
         </w:rPr>
         <w:t>total observado</w:t>
@@ -2811,6 +3756,8 @@
       <w:r>
         <w:rPr>
           <w:rFonts w:ascii="Times New Roman" w:hAnsi="Times New Roman" w:eastAsia="Times New Roman" w:cs="Times New Roman"/>
+          <w:b w:val="0"/>
+          <w:i w:val="0"/>
           <w:sz w:val="24"/>
         </w:rPr>
         <w:t xml:space="preserve"> e </w:t>
@@ -2819,6 +3766,7 @@
         <w:rPr>
           <w:rFonts w:ascii="Times New Roman" w:hAnsi="Times New Roman" w:eastAsia="Times New Roman" w:cs="Times New Roman"/>
           <w:b/>
+          <w:i w:val="0"/>
           <w:sz w:val="24"/>
         </w:rPr>
         <w:t>total predito</w:t>
@@ -2826,6 +3774,8 @@
       <w:r>
         <w:rPr>
           <w:rFonts w:ascii="Times New Roman" w:hAnsi="Times New Roman" w:eastAsia="Times New Roman" w:cs="Times New Roman"/>
+          <w:b w:val="0"/>
+          <w:i w:val="0"/>
           <w:sz w:val="24"/>
         </w:rPr>
         <w:t xml:space="preserve"> numa </w:t>
@@ -2834,6 +3784,7 @@
         <w:rPr>
           <w:rFonts w:ascii="Times New Roman" w:hAnsi="Times New Roman" w:eastAsia="Times New Roman" w:cs="Times New Roman"/>
           <w:b/>
+          <w:i w:val="0"/>
           <w:sz w:val="24"/>
         </w:rPr>
         <w:t>amostra</w:t>
@@ -2841,6 +3792,8 @@
       <w:r>
         <w:rPr>
           <w:rFonts w:ascii="Times New Roman" w:hAnsi="Times New Roman" w:eastAsia="Times New Roman" w:cs="Times New Roman"/>
+          <w:b w:val="0"/>
+          <w:i w:val="0"/>
           <w:sz w:val="24"/>
         </w:rPr>
         <w:t xml:space="preserve"> de linhas (o volume completo tornaria o gráfico ilegível). A referência visual é a </w:t>
@@ -2849,6 +3802,7 @@
         <w:rPr>
           <w:rFonts w:ascii="Times New Roman" w:hAnsi="Times New Roman" w:eastAsia="Times New Roman" w:cs="Times New Roman"/>
           <w:b/>
+          <w:i w:val="0"/>
           <w:sz w:val="24"/>
         </w:rPr>
         <w:t>diagonal</w:t>
@@ -2856,6 +3810,8 @@
       <w:r>
         <w:rPr>
           <w:rFonts w:ascii="Times New Roman" w:hAnsi="Times New Roman" w:eastAsia="Times New Roman" w:cs="Times New Roman"/>
+          <w:b w:val="0"/>
+          <w:i w:val="0"/>
           <w:sz w:val="24"/>
         </w:rPr>
         <w:t xml:space="preserve"> onde predito = observado: quanto mais os pontos se aproximam dela, melhor o ajuste; desvios para baixo ou para cima mostram sub ou superestimação.</w:t>
@@ -2941,6 +3897,8 @@
       <w:r>
         <w:rPr>
           <w:rFonts w:ascii="Times New Roman" w:hAnsi="Times New Roman" w:eastAsia="Times New Roman" w:cs="Times New Roman"/>
+          <w:b w:val="0"/>
+          <w:i w:val="0"/>
           <w:sz w:val="24"/>
         </w:rPr>
         <w:t xml:space="preserve">No teste, a </w:t>
@@ -2949,6 +3907,7 @@
         <w:rPr>
           <w:rFonts w:ascii="Times New Roman" w:hAnsi="Times New Roman" w:eastAsia="Times New Roman" w:cs="Times New Roman"/>
           <w:b/>
+          <w:i w:val="0"/>
           <w:sz w:val="24"/>
         </w:rPr>
         <w:t>Random Forest</w:t>
@@ -2956,6 +3915,8 @@
       <w:r>
         <w:rPr>
           <w:rFonts w:ascii="Times New Roman" w:hAnsi="Times New Roman" w:eastAsia="Times New Roman" w:cs="Times New Roman"/>
+          <w:b w:val="0"/>
+          <w:i w:val="0"/>
           <w:sz w:val="24"/>
         </w:rPr>
         <w:t xml:space="preserve"> foi melhor nos três indicadores do que o Ridge e o HistGradientBoosting. Modelos com </w:t>
@@ -2964,6 +3925,7 @@
         <w:rPr>
           <w:rFonts w:ascii="Times New Roman" w:hAnsi="Times New Roman" w:eastAsia="Times New Roman" w:cs="Times New Roman"/>
           <w:b/>
+          <w:i w:val="0"/>
           <w:sz w:val="24"/>
         </w:rPr>
         <w:t>muitas árvores em conjunto</w:t>
@@ -2971,6 +3933,8 @@
       <w:r>
         <w:rPr>
           <w:rFonts w:ascii="Times New Roman" w:hAnsi="Times New Roman" w:eastAsia="Times New Roman" w:cs="Times New Roman"/>
+          <w:b w:val="0"/>
+          <w:i w:val="0"/>
           <w:sz w:val="24"/>
         </w:rPr>
         <w:t xml:space="preserve"> costumam lidar melhor com </w:t>
@@ -2979,6 +3943,7 @@
         <w:rPr>
           <w:rFonts w:ascii="Times New Roman" w:hAnsi="Times New Roman" w:eastAsia="Times New Roman" w:cs="Times New Roman"/>
           <w:b/>
+          <w:i w:val="0"/>
           <w:sz w:val="24"/>
         </w:rPr>
         <w:t>cruzamentos</w:t>
@@ -2986,6 +3951,8 @@
       <w:r>
         <w:rPr>
           <w:rFonts w:ascii="Times New Roman" w:hAnsi="Times New Roman" w:eastAsia="Times New Roman" w:cs="Times New Roman"/>
+          <w:b w:val="0"/>
+          <w:i w:val="0"/>
           <w:sz w:val="24"/>
         </w:rPr>
         <w:t xml:space="preserve"> e </w:t>
@@ -2994,6 +3961,7 @@
         <w:rPr>
           <w:rFonts w:ascii="Times New Roman" w:hAnsi="Times New Roman" w:eastAsia="Times New Roman" w:cs="Times New Roman"/>
           <w:b/>
+          <w:i w:val="0"/>
           <w:sz w:val="24"/>
         </w:rPr>
         <w:t>curvas</w:t>
@@ -3001,14 +3969,35 @@
       <w:r>
         <w:rPr>
           <w:rFonts w:ascii="Times New Roman" w:hAnsi="Times New Roman" w:eastAsia="Times New Roman" w:cs="Times New Roman"/>
-          <w:sz w:val="24"/>
-        </w:rPr>
-        <w:t xml:space="preserve"> quando há muitas categorias depois do *one-hot*, situação em que um modelo </w:t>
+          <w:b w:val="0"/>
+          <w:i w:val="0"/>
+          <w:sz w:val="24"/>
+        </w:rPr>
+        <w:t xml:space="preserve"> quando há muitas categorias depois do </w:t>
+      </w:r>
+      <w:r>
+        <w:rPr>
+          <w:rFonts w:ascii="Times New Roman" w:hAnsi="Times New Roman" w:eastAsia="Times New Roman" w:cs="Times New Roman"/>
+          <w:b w:val="0"/>
+          <w:i/>
+          <w:sz w:val="24"/>
+        </w:rPr>
+        <w:t>one-hot</w:t>
+      </w:r>
+      <w:r>
+        <w:rPr>
+          <w:rFonts w:ascii="Times New Roman" w:hAnsi="Times New Roman" w:eastAsia="Times New Roman" w:cs="Times New Roman"/>
+          <w:b w:val="0"/>
+          <w:i w:val="0"/>
+          <w:sz w:val="24"/>
+        </w:rPr>
+        <w:t xml:space="preserve">, situação em que um modelo </w:t>
       </w:r>
       <w:r>
         <w:rPr>
           <w:rFonts w:ascii="Times New Roman" w:hAnsi="Times New Roman" w:eastAsia="Times New Roman" w:cs="Times New Roman"/>
           <w:b/>
+          <w:i w:val="0"/>
           <w:sz w:val="24"/>
         </w:rPr>
         <w:t>só linear</w:t>
@@ -3016,6 +4005,8 @@
       <w:r>
         <w:rPr>
           <w:rFonts w:ascii="Times New Roman" w:hAnsi="Times New Roman" w:eastAsia="Times New Roman" w:cs="Times New Roman"/>
+          <w:b w:val="0"/>
+          <w:i w:val="0"/>
           <w:sz w:val="24"/>
         </w:rPr>
         <w:t xml:space="preserve"> costuma sofrer. O HistGradientBoosting chegou perto da RF na CV, mas </w:t>
@@ -3024,6 +4015,7 @@
         <w:rPr>
           <w:rFonts w:ascii="Times New Roman" w:hAnsi="Times New Roman" w:eastAsia="Times New Roman" w:cs="Times New Roman"/>
           <w:b/>
+          <w:i w:val="0"/>
           <w:sz w:val="24"/>
         </w:rPr>
         <w:t>não acompanhou</w:t>
@@ -3031,9 +4023,47 @@
       <w:r>
         <w:rPr>
           <w:rFonts w:ascii="Times New Roman" w:hAnsi="Times New Roman" w:eastAsia="Times New Roman" w:cs="Times New Roman"/>
-          <w:sz w:val="24"/>
-        </w:rPr>
-        <w:t xml:space="preserve"> no *hold-out* desta corrida; com poucos *folds* e busca aleatória, o teste acabou por desempatar.</w:t>
+          <w:b w:val="0"/>
+          <w:i w:val="0"/>
+          <w:sz w:val="24"/>
+        </w:rPr>
+        <w:t xml:space="preserve"> no </w:t>
+      </w:r>
+      <w:r>
+        <w:rPr>
+          <w:rFonts w:ascii="Times New Roman" w:hAnsi="Times New Roman" w:eastAsia="Times New Roman" w:cs="Times New Roman"/>
+          <w:b w:val="0"/>
+          <w:i/>
+          <w:sz w:val="24"/>
+        </w:rPr>
+        <w:t>hold-out</w:t>
+      </w:r>
+      <w:r>
+        <w:rPr>
+          <w:rFonts w:ascii="Times New Roman" w:hAnsi="Times New Roman" w:eastAsia="Times New Roman" w:cs="Times New Roman"/>
+          <w:b w:val="0"/>
+          <w:i w:val="0"/>
+          <w:sz w:val="24"/>
+        </w:rPr>
+        <w:t xml:space="preserve"> desta corrida; com poucos </w:t>
+      </w:r>
+      <w:r>
+        <w:rPr>
+          <w:rFonts w:ascii="Times New Roman" w:hAnsi="Times New Roman" w:eastAsia="Times New Roman" w:cs="Times New Roman"/>
+          <w:b w:val="0"/>
+          <w:i/>
+          <w:sz w:val="24"/>
+        </w:rPr>
+        <w:t>folds</w:t>
+      </w:r>
+      <w:r>
+        <w:rPr>
+          <w:rFonts w:ascii="Times New Roman" w:hAnsi="Times New Roman" w:eastAsia="Times New Roman" w:cs="Times New Roman"/>
+          <w:b w:val="0"/>
+          <w:i w:val="0"/>
+          <w:sz w:val="24"/>
+        </w:rPr>
+        <w:t xml:space="preserve"> e busca aleatória, o teste acabou por desempatar.</w:t>
       </w:r>
     </w:p>
     <w:p>
@@ -3045,6 +4075,8 @@
       <w:r>
         <w:rPr>
           <w:rFonts w:ascii="Times New Roman" w:hAnsi="Times New Roman" w:eastAsia="Times New Roman" w:cs="Times New Roman"/>
+          <w:b w:val="0"/>
+          <w:i w:val="0"/>
           <w:sz w:val="24"/>
         </w:rPr>
         <w:t>Os resíduos parecem mais espalhados quando o valor predito é alto (</w:t>
@@ -3053,6 +4085,7 @@
         <w:rPr>
           <w:rFonts w:ascii="Times New Roman" w:hAnsi="Times New Roman" w:eastAsia="Times New Roman" w:cs="Times New Roman"/>
           <w:b/>
+          <w:i w:val="0"/>
           <w:sz w:val="24"/>
         </w:rPr>
         <w:t>heterocedasticidade</w:t>
@@ -3060,14 +4093,44 @@
       <w:r>
         <w:rPr>
           <w:rFonts w:ascii="Times New Roman" w:hAnsi="Times New Roman" w:eastAsia="Times New Roman" w:cs="Times New Roman"/>
-          <w:sz w:val="24"/>
-        </w:rPr>
-        <w:t>). No gráfico **predito *vs* observado</w:t>
+          <w:b w:val="0"/>
+          <w:i w:val="0"/>
+          <w:sz w:val="24"/>
+        </w:rPr>
+        <w:t xml:space="preserve">). No gráfico </w:t>
       </w:r>
       <w:r>
         <w:rPr>
           <w:rFonts w:ascii="Times New Roman" w:hAnsi="Times New Roman" w:eastAsia="Times New Roman" w:cs="Times New Roman"/>
           <w:b/>
+          <w:i w:val="0"/>
+          <w:sz w:val="24"/>
+        </w:rPr>
+        <w:t xml:space="preserve">predito </w:t>
+      </w:r>
+      <w:r>
+        <w:rPr>
+          <w:rFonts w:ascii="Times New Roman" w:hAnsi="Times New Roman" w:eastAsia="Times New Roman" w:cs="Times New Roman"/>
+          <w:b/>
+          <w:i/>
+          <w:sz w:val="24"/>
+        </w:rPr>
+        <w:t>vs</w:t>
+      </w:r>
+      <w:r>
+        <w:rPr>
+          <w:rFonts w:ascii="Times New Roman" w:hAnsi="Times New Roman" w:eastAsia="Times New Roman" w:cs="Times New Roman"/>
+          <w:b/>
+          <w:i w:val="0"/>
+          <w:sz w:val="24"/>
+        </w:rPr>
+        <w:t xml:space="preserve"> observado</w:t>
+      </w:r>
+      <w:r>
+        <w:rPr>
+          <w:rFonts w:ascii="Times New Roman" w:hAnsi="Times New Roman" w:eastAsia="Times New Roman" w:cs="Times New Roman"/>
+          <w:b w:val="0"/>
+          <w:i w:val="0"/>
           <w:sz w:val="24"/>
         </w:rPr>
         <w:t xml:space="preserve">, o miolo acompanha a diagonal; nos totais muito altos o modelo tende a </w:t>
@@ -3075,9 +4138,20 @@
       <w:r>
         <w:rPr>
           <w:rFonts w:ascii="Times New Roman" w:hAnsi="Times New Roman" w:eastAsia="Times New Roman" w:cs="Times New Roman"/>
-          <w:sz w:val="24"/>
-        </w:rPr>
-        <w:t>subestimar**, o que é frequente quando a função de perda é quadrática.</w:t>
+          <w:b/>
+          <w:i w:val="0"/>
+          <w:sz w:val="24"/>
+        </w:rPr>
+        <w:t>subestimar</w:t>
+      </w:r>
+      <w:r>
+        <w:rPr>
+          <w:rFonts w:ascii="Times New Roman" w:hAnsi="Times New Roman" w:eastAsia="Times New Roman" w:cs="Times New Roman"/>
+          <w:b w:val="0"/>
+          <w:i w:val="0"/>
+          <w:sz w:val="24"/>
+        </w:rPr>
+        <w:t>, o que é frequente quando a função de perda é quadrática.</w:t>
       </w:r>
     </w:p>
     <w:p>
@@ -3104,6 +4178,8 @@
       <w:r>
         <w:rPr>
           <w:rFonts w:ascii="Times New Roman" w:hAnsi="Times New Roman" w:eastAsia="Times New Roman" w:cs="Times New Roman"/>
+          <w:b w:val="0"/>
+          <w:i w:val="0"/>
           <w:sz w:val="24"/>
         </w:rPr>
         <w:t xml:space="preserve">Linhas da </w:t>
@@ -3112,6 +4188,7 @@
         <w:rPr>
           <w:rFonts w:ascii="Times New Roman" w:hAnsi="Times New Roman" w:eastAsia="Times New Roman" w:cs="Times New Roman"/>
           <w:b/>
+          <w:i w:val="0"/>
           <w:sz w:val="24"/>
         </w:rPr>
         <w:t>mesma viagem</w:t>
@@ -3119,6 +4196,8 @@
       <w:r>
         <w:rPr>
           <w:rFonts w:ascii="Times New Roman" w:hAnsi="Times New Roman" w:eastAsia="Times New Roman" w:cs="Times New Roman"/>
+          <w:b w:val="0"/>
+          <w:i w:val="0"/>
           <w:sz w:val="24"/>
         </w:rPr>
         <w:t xml:space="preserve"> podem estar ligadas entre si; aqui tratámo-las como independentes, o que é uma </w:t>
@@ -3127,6 +4206,7 @@
         <w:rPr>
           <w:rFonts w:ascii="Times New Roman" w:hAnsi="Times New Roman" w:eastAsia="Times New Roman" w:cs="Times New Roman"/>
           <w:b/>
+          <w:i w:val="0"/>
           <w:sz w:val="24"/>
         </w:rPr>
         <w:t>simplificação</w:t>
@@ -3134,6 +4214,8 @@
       <w:r>
         <w:rPr>
           <w:rFonts w:ascii="Times New Roman" w:hAnsi="Times New Roman" w:eastAsia="Times New Roman" w:cs="Times New Roman"/>
+          <w:b w:val="0"/>
+          <w:i w:val="0"/>
           <w:sz w:val="24"/>
         </w:rPr>
         <w:t xml:space="preserve">. A CV e a busca de hiperparâmetros correram sobre </w:t>
@@ -3142,6 +4224,7 @@
         <w:rPr>
           <w:rFonts w:ascii="Times New Roman" w:hAnsi="Times New Roman" w:eastAsia="Times New Roman" w:cs="Times New Roman"/>
           <w:b/>
+          <w:i w:val="0"/>
           <w:sz w:val="24"/>
         </w:rPr>
         <w:t>subamostras</w:t>
@@ -3149,6 +4232,8 @@
       <w:r>
         <w:rPr>
           <w:rFonts w:ascii="Times New Roman" w:hAnsi="Times New Roman" w:eastAsia="Times New Roman" w:cs="Times New Roman"/>
+          <w:b w:val="0"/>
+          <w:i w:val="0"/>
           <w:sz w:val="24"/>
         </w:rPr>
         <w:t xml:space="preserve">, por </w:t>
@@ -3157,6 +4242,7 @@
         <w:rPr>
           <w:rFonts w:ascii="Times New Roman" w:hAnsi="Times New Roman" w:eastAsia="Times New Roman" w:cs="Times New Roman"/>
           <w:b/>
+          <w:i w:val="0"/>
           <w:sz w:val="24"/>
         </w:rPr>
         <w:t>memória e tempo</w:t>
@@ -3164,6 +4250,8 @@
       <w:r>
         <w:rPr>
           <w:rFonts w:ascii="Times New Roman" w:hAnsi="Times New Roman" w:eastAsia="Times New Roman" w:cs="Times New Roman"/>
+          <w:b w:val="0"/>
+          <w:i w:val="0"/>
           <w:sz w:val="24"/>
         </w:rPr>
         <w:t xml:space="preserve">, por isso os números podem mudar um pouco com outra semente ou outro recorte. Não fizemos </w:t>
@@ -3172,6 +4260,7 @@
         <w:rPr>
           <w:rFonts w:ascii="Times New Roman" w:hAnsi="Times New Roman" w:eastAsia="Times New Roman" w:cs="Times New Roman"/>
           <w:b/>
+          <w:i w:val="0"/>
           <w:sz w:val="24"/>
         </w:rPr>
         <w:t>corte temporal</w:t>
@@ -3179,6 +4268,8 @@
       <w:r>
         <w:rPr>
           <w:rFonts w:ascii="Times New Roman" w:hAnsi="Times New Roman" w:eastAsia="Times New Roman" w:cs="Times New Roman"/>
+          <w:b w:val="0"/>
+          <w:i w:val="0"/>
           <w:sz w:val="24"/>
         </w:rPr>
         <w:t xml:space="preserve"> entre treino e teste: o modelo descreve o </w:t>
@@ -3187,6 +4278,7 @@
         <w:rPr>
           <w:rFonts w:ascii="Times New Roman" w:hAnsi="Times New Roman" w:eastAsia="Times New Roman" w:cs="Times New Roman"/>
           <w:b/>
+          <w:i w:val="0"/>
           <w:sz w:val="24"/>
         </w:rPr>
         <w:t>período coberto pelo ficheiro</w:t>
@@ -3194,6 +4286,8 @@
       <w:r>
         <w:rPr>
           <w:rFonts w:ascii="Times New Roman" w:hAnsi="Times New Roman" w:eastAsia="Times New Roman" w:cs="Times New Roman"/>
+          <w:b w:val="0"/>
+          <w:i w:val="0"/>
           <w:sz w:val="24"/>
         </w:rPr>
         <w:t xml:space="preserve">, mas não simula de forma rigorosa uma previsão “para a frente”. Por último, a Random Forest </w:t>
@@ -3202,6 +4296,7 @@
         <w:rPr>
           <w:rFonts w:ascii="Times New Roman" w:hAnsi="Times New Roman" w:eastAsia="Times New Roman" w:cs="Times New Roman"/>
           <w:b/>
+          <w:i w:val="0"/>
           <w:sz w:val="24"/>
         </w:rPr>
         <w:t>não dá coeficientes</w:t>
@@ -3209,6 +4304,8 @@
       <w:r>
         <w:rPr>
           <w:rFonts w:ascii="Times New Roman" w:hAnsi="Times New Roman" w:eastAsia="Times New Roman" w:cs="Times New Roman"/>
+          <w:b w:val="0"/>
+          <w:i w:val="0"/>
           <w:sz w:val="24"/>
         </w:rPr>
         <w:t xml:space="preserve"> fáceis de ler como numa regressão; para uso institucional mais fino, faria sentido olhar para </w:t>
@@ -3217,6 +4314,7 @@
         <w:rPr>
           <w:rFonts w:ascii="Times New Roman" w:hAnsi="Times New Roman" w:eastAsia="Times New Roman" w:cs="Times New Roman"/>
           <w:b/>
+          <w:i w:val="0"/>
           <w:sz w:val="24"/>
         </w:rPr>
         <w:t>importância de variáveis</w:t>
@@ -3224,6 +4322,8 @@
       <w:r>
         <w:rPr>
           <w:rFonts w:ascii="Times New Roman" w:hAnsi="Times New Roman" w:eastAsia="Times New Roman" w:cs="Times New Roman"/>
+          <w:b w:val="0"/>
+          <w:i w:val="0"/>
           <w:sz w:val="24"/>
         </w:rPr>
         <w:t xml:space="preserve"> ou para </w:t>
@@ -3232,6 +4332,7 @@
         <w:rPr>
           <w:rFonts w:ascii="Times New Roman" w:hAnsi="Times New Roman" w:eastAsia="Times New Roman" w:cs="Times New Roman"/>
           <w:b/>
+          <w:i w:val="0"/>
           <w:sz w:val="24"/>
         </w:rPr>
         <w:t>SHAP</w:t>
@@ -3239,6 +4340,8 @@
       <w:r>
         <w:rPr>
           <w:rFonts w:ascii="Times New Roman" w:hAnsi="Times New Roman" w:eastAsia="Times New Roman" w:cs="Times New Roman"/>
+          <w:b w:val="0"/>
+          <w:i w:val="0"/>
           <w:sz w:val="24"/>
         </w:rPr>
         <w:t xml:space="preserve"> numa amostra.</w:t>
@@ -3268,6 +4371,8 @@
       <w:r>
         <w:rPr>
           <w:rFonts w:ascii="Times New Roman" w:hAnsi="Times New Roman" w:eastAsia="Times New Roman" w:cs="Times New Roman"/>
+          <w:b w:val="0"/>
+          <w:i w:val="0"/>
           <w:sz w:val="24"/>
         </w:rPr>
         <w:t xml:space="preserve">Na exploração inicial, o </w:t>
@@ -3276,6 +4381,7 @@
         <w:rPr>
           <w:rFonts w:ascii="Times New Roman" w:hAnsi="Times New Roman" w:eastAsia="Times New Roman" w:cs="Times New Roman"/>
           <w:b/>
+          <w:i w:val="0"/>
           <w:sz w:val="24"/>
         </w:rPr>
         <w:t>Valor total</w:t>
@@ -3283,6 +4389,8 @@
       <w:r>
         <w:rPr>
           <w:rFonts w:ascii="Times New Roman" w:hAnsi="Times New Roman" w:eastAsia="Times New Roman" w:cs="Times New Roman"/>
+          <w:b w:val="0"/>
+          <w:i w:val="0"/>
           <w:sz w:val="24"/>
         </w:rPr>
         <w:t xml:space="preserve"> já aparecia assimétrico e ligado à </w:t>
@@ -3291,6 +4399,7 @@
         <w:rPr>
           <w:rFonts w:ascii="Times New Roman" w:hAnsi="Times New Roman" w:eastAsia="Times New Roman" w:cs="Times New Roman"/>
           <w:b/>
+          <w:i w:val="0"/>
           <w:sz w:val="24"/>
         </w:rPr>
         <w:t>duração</w:t>
@@ -3298,6 +4407,8 @@
       <w:r>
         <w:rPr>
           <w:rFonts w:ascii="Times New Roman" w:hAnsi="Times New Roman" w:eastAsia="Times New Roman" w:cs="Times New Roman"/>
+          <w:b w:val="0"/>
+          <w:i w:val="0"/>
           <w:sz w:val="24"/>
         </w:rPr>
         <w:t xml:space="preserve"> e ao </w:t>
@@ -3306,6 +4417,7 @@
         <w:rPr>
           <w:rFonts w:ascii="Times New Roman" w:hAnsi="Times New Roman" w:eastAsia="Times New Roman" w:cs="Times New Roman"/>
           <w:b/>
+          <w:i w:val="0"/>
           <w:sz w:val="24"/>
         </w:rPr>
         <w:t>número de diárias</w:t>
@@ -3313,6 +4425,8 @@
       <w:r>
         <w:rPr>
           <w:rFonts w:ascii="Times New Roman" w:hAnsi="Times New Roman" w:eastAsia="Times New Roman" w:cs="Times New Roman"/>
+          <w:b w:val="0"/>
+          <w:i w:val="0"/>
           <w:sz w:val="24"/>
         </w:rPr>
         <w:t xml:space="preserve">. O uso de </w:t>
@@ -3321,6 +4435,7 @@
         <w:rPr>
           <w:rFonts w:ascii="Times New Roman" w:hAnsi="Times New Roman" w:eastAsia="Times New Roman" w:cs="Times New Roman"/>
           <w:b/>
+          <w:i w:val="0"/>
           <w:sz w:val="24"/>
         </w:rPr>
         <w:t>Pipeline</w:t>
@@ -3328,6 +4443,8 @@
       <w:r>
         <w:rPr>
           <w:rFonts w:ascii="Times New Roman" w:hAnsi="Times New Roman" w:eastAsia="Times New Roman" w:cs="Times New Roman"/>
+          <w:b w:val="0"/>
+          <w:i w:val="0"/>
           <w:sz w:val="24"/>
         </w:rPr>
         <w:t xml:space="preserve">, com transformações ajustadas só no treino e sem preditoras que “reconstruam” o total, foi </w:t>
@@ -3336,6 +4453,7 @@
         <w:rPr>
           <w:rFonts w:ascii="Times New Roman" w:hAnsi="Times New Roman" w:eastAsia="Times New Roman" w:cs="Times New Roman"/>
           <w:b/>
+          <w:i w:val="0"/>
           <w:sz w:val="24"/>
         </w:rPr>
         <w:t>central</w:t>
@@ -3343,6 +4461,8 @@
       <w:r>
         <w:rPr>
           <w:rFonts w:ascii="Times New Roman" w:hAnsi="Times New Roman" w:eastAsia="Times New Roman" w:cs="Times New Roman"/>
+          <w:b w:val="0"/>
+          <w:i w:val="0"/>
           <w:sz w:val="24"/>
         </w:rPr>
         <w:t xml:space="preserve"> para não enganar na leitura das métricas no teste.</w:t>
@@ -3357,6 +4477,8 @@
       <w:r>
         <w:rPr>
           <w:rFonts w:ascii="Times New Roman" w:hAnsi="Times New Roman" w:eastAsia="Times New Roman" w:cs="Times New Roman"/>
+          <w:b w:val="0"/>
+          <w:i w:val="0"/>
           <w:sz w:val="24"/>
         </w:rPr>
         <w:t xml:space="preserve">Entre </w:t>
@@ -3365,6 +4487,7 @@
         <w:rPr>
           <w:rFonts w:ascii="Times New Roman" w:hAnsi="Times New Roman" w:eastAsia="Times New Roman" w:cs="Times New Roman"/>
           <w:b/>
+          <w:i w:val="0"/>
           <w:sz w:val="24"/>
         </w:rPr>
         <w:t>Ridge</w:t>
@@ -3372,6 +4495,8 @@
       <w:r>
         <w:rPr>
           <w:rFonts w:ascii="Times New Roman" w:hAnsi="Times New Roman" w:eastAsia="Times New Roman" w:cs="Times New Roman"/>
+          <w:b w:val="0"/>
+          <w:i w:val="0"/>
           <w:sz w:val="24"/>
         </w:rPr>
         <w:t xml:space="preserve">, </w:t>
@@ -3380,6 +4505,7 @@
         <w:rPr>
           <w:rFonts w:ascii="Times New Roman" w:hAnsi="Times New Roman" w:eastAsia="Times New Roman" w:cs="Times New Roman"/>
           <w:b/>
+          <w:i w:val="0"/>
           <w:sz w:val="24"/>
         </w:rPr>
         <w:t>HistGradientBoosting</w:t>
@@ -3387,6 +4513,8 @@
       <w:r>
         <w:rPr>
           <w:rFonts w:ascii="Times New Roman" w:hAnsi="Times New Roman" w:eastAsia="Times New Roman" w:cs="Times New Roman"/>
+          <w:b w:val="0"/>
+          <w:i w:val="0"/>
           <w:sz w:val="24"/>
         </w:rPr>
         <w:t xml:space="preserve"> e </w:t>
@@ -3395,6 +4523,7 @@
         <w:rPr>
           <w:rFonts w:ascii="Times New Roman" w:hAnsi="Times New Roman" w:eastAsia="Times New Roman" w:cs="Times New Roman"/>
           <w:b/>
+          <w:i w:val="0"/>
           <w:sz w:val="24"/>
         </w:rPr>
         <w:t>Random Forest</w:t>
@@ -3402,21 +4531,26 @@
       <w:r>
         <w:rPr>
           <w:rFonts w:ascii="Times New Roman" w:hAnsi="Times New Roman" w:eastAsia="Times New Roman" w:cs="Times New Roman"/>
+          <w:b w:val="0"/>
+          <w:i w:val="0"/>
           <w:sz w:val="24"/>
         </w:rPr>
         <w:t xml:space="preserve">, a última — com hiperparâmetros vindos da </w:t>
       </w:r>
       <w:r>
         <w:rPr>
-          <w:rFonts w:ascii="Times New Roman" w:hAnsi="Times New Roman" w:eastAsia="Times New Roman" w:cs="Times New Roman"/>
+          <w:rFonts w:ascii="Courier New" w:hAnsi="Courier New"/>
           <w:b/>
-          <w:sz w:val="24"/>
-        </w:rPr>
-        <w:t>`RandomizedSearchCV`</w:t>
-      </w:r>
-      <w:r>
-        <w:rPr>
-          <w:rFonts w:ascii="Times New Roman" w:hAnsi="Times New Roman" w:eastAsia="Times New Roman" w:cs="Times New Roman"/>
+          <w:i w:val="0"/>
+          <w:sz w:val="22"/>
+        </w:rPr>
+        <w:t>RandomizedSearchCV</w:t>
+      </w:r>
+      <w:r>
+        <w:rPr>
+          <w:rFonts w:ascii="Times New Roman" w:hAnsi="Times New Roman" w:eastAsia="Times New Roman" w:cs="Times New Roman"/>
+          <w:b w:val="0"/>
+          <w:i w:val="0"/>
           <w:sz w:val="24"/>
         </w:rPr>
         <w:t xml:space="preserve"> — foi a que </w:t>
@@ -3425,6 +4559,7 @@
         <w:rPr>
           <w:rFonts w:ascii="Times New Roman" w:hAnsi="Times New Roman" w:eastAsia="Times New Roman" w:cs="Times New Roman"/>
           <w:b/>
+          <w:i w:val="0"/>
           <w:sz w:val="24"/>
         </w:rPr>
         <w:t>melhor se saiu</w:t>
@@ -3432,6 +4567,8 @@
       <w:r>
         <w:rPr>
           <w:rFonts w:ascii="Times New Roman" w:hAnsi="Times New Roman" w:eastAsia="Times New Roman" w:cs="Times New Roman"/>
+          <w:b w:val="0"/>
+          <w:i w:val="0"/>
           <w:sz w:val="24"/>
         </w:rPr>
         <w:t xml:space="preserve"> no teste (RMSE ≈ 812, MAE ≈ 303, R² ≈ 0,96), ainda com </w:t>
@@ -3440,6 +4577,7 @@
         <w:rPr>
           <w:rFonts w:ascii="Times New Roman" w:hAnsi="Times New Roman" w:eastAsia="Times New Roman" w:cs="Times New Roman"/>
           <w:b/>
+          <w:i w:val="0"/>
           <w:sz w:val="24"/>
         </w:rPr>
         <w:t>erros maiores nos valores muito altos</w:t>
@@ -3447,6 +4585,8 @@
       <w:r>
         <w:rPr>
           <w:rFonts w:ascii="Times New Roman" w:hAnsi="Times New Roman" w:eastAsia="Times New Roman" w:cs="Times New Roman"/>
+          <w:b w:val="0"/>
+          <w:i w:val="0"/>
           <w:sz w:val="24"/>
         </w:rPr>
         <w:t>.</w:t>
@@ -3461,6 +4601,8 @@
       <w:r>
         <w:rPr>
           <w:rFonts w:ascii="Times New Roman" w:hAnsi="Times New Roman" w:eastAsia="Times New Roman" w:cs="Times New Roman"/>
+          <w:b w:val="0"/>
+          <w:i w:val="0"/>
           <w:sz w:val="24"/>
         </w:rPr>
         <w:t xml:space="preserve">Como continuações possíveis (não desenvolvidas neste relatório), caberia testar transformação do alvo (por exemplo </w:t>
@@ -3468,6 +4610,8 @@
       <w:r>
         <w:rPr>
           <w:rFonts w:ascii="Courier New" w:hAnsi="Courier New"/>
+          <w:b w:val="0"/>
+          <w:i w:val="0"/>
           <w:sz w:val="22"/>
         </w:rPr>
         <w:t>log1p</w:t>
@@ -3475,6 +4619,8 @@
       <w:r>
         <w:rPr>
           <w:rFonts w:ascii="Times New Roman" w:hAnsi="Times New Roman" w:eastAsia="Times New Roman" w:cs="Times New Roman"/>
+          <w:b w:val="0"/>
+          <w:i w:val="0"/>
           <w:sz w:val="24"/>
         </w:rPr>
         <w:t xml:space="preserve">), validação por </w:t>
@@ -3483,6 +4629,7 @@
         <w:rPr>
           <w:rFonts w:ascii="Times New Roman" w:hAnsi="Times New Roman" w:eastAsia="Times New Roman" w:cs="Times New Roman"/>
           <w:b/>
+          <w:i w:val="0"/>
           <w:sz w:val="24"/>
         </w:rPr>
         <w:t>período temporal</w:t>
@@ -3490,14 +4637,35 @@
       <w:r>
         <w:rPr>
           <w:rFonts w:ascii="Times New Roman" w:hAnsi="Times New Roman" w:eastAsia="Times New Roman" w:cs="Times New Roman"/>
-          <w:sz w:val="24"/>
-        </w:rPr>
-        <w:t xml:space="preserve">, *boosting* em maior escala com </w:t>
+          <w:b w:val="0"/>
+          <w:i w:val="0"/>
+          <w:sz w:val="24"/>
+        </w:rPr>
+        <w:t xml:space="preserve">, </w:t>
+      </w:r>
+      <w:r>
+        <w:rPr>
+          <w:rFonts w:ascii="Times New Roman" w:hAnsi="Times New Roman" w:eastAsia="Times New Roman" w:cs="Times New Roman"/>
+          <w:b w:val="0"/>
+          <w:i/>
+          <w:sz w:val="24"/>
+        </w:rPr>
+        <w:t>boosting</w:t>
+      </w:r>
+      <w:r>
+        <w:rPr>
+          <w:rFonts w:ascii="Times New Roman" w:hAnsi="Times New Roman" w:eastAsia="Times New Roman" w:cs="Times New Roman"/>
+          <w:b w:val="0"/>
+          <w:i w:val="0"/>
+          <w:sz w:val="24"/>
+        </w:rPr>
+        <w:t xml:space="preserve"> em maior escala com </w:t>
       </w:r>
       <w:r>
         <w:rPr>
           <w:rFonts w:ascii="Times New Roman" w:hAnsi="Times New Roman" w:eastAsia="Times New Roman" w:cs="Times New Roman"/>
           <w:b/>
+          <w:i w:val="0"/>
           <w:sz w:val="24"/>
         </w:rPr>
         <w:t>XGBoost</w:t>
@@ -3505,6 +4673,8 @@
       <w:r>
         <w:rPr>
           <w:rFonts w:ascii="Times New Roman" w:hAnsi="Times New Roman" w:eastAsia="Times New Roman" w:cs="Times New Roman"/>
+          <w:b w:val="0"/>
+          <w:i w:val="0"/>
           <w:sz w:val="24"/>
         </w:rPr>
         <w:t xml:space="preserve">, </w:t>
@@ -3513,6 +4683,7 @@
         <w:rPr>
           <w:rFonts w:ascii="Times New Roman" w:hAnsi="Times New Roman" w:eastAsia="Times New Roman" w:cs="Times New Roman"/>
           <w:b/>
+          <w:i w:val="0"/>
           <w:sz w:val="24"/>
         </w:rPr>
         <w:t>LightGBM</w:t>
@@ -3520,6 +4691,8 @@
       <w:r>
         <w:rPr>
           <w:rFonts w:ascii="Times New Roman" w:hAnsi="Times New Roman" w:eastAsia="Times New Roman" w:cs="Times New Roman"/>
+          <w:b w:val="0"/>
+          <w:i w:val="0"/>
           <w:sz w:val="24"/>
         </w:rPr>
         <w:t xml:space="preserve"> e </w:t>
@@ -3528,6 +4701,7 @@
         <w:rPr>
           <w:rFonts w:ascii="Times New Roman" w:hAnsi="Times New Roman" w:eastAsia="Times New Roman" w:cs="Times New Roman"/>
           <w:b/>
+          <w:i w:val="0"/>
           <w:sz w:val="24"/>
         </w:rPr>
         <w:t>CatBoost</w:t>
@@ -3535,6 +4709,8 @@
       <w:r>
         <w:rPr>
           <w:rFonts w:ascii="Times New Roman" w:hAnsi="Times New Roman" w:eastAsia="Times New Roman" w:cs="Times New Roman"/>
+          <w:b w:val="0"/>
+          <w:i w:val="0"/>
           <w:sz w:val="24"/>
         </w:rPr>
         <w:t xml:space="preserve"> (habitualmente com </w:t>
@@ -3543,6 +4719,7 @@
         <w:rPr>
           <w:rFonts w:ascii="Times New Roman" w:hAnsi="Times New Roman" w:eastAsia="Times New Roman" w:cs="Times New Roman"/>
           <w:b/>
+          <w:i w:val="0"/>
           <w:sz w:val="24"/>
         </w:rPr>
         <w:t>uso de GPU</w:t>
@@ -3550,6 +4727,8 @@
       <w:r>
         <w:rPr>
           <w:rFonts w:ascii="Times New Roman" w:hAnsi="Times New Roman" w:eastAsia="Times New Roman" w:cs="Times New Roman"/>
+          <w:b w:val="0"/>
+          <w:i w:val="0"/>
           <w:sz w:val="24"/>
         </w:rPr>
         <w:t xml:space="preserve"> e memória suficiente), e ferramentas de </w:t>
@@ -3558,6 +4737,7 @@
         <w:rPr>
           <w:rFonts w:ascii="Times New Roman" w:hAnsi="Times New Roman" w:eastAsia="Times New Roman" w:cs="Times New Roman"/>
           <w:b/>
+          <w:i w:val="0"/>
           <w:sz w:val="24"/>
         </w:rPr>
         <w:t>explicabilidade</w:t>
@@ -3565,6 +4745,8 @@
       <w:r>
         <w:rPr>
           <w:rFonts w:ascii="Times New Roman" w:hAnsi="Times New Roman" w:eastAsia="Times New Roman" w:cs="Times New Roman"/>
+          <w:b w:val="0"/>
+          <w:i w:val="0"/>
           <w:sz w:val="24"/>
         </w:rPr>
         <w:t xml:space="preserve"> (importância por permutação, SHAP) numa amostra.</w:t>
@@ -3594,6 +4776,8 @@
       <w:r>
         <w:rPr>
           <w:rFonts w:ascii="Times New Roman" w:hAnsi="Times New Roman" w:eastAsia="Times New Roman" w:cs="Times New Roman"/>
+          <w:b w:val="0"/>
+          <w:i w:val="0"/>
           <w:sz w:val="24"/>
         </w:rPr>
         <w:t xml:space="preserve">BRASIL. </w:t>
@@ -3602,6 +4786,7 @@
         <w:rPr>
           <w:rFonts w:ascii="Times New Roman" w:hAnsi="Times New Roman" w:eastAsia="Times New Roman" w:cs="Times New Roman"/>
           <w:b/>
+          <w:i w:val="0"/>
           <w:sz w:val="24"/>
         </w:rPr>
         <w:t>Conjunto de dados: Viagens a serviço do governo federal – SCDP</w:t>
@@ -3609,6 +4794,8 @@
       <w:r>
         <w:rPr>
           <w:rFonts w:ascii="Times New Roman" w:hAnsi="Times New Roman" w:eastAsia="Times New Roman" w:cs="Times New Roman"/>
+          <w:b w:val="0"/>
+          <w:i w:val="0"/>
           <w:sz w:val="24"/>
         </w:rPr>
         <w:t>. Portal Brasileiro de Dados Abertos, 2026. Disponível em: https://dados.gov.br/dados/conjuntos-dados/viagens-a-servico-do-governo-federal-scdp (https://dados.gov.br/dados/conjuntos-dados/viagens-a-servico-do-governo-federal-scdp). Acesso em: 16 abr. 2026.</w:t>
@@ -3623,6 +4810,8 @@
       <w:r>
         <w:rPr>
           <w:rFonts w:ascii="Times New Roman" w:hAnsi="Times New Roman" w:eastAsia="Times New Roman" w:cs="Times New Roman"/>
+          <w:b w:val="0"/>
+          <w:i w:val="0"/>
           <w:sz w:val="24"/>
         </w:rPr>
         <w:t xml:space="preserve">GRUS, J. </w:t>
@@ -3631,6 +4820,7 @@
         <w:rPr>
           <w:rFonts w:ascii="Times New Roman" w:hAnsi="Times New Roman" w:eastAsia="Times New Roman" w:cs="Times New Roman"/>
           <w:b/>
+          <w:i w:val="0"/>
           <w:sz w:val="24"/>
         </w:rPr>
         <w:t>Data science do zero: noções fundamentais com Python</w:t>
@@ -3638,6 +4828,8 @@
       <w:r>
         <w:rPr>
           <w:rFonts w:ascii="Times New Roman" w:hAnsi="Times New Roman" w:eastAsia="Times New Roman" w:cs="Times New Roman"/>
+          <w:b w:val="0"/>
+          <w:i w:val="0"/>
           <w:sz w:val="24"/>
         </w:rPr>
         <w:t>. 2. ed. São Paulo: Alta Books, 2021. 416 p. ISBN 978-85-5081-176-5.</w:t>
@@ -3652,6 +4844,8 @@
       <w:r>
         <w:rPr>
           <w:rFonts w:ascii="Times New Roman" w:hAnsi="Times New Roman" w:eastAsia="Times New Roman" w:cs="Times New Roman"/>
+          <w:b w:val="0"/>
+          <w:i w:val="0"/>
           <w:sz w:val="24"/>
         </w:rPr>
         <w:t xml:space="preserve">HARRISON, M. </w:t>
@@ -3660,6 +4854,7 @@
         <w:rPr>
           <w:rFonts w:ascii="Times New Roman" w:hAnsi="Times New Roman" w:eastAsia="Times New Roman" w:cs="Times New Roman"/>
           <w:b/>
+          <w:i w:val="0"/>
           <w:sz w:val="24"/>
         </w:rPr>
         <w:t>Machine learning – guia de referência rápida: trabalhando com dados estruturados em Python</w:t>
@@ -3667,6 +4862,8 @@
       <w:r>
         <w:rPr>
           <w:rFonts w:ascii="Times New Roman" w:hAnsi="Times New Roman" w:eastAsia="Times New Roman" w:cs="Times New Roman"/>
+          <w:b w:val="0"/>
+          <w:i w:val="0"/>
           <w:sz w:val="24"/>
         </w:rPr>
         <w:t>. São Paulo: Novatec, 2019. 272 p. ISBN 978-85-7522-817-3.</w:t>
@@ -3681,6 +4878,8 @@
       <w:r>
         <w:rPr>
           <w:rFonts w:ascii="Times New Roman" w:hAnsi="Times New Roman" w:eastAsia="Times New Roman" w:cs="Times New Roman"/>
+          <w:b w:val="0"/>
+          <w:i w:val="0"/>
           <w:sz w:val="24"/>
         </w:rPr>
         <w:t xml:space="preserve">HUYEN, C. </w:t>
@@ -3689,6 +4888,7 @@
         <w:rPr>
           <w:rFonts w:ascii="Times New Roman" w:hAnsi="Times New Roman" w:eastAsia="Times New Roman" w:cs="Times New Roman"/>
           <w:b/>
+          <w:i w:val="0"/>
           <w:sz w:val="24"/>
         </w:rPr>
         <w:t>Projetando sistemas de machine learning: processo interativo para aplicações prontas para produção</w:t>
@@ -3696,6 +4896,8 @@
       <w:r>
         <w:rPr>
           <w:rFonts w:ascii="Times New Roman" w:hAnsi="Times New Roman" w:eastAsia="Times New Roman" w:cs="Times New Roman"/>
+          <w:b w:val="0"/>
+          <w:i w:val="0"/>
           <w:sz w:val="24"/>
         </w:rPr>
         <w:t>. São Paulo: Alta Books, 2024. 384 p. ISBN 978-85-5081-967-9.</w:t>
@@ -3710,6 +4912,8 @@
       <w:r>
         <w:rPr>
           <w:rFonts w:ascii="Times New Roman" w:hAnsi="Times New Roman" w:eastAsia="Times New Roman" w:cs="Times New Roman"/>
+          <w:b w:val="0"/>
+          <w:i w:val="0"/>
           <w:sz w:val="24"/>
         </w:rPr>
         <w:t xml:space="preserve">WICHMANN, Roberta Moreira. </w:t>
@@ -3718,6 +4922,7 @@
         <w:rPr>
           <w:rFonts w:ascii="Times New Roman" w:hAnsi="Times New Roman" w:eastAsia="Times New Roman" w:cs="Times New Roman"/>
           <w:b/>
+          <w:i w:val="0"/>
           <w:sz w:val="24"/>
         </w:rPr>
         <w:t>Introdução ao Machine Learning: slides de aula</w:t>
@@ -3725,6 +4930,8 @@
       <w:r>
         <w:rPr>
           <w:rFonts w:ascii="Times New Roman" w:hAnsi="Times New Roman" w:eastAsia="Times New Roman" w:cs="Times New Roman"/>
+          <w:b w:val="0"/>
+          <w:i w:val="0"/>
           <w:sz w:val="24"/>
         </w:rPr>
         <w:t>. 2026. Material didático do Mestrado em Administração Pública. [S.l.: s.n.], 2026.</w:t>
@@ -3739,6 +4946,8 @@
       <w:r>
         <w:rPr>
           <w:rFonts w:ascii="Times New Roman" w:hAnsi="Times New Roman" w:eastAsia="Times New Roman" w:cs="Times New Roman"/>
+          <w:b w:val="0"/>
+          <w:i w:val="0"/>
           <w:sz w:val="24"/>
         </w:rPr>
         <w:t xml:space="preserve">The Matplotlib Development Team. </w:t>
@@ -3747,6 +4956,7 @@
         <w:rPr>
           <w:rFonts w:ascii="Times New Roman" w:hAnsi="Times New Roman" w:eastAsia="Times New Roman" w:cs="Times New Roman"/>
           <w:b/>
+          <w:i w:val="0"/>
           <w:sz w:val="24"/>
         </w:rPr>
         <w:t>Matplotlib: visualization with Python</w:t>
@@ -3754,6 +4964,8 @@
       <w:r>
         <w:rPr>
           <w:rFonts w:ascii="Times New Roman" w:hAnsi="Times New Roman" w:eastAsia="Times New Roman" w:cs="Times New Roman"/>
+          <w:b w:val="0"/>
+          <w:i w:val="0"/>
           <w:sz w:val="24"/>
         </w:rPr>
         <w:t>. Disponível em: https://matplotlib.org (https://matplotlib.org). Acesso em: 16 abr. 2026.</w:t>
@@ -3768,6 +4980,8 @@
       <w:r>
         <w:rPr>
           <w:rFonts w:ascii="Times New Roman" w:hAnsi="Times New Roman" w:eastAsia="Times New Roman" w:cs="Times New Roman"/>
+          <w:b w:val="0"/>
+          <w:i w:val="0"/>
           <w:sz w:val="24"/>
         </w:rPr>
         <w:t xml:space="preserve">Documentação oficial: </w:t>
@@ -3776,6 +4990,7 @@
         <w:rPr>
           <w:rFonts w:ascii="Times New Roman" w:hAnsi="Times New Roman" w:eastAsia="Times New Roman" w:cs="Times New Roman"/>
           <w:b/>
+          <w:i w:val="0"/>
           <w:sz w:val="24"/>
         </w:rPr>
         <w:t>scikit-learn</w:t>
@@ -3783,6 +4998,8 @@
       <w:r>
         <w:rPr>
           <w:rFonts w:ascii="Times New Roman" w:hAnsi="Times New Roman" w:eastAsia="Times New Roman" w:cs="Times New Roman"/>
+          <w:b w:val="0"/>
+          <w:i w:val="0"/>
           <w:sz w:val="24"/>
         </w:rPr>
         <w:t xml:space="preserve"> — User Guide. Disponível em: https://scikit-learn.org/stable/user_guide.html (https://scikit-learn.org/stable/user_guide.html). Acesso em: 16 abr. 2026.</w:t>

</xml_diff>